<commit_message>
Clarify wheat–Septoria relationships, canopy metrics and yield interpretation
</commit_message>
<xml_diff>
--- a/publication/european_wheat_stb/Manuscript.docx
+++ b/publication/european_wheat_stb/Manuscript.docx
@@ -7,7 +7,7 @@
         <w:pStyle w:val="Title"/>
       </w:pPr>
       <w:r>
-        <w:t>Climate change redistributes simulated Septoria damage in European wheat</w:t>
+        <w:t>Projected climate impacts on Septoria damage in European wheat</w:t>
       </w:r>
     </w:p>
     <w:p>
@@ -35,7 +35,7 @@
     </w:p>
     <w:p>
       <w:r>
-        <w:t>Climate-driven crop disease threatens the stability of European wheat production. The spatial consequences of changing disease–crop timing for canopy damage remain poorly quantified. We coupled wheat and Septoria simulations across 14,932 land-use grids with fixed winter-wheat calendars, three climate models and three emissions pathways. Under SSP5–8.5 in 2071–2100 relative to 1991–2020, the European healthy-area-duration deficit changed by +2.66 days per reference leaf area. Regional changes ranged from -1.40 in the Mediterranean region to +7.84 days in the Boreal region. Mean canopy damage changed by +8.04 percentage points, with a conditional yield change of -47.8 kg ha⁻¹ per reference leaf area. A diagnostic decomposition attributed a 71% offset of the disease-weather contribution to crop development. Yield consequences remained conditional on canopy–yield conversion, and disease prediction skill remained limited. These regional contrasts support joint evaluation of crop calendars, disease resistance and canopy function for resilient wheat production.</w:t>
+        <w:t>Septoria tritici blotch reduces wheat yield, making its response to climate change important for European food production. How changing climate alters disease damage through wheat development remains uncertain across European growing regions. We linked models of wheat development and Septoria tritici blotch across 14,932 wheat-growing grid cells, using three climate models and three emissions pathways. Under SSP5–8.5 in 2071–2100, healthy-area-duration (HAD) loss normalized to reference leaf area increased by 2.66 days relative to 1991–2020. Regional changes ranged from -1.40 days in the Mediterranean to +7.84 days in the Boreal region. Relative HAD loss increased by 8.04 percentage points. Changes in wheat development offset 71% of the weather contribution in a sampled analysis. The canopy–yield relationship implied a yield change of -47.8 kg ha⁻¹ per unit reference leaf area index. These regional contrasts inform monitoring and adaptation trials, with disease-related yield estimates requiring field validation.</w:t>
       </w:r>
     </w:p>
     <w:p>
@@ -43,51 +43,40 @@
         <w:pageBreakBefore/>
       </w:pPr>
       <w:r>
-        <w:t xml:space="preserve">Securing wheat production under climate change requires distinguishing changes in crop potential from the biotic stresses that prevent that potential being realized. European evidence links wheat yield trends to interacting genetic, climatic and agronomic drivers, while pathogens and pests account for substantial losses across major food crops. These production pathways are connected: a developmental shift that changes the crop’s exposure to weather also changes the timing of disease damage relative to grain filling. </w:t>
+        <w:t xml:space="preserve">Wheat production under climate change depends on both crop performance and losses caused by disease. Septoria tritici blotch (STB), caused by Zymoseptoria tritici, damages wheat leaves and can reduce grain yield. Temperature, rainfall and humidity affect disease development, while changing climate also alters the crop that the pathogen infects. Understanding these linked effects is important for maintaining European wheat production. </w:t>
       </w:r>
       <w:r>
         <w:rPr>
           <w:vertAlign w:val="superscript"/>
         </w:rPr>
-        <w:t>[1, 2]</w:t>
+        <w:t>[1, 2, 3]</w:t>
       </w:r>
     </w:p>
     <w:p>
       <w:r>
-        <w:t xml:space="preserve">Climate-based assessments of pathogen exposure and coupled crop–disease simulations demonstrate the relevance of infection to future crop production. Their interpretation depends on both disease-favouring weather and host development. The same future weather can accelerate crop development, alter the leaves available to disease and move grain filling into a different part of the season. The magnitude of a disease-related production effect therefore cannot be inferred from favourable infection conditions alone. </w:t>
+        <w:t xml:space="preserve">Weather favourable for infection does not by itself determine yield loss. Wheat development controls when leaves emerge and when grain filling occurs; disease development determines when those leaves become damaged. A shift in either process changes the amount of healthy canopy available during grain filling. Climate assessments based only on infection conditions can therefore miss changes in the timing of damage relative to crop development. </w:t>
       </w:r>
       <w:r>
         <w:rPr>
           <w:vertAlign w:val="superscript"/>
         </w:rPr>
-        <w:t>[3, 4]</w:t>
+        <w:t>[4, 5, 6, 7, 8]</w:t>
       </w:r>
     </w:p>
     <w:p>
       <w:r>
-        <w:t xml:space="preserve">Septoria tritici blotch, caused by Zymoseptoria tritici, provides a relevant foliar-disease case for European wheat. Seasonal disease reflects local and imported sources, weather-dependent establishment, leaf appearance and transfer within the canopy. Temperature affects development of the crop and disease; humidity and precipitation affect exposure. Host architecture and developmental timing determine which leaves become available and when upper-canopy damage occurs. </w:t>
+        <w:t xml:space="preserve">For Septoria tritici blotch, symptoms follow a period of infection and disease development within the leaf. Rainfall, moisture conditions, inoculum availability and canopy development influence the seasonal epidemic. Upper-leaf appearance and unfolding are relevant because damage to these leaves can affect the canopy supporting grain filling. Healthy-area duration (HAD), the integral of healthy leaf area over time, provides a measure linking disease damage to crop function. Its relationship with grain yield varies among cultivars and depends on the leaves and growth stages included in the calculation. </w:t>
       </w:r>
       <w:r>
         <w:rPr>
           <w:vertAlign w:val="superscript"/>
         </w:rPr>
-        <w:t>[5, 6, 7, 8, 9]</w:t>
+        <w:t>[2, 9, 10, 11, 12, 13]</w:t>
       </w:r>
     </w:p>
     <w:p>
       <w:r>
-        <w:t xml:space="preserve">Healthy-area duration integrates the amount and persistence of functional green canopy. It is closer to the physiological link to grain production than a disease percentage integrated over time, but its relationship with yield depends on genotype, leaf scope and the integration window. Crop-calendar and genotype choices can consequently change both exposure and the production consequence of disease. Compatible observations of development, leaf function and harvest response are needed to evaluate those choices. </w:t>
-      </w:r>
-      <w:r>
-        <w:rPr>
-          <w:vertAlign w:val="superscript"/>
-        </w:rPr>
-        <w:t>[10, 11, 12, 13]</w:t>
-      </w:r>
-    </w:p>
-    <w:p>
-      <w:r>
-        <w:t>The central hypothesis is that climate-driven wheat development modifies the timing and magnitude of disease-related canopy damage, producing spatially contrasting production consequences. A full-grid European analysis quantifies changes in symptom occurrence, disease–crop timing and canopy damage under three emissions pathways. Environmental-region and country summaries connect the spatial responses to wheat-growing areas, while a weather–crop decomposition examines their modeled drivers. Pooled field evaluation and independent canopy–yield evidence constrain the interpretation of conditional yield responses.</w:t>
+        <w:t>The unresolved question is how climate effects on wheat development modify Septoria damage across European growing regions. A linked wheat-development and disease model quantifies changes in symptoms and canopy damage across the complete wheat land-use grid under three emissions pathways. Environmental-region and country summaries describe where these changes occur. A separate analysis distinguishes weather effects on disease from the effects of changing wheat development. Published canopy–yield relationships provide conditional estimates of the disease-related component of yield change, while field observations establish the limits of model prediction accuracy.</w:t>
       </w:r>
     </w:p>
     <w:p>
@@ -97,98 +86,98 @@
     </w:p>
     <w:p>
       <w:r>
-        <w:t>Spatially divergent climate impacts on wheat canopy damage</w:t>
+        <w:t>Regional differences in projected Septoria damage</w:t>
       </w:r>
     </w:p>
     <w:p>
       <w:r>
-        <w:t>Projected Septoria-related canopy damage varied across European wheat-growing grids and emissions pathways (Fig. 1). By 2071–2100, the harvested-area-weighted healthy-area-duration (HAD) deficit changed by +1.45, +1.55 and +2.66 days per unit reference leaf area under SSP1–2.6, SSP2–4.5 and SSP5–8.5, respectively, relative to 1991–2020. The corresponding mid-century changes were +1.11, +0.77 and +1.53 days. These averages combine areas with increasing and decreasing simulated damage rather than a uniform continental response (Supplementary Table S9).</w:t>
+        <w:t>Projected Septoria-related canopy damage varied across European wheat-growing grids and emissions pathways (Fig. 1). By 2071–2100, the harvested-area-weighted normalized healthy-area-duration (HAD) loss changed by +1.45, +1.55 and +2.66 days under SSP1–2.6, SSP2–4.5 and SSP5–8.5, respectively, relative to 1991–2020. The corresponding mid-century changes were +1.11, +0.77 and +1.53 days. Normalized HAD loss is the loss of healthy leaf area over time divided by maximum reference upper-canopy leaf area index (LAI), with units of days. Larger values indicate greater accumulated damage. The averages combine areas of increasing and declining damage (Supplementary Table S9).</w:t>
       </w:r>
     </w:p>
     <w:p>
       <w:r>
-        <w:t>Under late-century SSP5–8.5, the European HAD deficit changed from 6.30 to 8.95 days per reference leaf area; the three-climate-model change range was +1.23 to +4.57 days. A positive ensemble change covered 77.3% of the available reference wheat area. All three models agreed on greater damage across 65.2% of area and less damage across 14.9%; mixed signs occupied 20.0%. The full-grid comparison therefore distinguishes the magnitude of the continental mean from the spatial extent of consistent change (Supplementary Fig. S19; Supplementary Table S15).</w:t>
+        <w:t>Under late-century SSP5–8.5, the European normalized HAD loss changed from 6.30 to 8.95 days; the three-climate-model change range was +1.23 to +4.57 days. The ensemble mean indicated increasing damage across 77.3% of the available reference wheat area. All three models agreed on greater damage across 65.2% of area and less damage across 14.9%; model predictions differed in sign across 20.0%. The continental increase thus coexisted with areas of declining damage (Supplementary Fig. S19; Supplementary Table S15).</w:t>
       </w:r>
     </w:p>
     <w:p>
       <w:r>
-        <w:t>Changes in disease occurrence, timing and severity</w:t>
+        <w:t>Disease symptoms and canopy damage during grain filling</w:t>
       </w:r>
     </w:p>
     <w:p>
       <w:r>
-        <w:t>Symptom occurrence and disease magnitude responded differently to future climate (Fig. 2). The area-weighted frequency of flag-leaf symptoms before soft dough was 99.731% in the reference and 99.332% under late-century SSP5–8.5, a change of -0.400 percentage points. Occurrence remained close to saturation, whereas symptom timing and canopy damage showed spatial contrasts. Mean reference-area-weighted canopy damage during grain filling changed from 18.03% to 26.07%, or +8.04 percentage points, with a climate-model range of +4.08 to +13.53 points. This functional-loss measure represents simulated damage severity across the grain-fill window (Supplementary Tables S9 and S13b).</w:t>
+        <w:t>Symptom frequency changed little despite increasing canopy damage (Fig. 2). The area-weighted frequency of flag-leaf symptoms before soft dough was 99.731% in 1991–2020 and 99.332% under late-century SSP5–8.5, a change of -0.400 percentage points. Symptoms were predicted in almost every complete season in both periods. The mean fraction of reference HAD lost during grain filling increased from 18.03% to 26.07%, or +8.04 percentage points, with a climate-model range of +4.08 to +13.53 points. Relative HAD loss describes accumulated canopy-function loss; observed lesion percentage measures a different quantity (Supplementary Tables S9 and S13b).</w:t>
       </w:r>
     </w:p>
     <w:p>
       <w:r>
-        <w:t>Flag-leaf symptoms shifted 3.46 days earlier relative to flowering, with model-specific changes of -6.02 to -1.57 days. Onset measured from the fixed sowing date advanced by 30.78 days, spanning -45.39 to -18.74 days across climate models (Fig. 2b, d). Flag-leaf symptoms occupied 97.37% of grain-fill days in the reference and 97.42% in the future. Symptomatic grain-fill duration changed by +0.24 days, alongside a +0.25-day change in the crop window. Earlier calendar onset and greater canopy damage therefore coexisted with a modest change in grain-fill duration. Timing estimates condition on detectable symptoms in both paired seasons; occurrence estimates include symptom-free complete seasons (Supplementary Figs. S12 and S14).</w:t>
+        <w:t>Flag-leaf symptoms appeared 3.46 days earlier relative to flowering, with model-specific changes of -6.02 to -1.57 days. The interval from the fixed sowing date to first symptoms shortened by 30.78 days, spanning -45.39 to -18.74 days across climate models (Fig. 2b, d). Flag-leaf symptoms were present during 97.37% of grain-fill days in 1991–2020 and 97.42% in the future. The number of grain-fill days with symptoms changed by +0.24 days, alongside a +0.25-day change in the flowering-to-soft-dough interval. The large advance in symptoms after sowing accompanied earlier wheat development, with little change in the duration of grain filling. Timing estimates include symptoms detected in both paired seasons; frequency estimates also include complete seasons without symptoms (Supplementary Figs. S12 and S14).</w:t>
       </w:r>
     </w:p>
     <w:p>
       <w:r>
-        <w:t>Environmental-region and country contrasts</w:t>
+        <w:t>Differences among environmental regions and countries</w:t>
       </w:r>
     </w:p>
     <w:p>
       <w:r>
-        <w:t>Environmental-region averages resolved strong contrasts within the continental response (Fig. 3a; Table 1). Under late-century SSP5–8.5, HAD-deficit changes were +4.85 days in the Atlantic region, +3.45 days in the Continental region, +7.84 days in the Boreal region, -1.40 days in the Mediterranean region, and +0.37 days in the Steppic region. Among the eight named environmental regions, the largest mean increase occurred in the Boreal region and the smallest response in the Mediterranean region. The Boreal change spanned +5.06 to +12.52 days across climate models, compared with -1.88 to -1.13 days in the Mediterranean region. Alpine, Pannonian and Black Sea cells were included alongside the five larger domains (Supplementary Tables S13a–c and S16).</w:t>
+        <w:t>Environmental-region means differed substantially (Fig. 3a; Table 1). Under late-century SSP5–8.5, normalized HAD-loss changes were +4.85 days in the Atlantic region, +3.45 days in the Continental region, +7.84 days in the Boreal region, -1.40 days in the Mediterranean region, and +0.37 days in the Steppic region. Among the eight named environmental regions, the largest mean increase occurred in the Boreal region and the largest decrease in the Mediterranean region. The Boreal change spanned +5.06 to +12.52 days across climate models, compared with -1.88 to -1.13 days in the Mediterranean region. Alpine, Pannonian and Black Sea cells were included alongside the five larger regions (Supplementary Tables S13a–c and S16).</w:t>
       </w:r>
     </w:p>
     <w:p>
       <w:r>
-        <w:t>Country aggregation likewise retained contrasting outcomes. Among the twelve country groups with the largest reference wheat area, late-century SSP5–8.5 HAD changes ranged from -2.02 days in Italy to +10.43 days in Lithuania. Their conditional yield responses differed in both sign and magnitude (Fig. 3b). The full set of country means and climate-model ranges includes all country-assigned wheat cells within the study domain, with calendar eligibility and valid-season coverage retained for each group (Supplementary Table S14).</w:t>
+        <w:t>Country summaries also showed increasing and declining damage. Among the twelve country groups with the largest reference wheat area, late-century SSP5–8.5 HAD changes ranged from -2.02 days in Italy to +10.43 days in Lithuania. Yield changes inferred from their canopy damage differed in sign and magnitude (Fig. 3b). The full set of country means and climate-model ranges includes all country-assigned wheat cells within the study domain, with calendar eligibility and valid-season coverage reported for each group (Supplementary Table S14).</w:t>
       </w:r>
     </w:p>
     <w:p>
       <w:r>
-        <w:t>Conditional disease-related yield response</w:t>
+        <w:t>Yield changes inferred from canopy damage</w:t>
       </w:r>
     </w:p>
     <w:p>
       <w:r>
-        <w:t>The reference canopy–yield coefficient translated the late-century SSP5–8.5 HAD change into a conditional yield change of -47.8 kg ha⁻¹ per unit reference upper-canopy leaf area. The three-climate-model range was -82.3 to -22.2 kg ha⁻¹ per reference LAI. At coefficients of 0.0141–0.0207 t ha⁻¹ per GLAI-day, the same canopy response produced a conversion range of -55.0 to -37.4 kg ha⁻¹ per reference LAI. These quantities express the disease-related yield-loss index under alternative physiological conversion assumptions (Fig. 3b; Supplementary Fig. S13).</w:t>
+        <w:t>Applying the reference HAD–yield coefficient converted the late-century SSP5–8.5 HAD change into an estimated disease-related yield change of -47.8 kg ha⁻¹ per unit reference upper-canopy LAI. The three-climate-model range was -82.3 to -22.2 kg ha⁻¹ per reference LAI. At coefficients of 0.0141–0.0207 t ha⁻¹ per green-leaf-area-index day (GLAI-day), the same canopy response produced a conversion range of -55.0 to -37.4 kg ha⁻¹ per reference LAI. A negative change indicates greater estimated disease-related yield loss. These estimates depend on the assumed canopy area and linear HAD–yield relationship (Fig. 3b; Supplementary Fig. S13).</w:t>
       </w:r>
     </w:p>
     <w:p>
       <w:r>
-        <w:t xml:space="preserve">Published canopy–yield evidence demonstrated substantial transfer limitations. Eight treatment-mean contrasts across five genetic backgrounds gave leave-one-background-out relative-yield RMSE of 5.16 percentage points and R² of 0.247, but absolute-yield RMSE of 0.617 t ha⁻¹ and R² of −0.432. Only two contrasts had STB-specific exposure; the remaining six had yellow rust or mixed disease exposure. Severity-based treatment-response models also exceeded their training-mean benchmark errors. The conditional grid yield indices consequently express canopy-conversion sensitivity rather than validated field-yield forecasts or national production tonnages (Supplementary Figs. S9–S11; Supplementary Tables S5–S8). </w:t>
+        <w:t xml:space="preserve">Evaluation of the canopy–yield relationship showed limited prediction accuracy across genetic backgrounds. Eight treatment-mean contrasts across five genetic backgrounds gave leave-one-background-out relative-yield RMSE of 5.16 percentage points and R² of 0.247, but absolute-yield RMSE of 0.617 t ha⁻¹ and R² of −0.432. Two contrasts concerned STB alone; the other six involved yellow rust or mixed diseases. Models based on disease severity also had larger errors than their training-mean benchmarks. The grid estimates provide a disease-related yield index under specified assumptions. Total wheat yield and national production changes require additional crop-yield modelling and validation (Supplementary Figs. S9–S11; Supplementary Tables S5–S8). </w:t>
       </w:r>
       <w:r>
         <w:rPr>
           <w:vertAlign w:val="superscript"/>
         </w:rPr>
-        <w:t>[10, 11]</w:t>
+        <w:t>[2, 11]</w:t>
       </w:r>
     </w:p>
     <w:p>
       <w:r>
-        <w:t>Crop development counteracts the disease-weather contribution</w:t>
+        <w:t>Wheat development offsets part of the increase in disease damage</w:t>
       </w:r>
     </w:p>
     <w:p>
       <w:r>
-        <w:t>The diagnostic weather–crop decomposition identified opposing contributions to the late-century SSP5–8.5 canopy response (Fig. 4). On 5,731 supported paired seasons from 64 spatial draws at 62 cells, the disease-weather contribution was +9.00 HAD days per reference LAI and the crop-development contribution −6.36 days, leaving a net +2.64-day change. Crop development offset 70.6% of the weather contribution; the model-specific fractions ranged from 63.6% to 80.3%. All three models retained a positive weather contribution and a negative crop-development contribution. These diagnostic estimates retain the sampled population and its spatial Monte Carlo error, separately from the full-grid impact statistics (Supplementary Tables S12a, b).</w:t>
+        <w:t>Weather and wheat development made opposing contributions to canopy damage under late-century SSP5–8.5 (Fig. 4). In the separate sample of 64 spatial draws at 62 cells, 5,731 valid historical–future season pairs gave a weather contribution of +9.00 days of normalized HAD loss and a wheat-development contribution of −6.36 days, leaving a net +2.64-day change. Crop development offset 70.6% of the weather contribution; the model-specific fractions ranged from 63.6% to 80.3%. All three models showed a positive weather contribution and a negative wheat-development contribution. The sampled net change differs slightly from the full-grid estimate because the analyses use different cells and valid season pairs (Supplementary Tables S12a, b).</w:t>
       </w:r>
     </w:p>
     <w:p>
       <w:r>
-        <w:t>In that diagnostic sample, flowering and soft dough advanced by 26.77 and 26.64 days after sowing, while mean grain-fill duration changed little. The compensating crop-development term therefore combined altered leaf availability with earlier crop-window placement. A −2.78-day weather–crop interaction was allocated equally between the two Shapley contributions. The excluded 20 finite pairs had hybrid active-day weather outside the supported temperature range; all retained contributions shared the same paired support (Supplementary Fig. S16).</w:t>
+        <w:t>In that diagnostic sample, flowering and soft dough advanced by 26.77 and 26.64 days after sowing, while mean grain-fill duration changed little. The wheat-development contribution combines changing leaf availability with changes in the seasonal weather encountered by those leaves. A −2.78-day weather–crop interaction was allocated equally between the two Shapley contributions. Twenty additional finite pairs were excluded because recombined weather and crop trajectories exceeded the accepted temperature range on an active day (Supplementary Fig. S16).</w:t>
       </w:r>
     </w:p>
     <w:p>
       <w:r>
-        <w:t>Sensitivity and empirical support</w:t>
+        <w:t>Sensitivity and prediction accuracy</w:t>
       </w:r>
     </w:p>
     <w:p>
       <w:r>
-        <w:t>Fourteen structural, detection and canopy-conversion settings retained earlier symptoms and increased HAD deficit in all three climate models under late-century SSP5–8.5. In this diagnostic sample, mean symptom shifts spanned −5.46 to −1.54 days and HAD increases 0.63–2.80 days per reference LAI. This consistency concerned the selected model and prespecified settings rather than comprehensive future-epidemic uncertainty (Supplementary Fig. S15; Supplementary Table S10).</w:t>
+        <w:t>All fourteen tested combinations of model structure, symptom detection and canopy assumptions gave earlier symptoms and increased HAD loss in all three climate models under late-century SSP5–8.5. In this diagnostic sample, mean symptom shifts spanned −5.46 to −1.54 days and HAD increases 0.63–2.80 days. These comparisons describe sensitivity to selected model assumptions and do not cover every source of uncertainty in future disease outbreaks (Supplementary Fig. S15; Supplementary Table S10).</w:t>
       </w:r>
     </w:p>
     <w:p>
       <w:r>
-        <w:t>Pooled field evaluation gave symptom-onset interval-excess error of 5.32 days versus 2.79 days for the phenology benchmark across 136 histories. The paired difference was +2.54 days (95% grouped-bootstrap interval 1.15–3.93). Across 2,033 disease assessments from 188 field seasons, severity RMSE was 31.19 versus 29.83 percentage points, with model bias -17.56 points. The paired RMSE difference was +1.36 points (95% interval -0.20–2.82). Retained crop-stage predictions had station-held-out MAE of 8.02 days across 40,878 events. These evaluations support explicit separation of simulated climate responses from empirically demonstrated epidemic and yield prediction skill (Supplementary Figs. S18 and S20; Supplementary Tables S1–S4).</w:t>
+        <w:t>Pooled field evaluation gave mean symptom-onset error outside the observation interval of 5.32 days versus 2.79 days for the phenology benchmark across 136 histories. The paired difference was +2.54 days (95% grouped-bootstrap interval 1.15–3.93). Across 2,033 disease assessments from 188 field seasons, severity RMSE was 31.19 versus 29.83 percentage points, with model bias -17.56 points. The paired RMSE difference was +1.36 points (95% interval -0.20–2.82). Wheat-stage predictions had station-held-out MAE of 8.02 days across 40,878 events. Disease prediction accuracy remains a major limitation on the interpretation of future damage magnitudes (Supplementary Figs. S18 and S20; Supplementary Tables S1–S4).</w:t>
       </w:r>
     </w:p>
     <w:p>
@@ -198,50 +187,50 @@
     </w:p>
     <w:p>
       <w:r>
-        <w:t>Climate change produced contrasting disease-related canopy responses across the European wheat domain. Grid-level simulation resolved where a positive continental average combined increasing and decreasing damage, while environmental and country summaries connected those responses to wheat-growing areas. Disease occurrence was close to saturated under the specified model, so additional presence alone carried little information about crop consequences. The more informative changes concerned symptom timing relative to flowering, functional-canopy loss and exposure during grain filling.</w:t>
+        <w:t>The simulations project increasing average Septoria damage across European wheat-growing areas, alongside decreases in some regions. These differences arise from weather effects on disease combined with changes in wheat development. Because symptoms were predicted in almost every season, symptom presence alone was a weak measure of the projected change. The timing of symptoms and the amount of healthy canopy lost during grain filling provided more information about the modelled disease impact.</w:t>
       </w:r>
     </w:p>
     <w:p>
       <w:r>
-        <w:t xml:space="preserve">The opposing weather and crop-development contributions provide an explanation within the coupled model for this spatial complexity. Crop development changes the availability of leaves and the seasonal weather encountered during the productive canopy window. The diagnostic decomposition indicates that a substantial compensating crop term can accompany more favorable disease weather. Earlier crop development under warming therefore need not imply a proportional change in disease-related grain loss. Climate–pathogen and crop–disease assessments establish the relevance of this interaction, while European yield research emphasizes the joint contribution of climate, genetics and agronomic management. </w:t>
+        <w:t xml:space="preserve">The analysis links three processes: weather affects wheat development and disease progression; wheat development determines the leaves and seasonal conditions available to the disease; and disease damage reduces the assumed healthy canopy contributing to grain filling. The opposing weather and development contributions show why favourable infection conditions do not translate directly into proportional increases in canopy damage. The crop–disease interaction is represented through leaf availability and timing. Disease damage is converted to a yield estimate after simulation, while disease feedback on wheat development and a complete crop carbon balance are absent. These distinctions separate the projected disease component from the total effect of climate change on wheat production. </w:t>
       </w:r>
       <w:r>
         <w:rPr>
           <w:vertAlign w:val="superscript"/>
         </w:rPr>
-        <w:t>[1, 3, 4]</w:t>
+        <w:t>[3, 4, 5]</w:t>
       </w:r>
     </w:p>
     <w:p>
       <w:r>
-        <w:t>The geographic contrasts support environmental stratification of adaptation evaluation. Regions with greater simulated damage require joint assessment of crop-calendar adjustment, resistance and tolerance; regions with declining damage require equivalent scrutiny of the crop and disease timing that generates that decline. Country summaries help define the spatial scope of monitoring, but their values depend on the fixed wheat mask, imposed winter-wheat calendar and source-country grid assignment. National intervention rankings additionally require compatible cultivar, management, canopy and harvest observations.</w:t>
+        <w:t>The regional contrasts identify areas where crop and disease observations would be informative for adaptation trials. Greater projected damage in Boreal and Atlantic wheat-growing areas warrants testing disease resistance, crop calendars and canopy persistence together. Declining disease damage in the Mediterranean region also requires field verification because a decline in the disease component does not establish an increase in total grain yield. Country estimates describe the area included in the fixed wheat grid and imposed winter-wheat calendar. Differences in cultivar, irrigation, crop management and cross-border grid assignment limit their interpretation as national forecasts.</w:t>
       </w:r>
     </w:p>
     <w:p>
       <w:r>
-        <w:t xml:space="preserve">The conditional yield calculation exposes a critical measurement gap. Functional-canopy loss and disease percentage have different physiological meanings, while the HAD–yield relationship varies with genotype, leaf scope and integration window. The available published contrasts provide evidence for a canopy–yield relationship, but their absolute-yield transfer performs poorly and their disease exposures are mixed. Reference leaf area and fixed transfer coefficients consequently remain scenario assumptions. Simulated disease-related yield indices identify a pathway requiring evaluation rather than a quantified change in wheat tonnage. </w:t>
+        <w:t xml:space="preserve">The link from disease damage to grain yield is the least directly validated part of the analysis. Disease-assessment percentages, functional canopy loss and grain yield describe different quantities. The assumed conversion from disease damage to functional loss requires physiological measurements, and the published HAD–yield coefficients were fitted to a wider growth-stage interval than the main flowering-to-soft-dough calculation. The available treatment means span mixed diseases and give poor absolute-yield predictions across genetic backgrounds. Canopy-based yield estimates remain conditional indices, with actual production losses requiring compatible measurements of leaf area, canopy function and grain yield. </w:t>
       </w:r>
       <w:r>
         <w:rPr>
           <w:vertAlign w:val="superscript"/>
         </w:rPr>
-        <w:t>[10, 11, 12]</w:t>
+        <w:t>[2, 11, 12]</w:t>
       </w:r>
     </w:p>
     <w:p>
       <w:r>
-        <w:t>The pooled evaluation also limits confidence in future epidemic magnitudes. The current model has greater symptom-onset error than the phenology benchmark, and quantitative severity predictions have a substantial negative bias. The occurrence comparison indicates high sensitivity with poorer specificity, consistent with near-saturated simulated symptom occurrence. Added developmental stages have sparse two-sided observations, including limited evidence for the grain-fill endpoint. Climate-model agreement and numerical completeness cannot resolve these empirical limitations. Parameter identification, humidity reconstruction, cultivar resistance, changing source abundance and future pathogen adaptation remain additional sources of uncertainty.</w:t>
+        <w:t>Disease-model performance adds substantial uncertainty. The model had greater symptom-onset error than the phenology benchmark and underestimated measured disease severity. High symptom-detection sensitivity with low specificity is consistent with the near-universal symptom occurrence in the simulations. Added developmental stages, including the end of the grain-filling interval, have limited informative field observations. Agreement among climate models cannot establish epidemic prediction accuracy. Reconstructed humidity, fixed inoculum assumptions, cultivar resistance and future pathogen adaptation also affect the applicability of the projected changes.</w:t>
       </w:r>
     </w:p>
     <w:p>
       <w:r>
-        <w:t xml:space="preserve">For agricultural policy, the evidence supports coordinated crop-development, disease, functional-canopy and harvest monitoring across contrasting environmental regions. Cultivar and calendar trials need shared canopy-area definitions and compatible observation windows to distinguish exposure avoidance, resistance and yield tolerance. Connecting these observations to harvested wheat area would improve the production relevance of future disease assessments. Such coordinated evaluation is consistent with European objectives for resilient and sustainable agriculture; the present simulations do not measure the effectiveness of any specific intervention. </w:t>
+        <w:t xml:space="preserve">For European food-security policy, the practical contribution is a regional framework for testing climate-related disease damage alongside wheat development. Coordinated observations of crop stages, disease symptoms, healthy leaf area and harvested grain would help identify whether adaptation reduces exposure, prevents damage or improves yield tolerance. Resistance and calendar trials across contrasting regions can evaluate these mechanisms under consistent measurement definitions. The simulations alone do not establish the effectiveness of a specific intervention or quantify Europe-wide food-security outcomes. </w:t>
       </w:r>
       <w:r>
         <w:rPr>
           <w:vertAlign w:val="superscript"/>
         </w:rPr>
-        <w:t>[13, 14]</w:t>
+        <w:t>[14, 15]</w:t>
       </w:r>
     </w:p>
     <w:p>
@@ -251,85 +240,23 @@
     </w:p>
     <w:p>
       <w:r>
-        <w:t>Study domain and climate forcing</w:t>
+        <w:t>Wheat-growing area and climate data</w:t>
       </w:r>
     </w:p>
     <w:p>
       <w:r>
-        <w:t xml:space="preserve">The study domain contains every positive-wheat-harvested-area cell in the European SPAM2020 registry at 0.25° resolution: 14,941 cells. A fixed GGCMI winter-wheat rainfed calendar is available for 14,932 cells; the remaining nine retain unavailable outcomes. The all-wheat area mask and imposed calendar define a management scenario, rather than an observed distribution of winter-wheat management. SPAM2020 harvested area supplies fixed weights throughout the analysis. The study-area and observation-location maps are provided in Supplementary Fig. S21. </w:t>
+        <w:t xml:space="preserve">The European SPAM2020 all-wheat registry contains 14,941 cells with positive harvested wheat area at 0.25° resolution. A fixed GGCMI winter-wheat rainfed calendar is available for 14,932 cells; nine cells have unavailable simulation outcomes. The all-wheat area mask combined with a winter-wheat rainfed calendar defines the crop-management scenario. It is not a census of observed winter-wheat management. Harvested area provides fixed weights for spatial aggregation. Supplementary Fig. S21 shows the study area, field-observation locations and environmental regions. </w:t>
       </w:r>
       <w:r>
         <w:rPr>
           <w:vertAlign w:val="superscript"/>
         </w:rPr>
-        <w:t>[15, 16]</w:t>
+        <w:t>[16, 17]</w:t>
       </w:r>
     </w:p>
     <w:p>
       <w:r>
-        <w:t xml:space="preserve">Daily NEX-GDDP-CMIP6v2 forcing covers ACCESS-CM2, MPI-ESM1-2-HR and MRI-ESM2-0 under SSP1–2.6, SSP2–4.5 and SSP5–8.5. Harvest periods are 1991–2020, 2031–2060 and 2071–2100. All 810 annual model–scenario–year combinations simulate the entire land-use mask, corresponding to 12,094,920 calendar-eligible grid-seasons. Forcing uses the existing local alignment coefficients, with separate historical alignment for each SSP continuation. Daily series include the preceding calendar year for overwintering crop seasons. Source files, alignment coefficients and runtime configurations retain their checksums. </w:t>
-      </w:r>
-      <w:r>
-        <w:rPr>
-          <w:vertAlign w:val="superscript"/>
-        </w:rPr>
-        <w:t>[17]</w:t>
-      </w:r>
-    </w:p>
-    <w:p>
-      <w:r>
-        <w:t>Disease-weather exposure uses daily temperature, humidity and rainfall with the retained synthetic intraday humidity reconstruction. This reconstruction approximates exposure from daily forcing and does not represent measured leaf wetness. The observation-supported temperature range and missing-weather criteria retain their existing definitions in the model specification.</w:t>
-      </w:r>
-    </w:p>
-    <w:p>
-      <w:r>
-        <w:t>Crop development and disease representation</w:t>
-      </w:r>
-    </w:p>
-    <w:p>
-      <w:r>
-        <w:t xml:space="preserve">The retained temperature–photoperiod–vernalization model determines wheat development from sowing through soft dough. Additional ordered thresholds represent upper-leaf appearance and unfolding, and a calibrated flowering proxy defines the grain-fill window. Leaf availability, development and seasonal exposure connect daily weather to the existing Septoria source, establishment, progression and symptom states. Disease-related functional loss is gated by symptom detection in the climate reporting operator. Model equations, parameter provenance and observation definitions are provided in the supplementary model specification and the 84-entry parameter inventory. </w:t>
-      </w:r>
-      <w:r>
-        <w:rPr>
-          <w:vertAlign w:val="superscript"/>
-        </w:rPr>
-        <w:t>[5, 6, 7, 8, 9]</w:t>
-      </w:r>
-    </w:p>
-    <w:p>
-      <w:r>
-        <w:t>Models retain their existing calibrated parameters. The reference upper-three-leaf LAI is nominally one, divided equally among final leaf ranks and scaled by unfolding. No cultivar-specific canopy area, future resistance change or local absolute-yield calibration is inferred. Predicted soft dough defines season completion; missing calendars, unsupported forcing and unreached endpoints remain explicit statuses. Invalid outcomes are unavailable values rather than zero disease or zero loss.</w:t>
-      </w:r>
-    </w:p>
-    <w:p>
-      <w:r>
-        <w:t>Disease and canopy outcomes</w:t>
-      </w:r>
-    </w:p>
-    <w:p>
-      <w:r>
-        <w:t>Occurrence is the indicator of detectable flag-leaf symptoms before soft dough. Its multi-year mean is the frequency of symptomatic simulated grid-seasons. First-symptom timing is measured relative to flowering and is unavailable when symptoms are not detected. Symptomatic grain-fill days count days with detectable flag-leaf symptoms within the flowering-to-soft-dough window. These endpoints describe model states rather than observed infection dates or future disease probabilities.</w:t>
-      </w:r>
-    </w:p>
-    <w:p>
-      <w:r>
-        <w:t>HAD deficit integrates daily reference green canopy area multiplied by the assumed functional-loss fraction across the flag leaf and two leaves below it. The main window is flowering to soft dough (GS65–85); GS31–85 provides a wider-window sensitivity. The mean functional-loss fraction is lost HAD divided by reference HAD and represents reference-area-weighted canopy damage severity. This integrated canopy quantity differs from instantaneous lesion percentage and retains the model’s damage-to-function assumptions.</w:t>
-      </w:r>
-    </w:p>
-    <w:p>
-      <w:r>
-        <w:t>Paired grid and spatial aggregation</w:t>
-      </w:r>
-    </w:p>
-    <w:p>
-      <w:r>
-        <w:t>Each future harvest year is paired with the reference year at the corresponding index of the same 30-year period, climate model and SSP. A metric-specific pair is retained only if both outcomes are finite. For grid i, x_i is the mean valid paired difference with unavailable pairs contributing zero to the numerator, and z_i is the fraction of valid pairs among 30 years. The grid estimate is x_i/z_i. Reference and future means share the same valid pairs. Timing, occurrence and canopy outcomes therefore have their own documented support.</w:t>
-      </w:r>
-    </w:p>
-    <w:p>
-      <w:r>
-        <w:t xml:space="preserve">For a domain indicator I_i and fixed harvested area w_i, the aggregate paired change is Σw_i I_i x_i / Σw_i I_i z_i. Estimates are calculated separately for each climate model before their three-model mean and range are reported. EEA 2016 boundaries assign environmental regions by wheat-cell centroid intersection, retaining unassigned and outside-region categories. Country groups use each cell’s dominant SPAM source-country label; cross-border cells are not divided among countries. Country estimates refer only to the represented study domain. All eight named environmental regions and all country groups remain in Source Data. </w:t>
+        <w:t xml:space="preserve">Daily NEX-GDDP-CMIP6v2 data represent ACCESS-CM2, MPI-ESM1-2-HR and MRI-ESM2-0 under SSP1–2.6, SSP2–4.5 and SSP5–8.5. The harvest periods are 1991–2020, 2031–2060 and 2071–2100. The 810 model–scenario–year combinations cover 12,094,920 calendar-eligible grid-seasons. Monthly adjustment coefficients align climate variables with the reference weather data, with separate historical adjustments for each SSP continuation. Daily series include the preceding calendar year to represent overwintering seasons. Input files, adjustment coefficients and model configurations are identified by checksums. </w:t>
       </w:r>
       <w:r>
         <w:rPr>
@@ -340,64 +267,126 @@
     </w:p>
     <w:p>
       <w:r>
-        <w:t>Maps display complete three-climate-model estimates at native 0.25° pixels, with no interpolation or missing-value filling. Sign-area shares use the exact fixed harvested-area weights over cells with complete estimates. Three-model ranges describe deterministic scenario spread. A full land-use census has no spatial-sampling Monte Carlo error; climate-model choice, biological parameters, observation error and canopy–yield conversion remain separate uncertainties. The twelve country groups shown in Fig. 3 are selected by reference wheat area before considering projected effects.</w:t>
+        <w:t>Disease calculations use daily temperature, relative humidity and rainfall. A synthetic reconstruction of humidity within each day estimates moisture exposure from daily forcing; it does not supply measured leaf wetness. Missing weather and daily mean temperatures above 40 °C produce unavailable outcomes under the model input rules.</w:t>
       </w:r>
     </w:p>
     <w:p>
       <w:r>
-        <w:t>Conditional yield response</w:t>
+        <w:t>Linking wheat development to Septoria disease</w:t>
       </w:r>
     </w:p>
     <w:p>
       <w:r>
-        <w:t xml:space="preserve">Conditional disease-related yield change is −b times the paired HAD-deficit change. The reference coefficient is 0.018 t ha⁻¹ per GLAI-day, with 0.0141 and 0.0207 used as fixed conversion alternatives from the published top-three-canopy study. Reported kg ha⁻¹ values multiply the t ha⁻¹ result by 1,000 and retain the nominal reference LAI denominator. The coefficients span cultivar predictions rather than a probability interval. Actual field-yield percentage changes and national production tonnages require compatible canopy area and grain-yield validation and are not identified by this operator. </w:t>
+        <w:t xml:space="preserve">A temperature–photoperiod–vernalization model calculates wheat development from sowing to soft dough. Additional ordered developmental thresholds determine upper-leaf appearance and unfolding, and a calibrated flowering threshold defines the start of the grain-filling interval. These crop trajectories determine which leaves are available to infection and the seasonal weather experienced by each leaf. The Septoria module calculates disease establishment, progression and visible damage using weather and these leaf trajectories. Disease damage does not alter the calculated crop-development trajectory. Model equations, parameter sources and observation definitions appear in the supplementary model specification and the 84-entry parameter inventory. </w:t>
       </w:r>
       <w:r>
         <w:rPr>
           <w:vertAlign w:val="superscript"/>
         </w:rPr>
-        <w:t>[10, 11]</w:t>
+        <w:t>[6, 7, 8, 9, 10]</w:t>
       </w:r>
     </w:p>
     <w:p>
       <w:r>
-        <w:t>Diagnostic decomposition and sensitivity</w:t>
+        <w:t>Calibrated parameters remain fixed across climate scenarios. The maximum reference LAI of the upper three leaves is one, divided equally among leaves and scaled by unfolding. Cultivar-specific canopy area and future changes in resistance are not estimated. Soft dough marks season completion. Missing crop calendars, invalid weather and failure to reach the endpoint remain separate unavailable outcomes, rather than zero disease or zero loss.</w:t>
       </w:r>
     </w:p>
     <w:p>
       <w:r>
-        <w:t>The weather–crop decomposition and fourteen-setting sensitivity analysis retain the prespecified 64 area-proportional draws at 62 unique cells. Four trajectories combine reference or future disease weather with reference or future crop-development trajectories. Shapley contributions share the weather–crop interaction equally and sum to the common-support net. The supported decomposition excludes 20 of 5,751 finite pairs with an active hybrid forcing day outside the supported temperature range, leaving 5,731 pairs. Its spatial Monte Carlo standard errors describe the sampled diagnostic population and are distinct from full-grid impact estimates.</w:t>
+        <w:t>Symptoms, canopy damage and healthy-area duration</w:t>
       </w:r>
     </w:p>
     <w:p>
       <w:r>
-        <w:t>The crop-development offset is −100 times the crop Shapley contribution divided by the weather contribution on identical support. The ensemble percentage uses the ratio of three-model mean contributions. Sensitivity settings vary structural, detection, reference-canopy and functional-conversion assumptions within the selected model. These comparisons evaluate model-response dependence and do not estimate the efficacy of a management intervention.</w:t>
+        <w:t>Symptom frequency is the fraction of complete simulated seasons with detectable flag-leaf symptoms before soft dough. First-symptom timing is measured relative to flowering or sowing and is unavailable when symptoms are not detected. Symptomatic grain-fill days count days with detectable flag-leaf symptoms between flowering and soft dough. Symptoms are visible model states following disease development; their dates are distinct from the modelled dates of initial infection.</w:t>
       </w:r>
     </w:p>
     <w:p>
       <w:r>
-        <w:t>Pooled field evaluation</w:t>
+        <w:t>The disease-damage fraction after symptom detection is treated as the fraction of reference leaf area that has lost function. This assumption connects modelled disease to canopy damage. HAD loss integrates this fraction multiplied by daily reference leaf area across the flag leaf and two leaves below it. The primary interval is flowering to soft dough (GS65–85), with GS31–85 used for sensitivity analysis. Unnormalized HAD has units of green leaf area index multiplied by days (GLAI-days). Normalized HAD loss divides it by maximum reference upper-canopy LAI and has units of days. With reference LAI equal to one, normalization leaves numerical values unchanged. Relative HAD loss is HAD loss divided by reference HAD, expressed as a percentage; it describes average accumulated canopy-function loss, not instantaneous lesion percentage.</w:t>
       </w:r>
     </w:p>
     <w:p>
       <w:r>
-        <w:t xml:space="preserve">Evaluation records from the two public field archives are pooled after the existing calibration and geographic eligibility restrictions. Calibration records retain their separate cohort. Evaluation contains 2,033 numerical assessments from 188 field seasons in 140 coordinate-years and 136 two-sided source-leaf-1–3 onset histories from 78 field seasons in 62 coordinate-years. Source identities, units, assessment conventions and leaf semantics remain in the evidence files. Source-defined percentages retain their original denominators, and source leaf numbers do not establish a universal final-rank mapping. </w:t>
+        <w:t>Historical–future comparisons and spatial summaries</w:t>
+      </w:r>
+    </w:p>
+    <w:p>
+      <w:r>
+        <w:t>Each future harvest year is paired with the corresponding position in the 30-year historical period for the same climate model and SSP. This indexing supports comparisons of period means without identifying historical and future years as the same physical event. A pair is included only when both metric values are finite. For grid i, x_i is the sum of valid paired differences divided by 30, and z_i is the number of valid pairs divided by 30. The grid mean change is x_i/z_i. Reference and future means use the same valid pairs. The valid seasons may differ among symptom timing, symptom frequency and canopy metrics.</w:t>
+      </w:r>
+    </w:p>
+    <w:p>
+      <w:r>
+        <w:t xml:space="preserve">For domain indicator I_i and fixed harvested area w_i, the mean change is Σw_i I_i x_i / Σw_i I_i z_i. Separate estimates for each climate model give the reported three-model mean and range. EEA 2016 boundaries assign environmental regions from wheat-cell centroids. Country assignment uses the dominant SPAM source-country label of each cell; cross-border cells are not divided among countries. Country estimates apply only to represented wheat cells within the study domain. Source Data includes all eight named environmental regions, outside-region and unassigned cells, and all country groups. </w:t>
       </w:r>
       <w:r>
         <w:rPr>
           <w:vertAlign w:val="superscript"/>
         </w:rPr>
-        <w:t>[19, 20]</w:t>
+        <w:t>[19]</w:t>
       </w:r>
     </w:p>
     <w:p>
       <w:r>
-        <w:t>Scores give equal weight to coordinate-years, fields within coordinate-years, source leaves within fields and assessments within leaves. Symptom-onset error is distance outside the genuine two-sided observed interval, retaining the predefined missed-positive penalty. Disease magnitude is evaluated against the existing calibration-leaf-mean benchmark; symptom timing and detection use the calibration-selected phenology benchmark. Fixed model and benchmark predictions are paired on identical records. Bootstrap intervals use 20,000 intact coordinate-year resamples and describe uncertainty conditional on the fitted predictions and reused retrospective data. Duplicate coordinate-year identities are grouped together across archives.</w:t>
+        <w:t>Maps show model means at the native 0.25° grid resolution, without interpolation or filling unavailable cells. Area shares by direction of change use fixed harvested-area weights over cells with complete three-model estimates. Model ranges describe spread among three climate models and are not confidence intervals. All wheat cells are simulated, so full-grid estimates have no spatial-sampling Monte Carlo error. Other uncertainties include climate-model choice, model parameters, observations and the canopy–yield relationship. The twelve countries in Fig. 3 are selected by reference wheat area independently of the projected change.</w:t>
       </w:r>
     </w:p>
     <w:p>
       <w:r>
-        <w:t xml:space="preserve">The retained crop-development formulation is evaluated on 40,878 matched German station-held-out events at BBCH 10, 31, 51 and 85. Added stages use pooled field observation intervals and separate calibration evidence. Published canopy–yield evaluation retains all eight treatment-mean contrasts across five genetic backgrounds, including STB, yellow-rust and mixed exposures; leave-one-background-out fitting gives backgrounds equal evaluation weight. Severity-based yield transfer retains its independent trial or year splits and training-mean comparators. </w:t>
+        <w:t>Estimating the disease-related yield response</w:t>
+      </w:r>
+    </w:p>
+    <w:p>
+      <w:r>
+        <w:t xml:space="preserve">The estimated disease-related yield change is −b times the change in HAD loss. The reference coefficient b is 0.018 t ha⁻¹ per GLAI-day, with 0.0141 and 0.0207 used as fixed alternatives from the published upper-three-leaf study. Multiplication by 1,000 converts t ha⁻¹ to kg ha⁻¹. Results are expressed per unit reference upper-canopy LAI because actual canopy area is unspecified. The source relationship began at GS31, whereas the primary climate calculation covers GS65–85; its use in this shorter interval is an unvalidated adaptation. Coefficient alternatives represent cultivar differences, not statistical confidence limits. The calculation estimates a disease-related yield component under these assumptions, without modelling the direct effects of heat, water limitation, CO₂ or other stresses on total grain yield. Yield percentages and national production tonnages require independently validated canopy area and grain yield. </w:t>
+      </w:r>
+      <w:r>
+        <w:rPr>
+          <w:vertAlign w:val="superscript"/>
+        </w:rPr>
+        <w:t>[2, 11]</w:t>
+      </w:r>
+    </w:p>
+    <w:p>
+      <w:r>
+        <w:t>Separating weather and wheat-development effects</w:t>
+      </w:r>
+    </w:p>
+    <w:p>
+      <w:r>
+        <w:t>The decomposition and fourteen-setting sensitivity analysis use 64 harvested-area-proportional draws at 62 unique cells. Four simulations combine historical or future disease weather with historical or future wheat-development trajectories. Their differences separate weather and wheat-development contributions, with one half of their interaction allocated to each Shapley contribution. Of 5,751 finite historical–future pairs, 20 have an active day outside the accepted temperature range in a recombined trajectory and are excluded, leaving 5,731 pairs. Spatial Monte Carlo standard errors apply to this sample and are separate from full-grid climate estimates.</w:t>
+      </w:r>
+    </w:p>
+    <w:p>
+      <w:r>
+        <w:t>The development offset is −100 times the development contribution divided by the weather contribution, using identical valid pairs. The ensemble percentage is the ratio of three-model mean contributions. Sensitivity settings vary model structure, symptom detection, reference canopy area and damage-to-function conversion. These calculations assess model assumptions and do not represent trials of a sowing-date or cultivar intervention.</w:t>
+      </w:r>
+    </w:p>
+    <w:p>
+      <w:r>
+        <w:t>Field evaluation</w:t>
+      </w:r>
+    </w:p>
+    <w:p>
+      <w:r>
+        <w:t xml:space="preserve">Disease observations from the two public field archives are pooled after exclusion of calibration records and application of geographic eligibility criteria. The evaluation contains 2,033 assessments from 188 field seasons in 140 coordinate-years and 136 symptom-onset histories from 78 field seasons in 62 coordinate-years. Onset histories concern source-defined leaves 1–3 and have observations bracketing symptom appearance. Original identifiers, units and percentage denominators remain in the evidence files. Source leaf numbers do not establish a common final-leaf rank across archives. </w:t>
+      </w:r>
+      <w:r>
+        <w:rPr>
+          <w:vertAlign w:val="superscript"/>
+        </w:rPr>
+        <w:t>[20, 21]</w:t>
+      </w:r>
+    </w:p>
+    <w:p>
+      <w:r>
+        <w:t>Evaluation weights are equal among coordinate-years, fields within coordinate-years, source leaves within fields and assessments within leaves. Symptom-onset error measures distance outside the two-sided observation interval, with the predefined penalty for missed positive observations. Severity predictions are compared with the calibration-leaf-mean benchmark; timing and detection use the phenology benchmark selected on calibration data. Model and benchmark predictions are compared on identical records. The 95% intervals use 20,000 paired bootstrap resamples of entire coordinate-year groups. They describe uncertainty in these fixed predictions on reused retrospective observations and exclude parameter-selection uncertainty. Duplicate coordinate-year identities are grouped across archives.</w:t>
+      </w:r>
+    </w:p>
+    <w:p>
+      <w:r>
+        <w:t xml:space="preserve">Wheat development is evaluated on 40,878 matched events from German stations held out of calibration, at BBCH 10, 31, 51 and 85. Added leaf stages use pooled field observation intervals, with calibration observations reported separately. Evaluation of the canopy–yield relationship uses eight published treatment-mean contrasts across five genetic backgrounds, including STB, yellow rust and mixed disease. Leaving each background out of fitting gives backgrounds equal evaluation weight. Severity-based yield models use their specified held-out trial or year comparisons and corresponding training-mean benchmarks. </w:t>
       </w:r>
       <w:r>
         <w:rPr>
@@ -413,7 +402,7 @@
     </w:p>
     <w:p>
       <w:r>
-        <w:t>Each annual output retains its forcing identities, frozen-runtime configuration, land-use-cell order, numerical checks and output checksum. Aggregation records source hashes, metric-specific pair counts and domain coverage. Independent checks recompute pooled evaluation and selected full-grid domain ratios from the underlying records. Source Data contains the values displayed in figures and tables. The accompanying software archive regenerates the manuscript from completed numerical evidence; climate-forcing-based simulation additionally requires the external raw climate products.</w:t>
+        <w:t>Annual outputs record input-weather identities, model configurations, grid-cell order, numerical checks and output hashes. Aggregation records source hashes, counts of valid pairs and spatial coverage for each metric. Independent calculations check pooled field scores and selected full-grid regional means. Source Data contains figure and table values. The software archive regenerates documents from completed numerical evidence; a climate-driven model rerun additionally requires the external raw weather products.</w:t>
       </w:r>
     </w:p>
     <w:p>
@@ -423,18 +412,18 @@
     </w:p>
     <w:p>
       <w:r>
-        <w:t xml:space="preserve">Public field disease archives, NEX-GDDP-CMIP6v2 forcing, GGCMI calendars, SPAM2020 wheat area and EEA environmental boundaries are identified by dataset references. Source_Data.xlsx contains the completed full-grid climate summaries, environmental and country statistics, exact sign-area shares, pooled evaluation populations and published canopy–yield evidence. Source labels and assessment conventions remain in the underlying records. </w:t>
+        <w:t xml:space="preserve">Dataset references identify the public disease archives, NEX-GDDP-CMIP6v2 climate data, GGCMI calendars, SPAM2020 wheat area and EEA environmental boundaries. Source_Data.xlsx contains completed grid summaries, environmental-region and country statistics, area shares by direction of change, pooled field evaluation and published canopy–yield evidence. Original labels and assessment definitions remain in the underlying records. </w:t>
       </w:r>
       <w:r>
         <w:rPr>
           <w:vertAlign w:val="superscript"/>
         </w:rPr>
-        <w:t>[15, 16, 17, 18, 19, 20]</w:t>
+        <w:t>[16, 17, 18, 19, 20, 21]</w:t>
       </w:r>
     </w:p>
     <w:p>
       <w:r>
-        <w:t>The software archive contains grid-level paired summaries, completion receipts, output hashes and numerical evidence required for publication regeneration. Raw daily climate products and all annual simulation outputs remain external because of their size; forcing-based reproduction requires the recorded source products and alignment files. Unavailable raw plot observations and functional-canopy measurements remain unavailable.</w:t>
+        <w:t>The software archive includes completed summaries, selected diagnostic outputs, input and output hashes, and numerical evidence for document regeneration. The complete raw climate and annual-output archives are external because of their size. Model reruns require the recorded climate products and adjustment files. Raw plot observations and physiological measurements unavailable in the source studies are not reconstructed.</w:t>
       </w:r>
     </w:p>
     <w:p>
@@ -444,7 +433,7 @@
     </w:p>
     <w:p>
       <w:r>
-        <w:t>Software_and_Evidence.zip contains the simulation and reporting source code, pooled-statistics code, document-generation code and evidence manifests. REPRODUCIBILITY.txt distinguishes document regeneration from forcing-based runtime execution. The supplementary model specification contains 29 numbered equations, and Parameter_inventory.csv records 84 fixed, fitted and scenario quantities.</w:t>
+        <w:t>Software_and_Evidence.zip contains simulation, statistical-analysis and document-generation code with evidence manifests. REPRODUCIBILITY.txt documents regeneration and model-rerun requirements. The supplementary model specification contains 29 numbered equations, and Parameter_inventory.csv records 84 fixed, fitted and scenario quantities. The working Git Hub repository is private pending publication.</w:t>
       </w:r>
     </w:p>
     <w:p>
@@ -464,6 +453,88 @@
           <w:i w:val="0"/>
         </w:rPr>
         <w:t>1.</w:t>
+      </w:r>
+      <w:r>
+        <w:rPr>
+          <w:i w:val="0"/>
+        </w:rPr>
+        <w:t xml:space="preserve">Savary, S. </w:t>
+      </w:r>
+      <w:r>
+        <w:rPr>
+          <w:i/>
+        </w:rPr>
+        <w:t>et al.</w:t>
+      </w:r>
+      <w:r>
+        <w:rPr>
+          <w:i w:val="0"/>
+        </w:rPr>
+        <w:t xml:space="preserve"> The global burden of pathogens and pests on major food crops. </w:t>
+      </w:r>
+      <w:r>
+        <w:rPr>
+          <w:i/>
+        </w:rPr>
+        <w:t>Nature Ecology &amp; Evolution</w:t>
+      </w:r>
+      <w:r>
+        <w:rPr>
+          <w:i w:val="0"/>
+        </w:rPr>
+        <w:t>3</w:t>
+      </w:r>
+      <w:r>
+        <w:rPr>
+          <w:i w:val="0"/>
+        </w:rPr>
+        <w:t>, 430–439 (2019).</w:t>
+      </w:r>
+    </w:p>
+    <w:p>
+      <w:pPr>
+        <w:ind w:left="432" w:hanging="432"/>
+      </w:pPr>
+      <w:r>
+        <w:rPr>
+          <w:i w:val="0"/>
+        </w:rPr>
+        <w:t>2.</w:t>
+      </w:r>
+      <w:r>
+        <w:rPr>
+          <w:i w:val="0"/>
+        </w:rPr>
+        <w:t xml:space="preserve">Parker, S. R., Welham, S., Paveley, N. D., Foulkes, J. &amp; Scott, R. K. Tolerance of septoria leaf blotch in winter wheat. </w:t>
+      </w:r>
+      <w:r>
+        <w:rPr>
+          <w:i/>
+        </w:rPr>
+        <w:t>Plant Pathology</w:t>
+      </w:r>
+      <w:r>
+        <w:rPr>
+          <w:i w:val="0"/>
+        </w:rPr>
+        <w:t>53</w:t>
+      </w:r>
+      <w:r>
+        <w:rPr>
+          <w:i w:val="0"/>
+        </w:rPr>
+        <w:t>, 1–10 (2004).</w:t>
+      </w:r>
+    </w:p>
+    <w:p>
+      <w:pPr>
+        <w:ind w:left="432" w:hanging="432"/>
+      </w:pPr>
+      <w:r>
+        <w:rPr>
+          <w:i w:val="0"/>
+        </w:rPr>
+        <w:t>3.</w:t>
       </w:r>
       <w:r>
         <w:rPr>
@@ -510,54 +581,7 @@
         <w:rPr>
           <w:i w:val="0"/>
         </w:rPr>
-        <w:t>2.</w:t>
-      </w:r>
-      <w:r>
-        <w:rPr>
-          <w:i w:val="0"/>
-        </w:rPr>
-        <w:t xml:space="preserve">Savary, S. </w:t>
-      </w:r>
-      <w:r>
-        <w:rPr>
-          <w:i/>
-        </w:rPr>
-        <w:t>et al.</w:t>
-      </w:r>
-      <w:r>
-        <w:rPr>
-          <w:i w:val="0"/>
-        </w:rPr>
-        <w:t xml:space="preserve"> The global burden of pathogens and pests on major food crops. </w:t>
-      </w:r>
-      <w:r>
-        <w:rPr>
-          <w:i/>
-        </w:rPr>
-        <w:t>Nature Ecology &amp; Evolution</w:t>
-      </w:r>
-      <w:r>
-        <w:rPr>
-          <w:i w:val="0"/>
-        </w:rPr>
-        <w:t>3</w:t>
-      </w:r>
-      <w:r>
-        <w:rPr>
-          <w:i w:val="0"/>
-        </w:rPr>
-        <w:t>, 430–439 (2019).</w:t>
-      </w:r>
-    </w:p>
-    <w:p>
-      <w:pPr>
-        <w:ind w:left="432" w:hanging="432"/>
-      </w:pPr>
-      <w:r>
-        <w:rPr>
-          <w:i w:val="0"/>
-        </w:rPr>
-        <w:t>3.</w:t>
+        <w:t>4.</w:t>
       </w:r>
       <w:r>
         <w:rPr>
@@ -592,7 +616,7 @@
         <w:rPr>
           <w:i w:val="0"/>
         </w:rPr>
-        <w:t>4.</w:t>
+        <w:t>5.</w:t>
       </w:r>
       <w:r>
         <w:rPr>
@@ -629,53 +653,6 @@
           <w:i w:val="0"/>
         </w:rPr>
         <w:t>, 178–183 (2024).</w:t>
-      </w:r>
-    </w:p>
-    <w:p>
-      <w:pPr>
-        <w:ind w:left="432" w:hanging="432"/>
-      </w:pPr>
-      <w:r>
-        <w:rPr>
-          <w:i w:val="0"/>
-        </w:rPr>
-        <w:t>5.</w:t>
-      </w:r>
-      <w:r>
-        <w:rPr>
-          <w:i w:val="0"/>
-        </w:rPr>
-        <w:t xml:space="preserve">Suffert, F. &amp; Sache, I. Relative importance of different types of inoculum to the establishment of </w:t>
-      </w:r>
-      <w:r>
-        <w:rPr>
-          <w:i/>
-        </w:rPr>
-        <w:t>Mycosphaerella graminicola</w:t>
-      </w:r>
-      <w:r>
-        <w:rPr>
-          <w:i w:val="0"/>
-        </w:rPr>
-        <w:t xml:space="preserve"> in wheat crops in north‐west Europe. </w:t>
-      </w:r>
-      <w:r>
-        <w:rPr>
-          <w:i/>
-        </w:rPr>
-        <w:t>Plant Pathology</w:t>
-      </w:r>
-      <w:r>
-        <w:rPr>
-          <w:i w:val="0"/>
-        </w:rPr>
-        <w:t>60</w:t>
-      </w:r>
-      <w:r>
-        <w:rPr>
-          <w:i w:val="0"/>
-        </w:rPr>
-        <w:t>, 878–889 (2011).</w:t>
       </w:r>
     </w:p>
     <w:p>
@@ -786,6 +763,88 @@
         <w:rPr>
           <w:i w:val="0"/>
         </w:rPr>
+        <w:t xml:space="preserve">Lovell, D. J., Hunter, T., Powers, S. J., Parker, S. R. &amp; van den Bosch, F. Effect of temperature on latent period of septoria leaf blotch on winter wheat under outdoor conditions. </w:t>
+      </w:r>
+      <w:r>
+        <w:rPr>
+          <w:i/>
+        </w:rPr>
+        <w:t>Plant Pathology</w:t>
+      </w:r>
+      <w:r>
+        <w:rPr>
+          <w:i w:val="0"/>
+        </w:rPr>
+        <w:t>53</w:t>
+      </w:r>
+      <w:r>
+        <w:rPr>
+          <w:i w:val="0"/>
+        </w:rPr>
+        <w:t>, 170–181 (2004).</w:t>
+      </w:r>
+    </w:p>
+    <w:p>
+      <w:pPr>
+        <w:ind w:left="432" w:hanging="432"/>
+      </w:pPr>
+      <w:r>
+        <w:rPr>
+          <w:i w:val="0"/>
+        </w:rPr>
+        <w:t>9.</w:t>
+      </w:r>
+      <w:r>
+        <w:rPr>
+          <w:i w:val="0"/>
+        </w:rPr>
+        <w:t xml:space="preserve">Suffert, F. &amp; Sache, I. Relative importance of different types of inoculum to the establishment of </w:t>
+      </w:r>
+      <w:r>
+        <w:rPr>
+          <w:i/>
+        </w:rPr>
+        <w:t>Mycosphaerella graminicola</w:t>
+      </w:r>
+      <w:r>
+        <w:rPr>
+          <w:i w:val="0"/>
+        </w:rPr>
+        <w:t xml:space="preserve"> in wheat crops in north‐west Europe. </w:t>
+      </w:r>
+      <w:r>
+        <w:rPr>
+          <w:i/>
+        </w:rPr>
+        <w:t>Plant Pathology</w:t>
+      </w:r>
+      <w:r>
+        <w:rPr>
+          <w:i w:val="0"/>
+        </w:rPr>
+        <w:t>60</w:t>
+      </w:r>
+      <w:r>
+        <w:rPr>
+          <w:i w:val="0"/>
+        </w:rPr>
+        <w:t>, 878–889 (2011).</w:t>
+      </w:r>
+    </w:p>
+    <w:p>
+      <w:pPr>
+        <w:ind w:left="432" w:hanging="432"/>
+      </w:pPr>
+      <w:r>
+        <w:rPr>
+          <w:i w:val="0"/>
+        </w:rPr>
+        <w:t>10.</w:t>
+      </w:r>
+      <w:r>
+        <w:rPr>
+          <w:i w:val="0"/>
+        </w:rPr>
         <w:t xml:space="preserve">Baccar, R. </w:t>
       </w:r>
       <w:r>
@@ -817,76 +876,6 @@
           <w:i w:val="0"/>
         </w:rPr>
         <w:t>, 1179–1194 (2011).</w:t>
-      </w:r>
-    </w:p>
-    <w:p>
-      <w:pPr>
-        <w:ind w:left="432" w:hanging="432"/>
-      </w:pPr>
-      <w:r>
-        <w:rPr>
-          <w:i w:val="0"/>
-        </w:rPr>
-        <w:t>9.</w:t>
-      </w:r>
-      <w:r>
-        <w:rPr>
-          <w:i w:val="0"/>
-        </w:rPr>
-        <w:t xml:space="preserve">Lovell, D. J., Hunter, T., Powers, S. J., Parker, S. R. &amp; van den Bosch, F. Effect of temperature on latent period of septoria leaf blotch on winter wheat under outdoor conditions. </w:t>
-      </w:r>
-      <w:r>
-        <w:rPr>
-          <w:i/>
-        </w:rPr>
-        <w:t>Plant Pathology</w:t>
-      </w:r>
-      <w:r>
-        <w:rPr>
-          <w:i w:val="0"/>
-        </w:rPr>
-        <w:t>53</w:t>
-      </w:r>
-      <w:r>
-        <w:rPr>
-          <w:i w:val="0"/>
-        </w:rPr>
-        <w:t>, 170–181 (2004).</w:t>
-      </w:r>
-    </w:p>
-    <w:p>
-      <w:pPr>
-        <w:ind w:left="432" w:hanging="432"/>
-      </w:pPr>
-      <w:r>
-        <w:rPr>
-          <w:i w:val="0"/>
-        </w:rPr>
-        <w:t>10.</w:t>
-      </w:r>
-      <w:r>
-        <w:rPr>
-          <w:i w:val="0"/>
-        </w:rPr>
-        <w:t xml:space="preserve">Parker, S. R., Welham, S., Paveley, N. D., Foulkes, J. &amp; Scott, R. K. Tolerance of septoria leaf blotch in winter wheat. </w:t>
-      </w:r>
-      <w:r>
-        <w:rPr>
-          <w:i/>
-        </w:rPr>
-        <w:t>Plant Pathology</w:t>
-      </w:r>
-      <w:r>
-        <w:rPr>
-          <w:i w:val="0"/>
-        </w:rPr>
-        <w:t>53</w:t>
-      </w:r>
-      <w:r>
-        <w:rPr>
-          <w:i w:val="0"/>
-        </w:rPr>
-        <w:t>, 1–10 (2004).</w:t>
       </w:r>
     </w:p>
     <w:p>
@@ -985,6 +974,41 @@
         <w:rPr>
           <w:i w:val="0"/>
         </w:rPr>
+        <w:t xml:space="preserve">Bryson, R. J., Paveley, N. D., Clark, W. S., Sylvester-Bradley, R. &amp; Scott, R. K. Use of in-field measurements of green leaf area and incident radiation to estimate the effects of yellow rust epidemics on the yield of winter wheat. </w:t>
+      </w:r>
+      <w:r>
+        <w:rPr>
+          <w:i/>
+        </w:rPr>
+        <w:t>European Journal of Agronomy</w:t>
+      </w:r>
+      <w:r>
+        <w:rPr>
+          <w:i w:val="0"/>
+        </w:rPr>
+        <w:t>7</w:t>
+      </w:r>
+      <w:r>
+        <w:rPr>
+          <w:i w:val="0"/>
+        </w:rPr>
+        <w:t>, 53–62 (1997).</w:t>
+      </w:r>
+    </w:p>
+    <w:p>
+      <w:pPr>
+        <w:ind w:left="432" w:hanging="432"/>
+      </w:pPr>
+      <w:r>
+        <w:rPr>
+          <w:i w:val="0"/>
+        </w:rPr>
+        <w:t>14.</w:t>
+      </w:r>
+      <w:r>
+        <w:rPr>
+          <w:i w:val="0"/>
+        </w:rPr>
         <w:t xml:space="preserve">McDonald, A. J. </w:t>
       </w:r>
       <w:r>
@@ -1026,7 +1050,7 @@
         <w:rPr>
           <w:i w:val="0"/>
         </w:rPr>
-        <w:t>14.</w:t>
+        <w:t>15.</w:t>
       </w:r>
       <w:r>
         <w:rPr>
@@ -1055,7 +1079,7 @@
         <w:rPr>
           <w:i w:val="0"/>
         </w:rPr>
-        <w:t>15.</w:t>
+        <w:t>16.</w:t>
       </w:r>
       <w:r>
         <w:rPr>
@@ -1072,7 +1096,7 @@
         <w:rPr>
           <w:i w:val="0"/>
         </w:rPr>
-        <w:t>16.</w:t>
+        <w:t>17.</w:t>
       </w:r>
       <w:r>
         <w:rPr>
@@ -1089,7 +1113,7 @@
         <w:rPr>
           <w:i w:val="0"/>
         </w:rPr>
-        <w:t>17.</w:t>
+        <w:t>18.</w:t>
       </w:r>
       <w:r>
         <w:rPr>
@@ -1118,7 +1142,7 @@
         <w:rPr>
           <w:i w:val="0"/>
         </w:rPr>
-        <w:t>18.</w:t>
+        <w:t>19.</w:t>
       </w:r>
       <w:r>
         <w:rPr>
@@ -1135,7 +1159,7 @@
         <w:rPr>
           <w:i w:val="0"/>
         </w:rPr>
-        <w:t>19.</w:t>
+        <w:t>20.</w:t>
       </w:r>
       <w:r>
         <w:rPr>
@@ -1152,7 +1176,7 @@
         <w:rPr>
           <w:i w:val="0"/>
         </w:rPr>
-        <w:t>20.</w:t>
+        <w:t>21.</w:t>
       </w:r>
       <w:r>
         <w:rPr>
@@ -1198,7 +1222,7 @@
     </w:p>
     <w:p>
       <w:r>
-        <w:t>Table 1 | Late-century climate impacts across European wheat environmental regions. Values are harvested-area-weighted three-climate-model mean paired changes under SSP5–8.5 in 2071–2100 relative to 1991–2020. Positive HAD and canopy-damage changes indicate greater simulated functional loss; negative timing changes indicate earlier symptoms relative to flowering. Conditional yield change uses the fixed coefficient 0.018 t ha⁻¹ per GLAI-day and a nominal upper-three-leaf reference LAI of one. The yield column reports a disease-related index, not validated harvested yield. Model ranges, exact regional areas and valid-season coverage are supplied in Supplementary Table S13.</w:t>
+        <w:t>Table 1 | Late-century climate impacts across European wheat environmental regions. Values are harvested-area-weighted three-climate-model mean paired changes under SSP5–8.5 in 2071–2100 relative to 1991–2020. Positive normalized HAD-loss and relative HAD-loss changes indicate greater accumulated loss of assumed canopy function; negative timing changes indicate earlier symptoms relative to flowering. Estimated disease-related yield change uses the fixed coefficient 0.018 t ha⁻¹ per GLAI-day and a nominal upper-three-leaf reference LAI of one. The yield column reports a disease-related index, not validated harvested yield. Model ranges, exact regional areas and valid-season coverage are supplied in Supplementary Table S13.</w:t>
       </w:r>
     </w:p>
     <w:tbl>
@@ -1245,7 +1269,7 @@
                 <w:b/>
                 <w:sz w:val="16"/>
               </w:rPr>
-              <w:t>Δ HAD deficit (days / LAI)</w:t>
+              <w:t>Δ normalized HAD loss (days)</w:t>
             </w:r>
           </w:p>
         </w:tc>
@@ -1279,7 +1303,7 @@
                 <w:b/>
                 <w:sz w:val="16"/>
               </w:rPr>
-              <w:t>Δ mean canopy damage (pp)</w:t>
+              <w:t>Δ relative HAD loss (pp)</w:t>
             </w:r>
           </w:p>
         </w:tc>
@@ -1296,7 +1320,7 @@
                 <w:b/>
                 <w:sz w:val="16"/>
               </w:rPr>
-              <w:t>Conditional Δ yield (kg ha⁻¹ / LAI)</w:t>
+              <w:t>Estimated Δ yield (kg ha⁻¹ per unit LAI)</w:t>
             </w:r>
           </w:p>
         </w:tc>
@@ -2128,7 +2152,7 @@
     </w:p>
     <w:p>
       <w:r>
-        <w:t>Figure 1 | Projected changes in Septoria-related canopy damage across European wheat grids. (a–f) Mean changes across three climate models in upper-three-leaf healthy-area-duration (HAD) deficit for two future harvest periods relative to 1991–2020. Each 0.25° pixel represents an independently simulated wheat land-use cell. All panels share discrete symmetric color intervals that retain the full range; positive values indicate greater simulated canopy damage. Changes pair corresponding reference and future harvest-year indices within each climate model and emissions pathway. The fixed SPAM2020 all-wheat mask contains 14,941 cells; 14,932 have the imposed winter-wheat rainfed calendar. Gray wheat pixels have unavailable estimates, and missing seasons remain excluded. Reference leaf area index (LAI) is one for the nominal upper-three-leaf canopy. Spatial aggregation uses fixed harvested-area weights. Climate-model sign agreement and numerical coverage are reported in Supplementary Fig. S19 and Tables S15–S16.</w:t>
+        <w:t>Figure 1 | Projected changes in Septoria-related canopy damage across European wheat-growing areas. (a–f) Three-climate-model mean changes in normalized healthy-area-duration (HAD) loss during flowering to soft dough for two future periods relative to 1991–2020. HAD loss is divided by maximum reference upper-three-leaf LAI and expressed in days. Each 0.25° pixel represents a separately simulated wheat-growing cell. Positive values indicate increasing accumulated canopy damage; negative values indicate decreasing damage. The six maps share a symmetric colour scale. The fixed SPAM2020 all-wheat mask contains 14,941 cells, of which 14,932 have a winter-wheat rainfed calendar. Grey wheat pixels have unavailable estimates. Country and regional summaries use fixed harvested-area weights. Supplementary Fig. S19 shows agreement among climate models.</w:t>
       </w:r>
     </w:p>
     <w:p>
@@ -2174,7 +2198,7 @@
     </w:p>
     <w:p>
       <w:r>
-        <w:t>Figure 2 | Climate effects on disease occurrence, timing and canopy damage. Panels show three-climate-model mean changes under SSP5–8.5 in 2071–2100 relative to 1991–2020. (a) Area-independent grid-season frequency of flag-leaf symptoms before soft dough, expressed as a percentage-point change. (b) First flag-leaf symptom date relative to flowering; negative values indicate earlier disease relative to the crop. (c) Mean simulated functional-canopy loss during grain filling, weighted by daily reference canopy area; this severity proxy differs from observed lesion percentage. (d) First flag-leaf symptoms measured in days after the fixed sowing date; negative changes indicate earlier onset. Each panel has its own labeled symmetric discrete color scale. Timing is conditional on symptom detection in both paired seasons. Gray wheat pixels have unavailable three-model estimates. These quantities describe model responses under fixed management rather than observed disease incidence or validated leaf-level severity.</w:t>
+        <w:t>Figure 2 | Projected changes in Septoria symptoms and canopy damage. Panels show three-model mean changes under SSP5–8.5 in 2071–2100 relative to 1991–2020. (a) Frequency of seasons with flag-leaf symptoms before soft dough. (b) First symptoms relative to flowering; negative changes indicate earlier symptoms. (c) Relative HAD loss, the fraction of reference healthy-area duration lost during grain filling, expressed as a percentage-point change. This modelled loss of canopy function differs from measured lesion percentage. (d) Days from the fixed sowing date to first symptoms; negative changes indicate a shorter interval. Each panel has its own symmetric colour scale. Timing requires symptoms in both paired seasons, whereas frequency includes complete seasons without symptoms. Grey wheat pixels have unavailable estimates.</w:t>
       </w:r>
     </w:p>
     <w:p>
@@ -2220,7 +2244,7 @@
     </w:p>
     <w:p>
       <w:r>
-        <w:t>Figure 3 | Environmental-region and country-level differences in climate impacts. (a) Harvested-area-weighted changes in grain-fill HAD deficit within eight EEA biogeographical regions. (b) Conditional yield changes for the twelve country groups with the largest reference wheat area, selected independently of projected response. Both panels compare 2071–2100 with the corresponding 1991–2020 reference under three emissions pathways. Markers show three-climate-model means and whiskers span the model-specific estimates; these ranges are not confidence intervals. Country assignment follows each cell’s dominant SPAM source-country label and is restricted to the study domain. Conditional yield change equals −0.018 times the HAD-deficit change, converted to kg ha⁻¹ per unit reference LAI; negative values indicate a larger disease-related yield-loss index. Actual yields and country production tonnages are not estimated. All country groups and their coverage remain in Source Data.</w:t>
+        <w:t>Figure 3 | Regional differences in canopy damage and inferred yield response. (a) Harvested-area-weighted changes in normalized HAD loss within eight EEA biogeographical regions. (b) Estimated disease-related yield changes for the twelve countries with the largest reference wheat area within the study domain. Both panels compare 2071–2100 with 1991–2020 under three emissions pathways. Points show three-model means; whiskers span model-specific estimates and are not confidence intervals. Country assignment follows the dominant SPAM source-country label of each cell. The yield estimate uses the change in HAD loss and the fixed coefficient 0.018 t ha⁻¹ per GLAI-day, normalized to unit reference upper-canopy LAI. Negative values indicate increased estimated disease-related yield loss. These estimates require validation of the canopy–yield relationship and do not describe total national production. Source Data includes all country groups.</w:t>
       </w:r>
     </w:p>
     <w:p>
@@ -2232,7 +2256,7 @@
       <w:r>
         <w:drawing>
           <wp:inline xmlns:a="http://schemas.openxmlformats.org/drawingml/2006/main" xmlns:pic="http://schemas.openxmlformats.org/drawingml/2006/picture">
-            <wp:extent cx="5715000" cy="2655497"/>
+            <wp:extent cx="5715000" cy="2622666"/>
             <wp:docPr id="4" name="Picture 4"/>
             <wp:cNvGraphicFramePr>
               <a:graphicFrameLocks noChangeAspect="1"/>
@@ -2253,7 +2277,7 @@
                   <pic:spPr>
                     <a:xfrm>
                       <a:off x="0" y="0"/>
-                      <a:ext cx="5715000" cy="2655497"/>
+                      <a:ext cx="5715000" cy="2622666"/>
                     </a:xfrm>
                     <a:prstGeom prst="rect"/>
                   </pic:spPr>
@@ -2266,7 +2290,7 @@
     </w:p>
     <w:p>
       <w:r>
-        <w:t>Figure 4 | Crop development counteracts the simulated disease-weather contribution. (a) Weather and crop-development Shapley contributions to grain-fill HAD deficit, and their sum, under late-century SSP5–8.5. Gray segments span three climate-model means; colored whiskers indicate one spatial Monte Carlo standard error. The decomposition uses 64 area-proportional spatial draws at 62 cells and 5,731 supported paired seasons; its population differs from the full-grid impact census. The weather–crop interaction is shared equally between contributions and is shown separately in Supplementary Fig. S16. (b) Model-specific percentages of the positive weather contribution offset by crop development. The dashed line marks the ratio of ensemble contributions, 70.6%. These within-model contributions characterize crop–disease alignment and do not quantify the efficacy of a sowing-date or cultivar intervention.</w:t>
+        <w:t>Figure 4 | Wheat development offsets part of the weather contribution to Septoria damage. (a) Weather and wheat-development contributions to normalized HAD loss during grain filling, and their sum, under late-century SSP5–8.5. The analysis uses 64 harvested-area-proportional draws at 62 cells and 5,731 valid season pairs. Grey segments span climate-model means; coloured whiskers show one spatial Monte Carlo standard error. Each Shapley contribution includes half of the weather–development interaction, shown separately in Supplementary Fig. S16. (b) Percentage of the weather contribution offset by wheat development in each climate model. The dashed line shows the ratio of ensemble contributions, 70.6%. These comparisons separate effects within the model; they do not estimate the effectiveness of changing sowing dates or cultivars.</w:t>
       </w:r>
     </w:p>
     <w:sectPr>

</xml_diff>

<commit_message>
Lead title and abstract with climate–disease findings and regional significance
</commit_message>
<xml_diff>
--- a/publication/european_wheat_stb/Manuscript.docx
+++ b/publication/european_wheat_stb/Manuscript.docx
@@ -7,7 +7,7 @@
         <w:pStyle w:val="Title"/>
       </w:pPr>
       <w:r>
-        <w:t>Projected climate impacts on Septoria damage in European wheat</w:t>
+        <w:t>Wheat development partly offsets projected increases in Septoria damage across Europe</w:t>
       </w:r>
     </w:p>
     <w:p>
@@ -35,7 +35,7 @@
     </w:p>
     <w:p>
       <w:r>
-        <w:t>Septoria tritici blotch reduces wheat yield, making its response to climate change important for European food production. How changing climate alters disease damage through wheat development remains uncertain across European growing regions. We linked models of wheat development and Septoria tritici blotch across 14,932 wheat-growing grid cells, using three climate models and three emissions pathways. Under SSP5–8.5 in 2071–2100, healthy-area-duration (HAD) loss normalized to reference leaf area increased by 2.66 days relative to 1991–2020. Regional changes ranged from -1.40 days in the Mediterranean to +7.84 days in the Boreal region. Relative HAD loss increased by 8.04 percentage points. Changes in wheat development offset 71% of the weather contribution in a sampled analysis. The canopy–yield relationship implied a yield change of -47.8 kg ha⁻¹ per unit reference leaf area index. These regional contrasts inform monitoring and adaptation trials, with disease-related yield estimates requiring field validation.</w:t>
+        <w:t>Septoria tritici blotch threatens European wheat production, but its response to climate change depends on both pathogen and crop development. How changes in wheat development modify disease damage across European growing regions remains poorly quantified. We projected regional canopy damage using linked models of wheat development and Septoria disease, with climate projections from three models under three emissions pathways. Under SSP5–8.5 in 2071–2100, normalized healthy-area-duration loss increased by 2.66 days relative to 1991–2020, with increasing damage over 77.3% of reference wheat area. Regional changes ranged from -1.40 days in the Mediterranean to +7.84 days in the Boreal region. Relative healthy-area-duration loss increased by 8.04 percentage points. Wheat development offset an estimated 71% of the increase in canopy damage attributable to weather. These projections identify crop development as a major control on disease damage and reveal contrasting regional priorities for protecting European wheat production.</w:t>
       </w:r>
     </w:p>
     <w:p>
@@ -157,12 +157,12 @@
     </w:p>
     <w:p>
       <w:r>
-        <w:t>Weather and wheat development made opposing contributions to canopy damage under late-century SSP5–8.5 (Fig. 4). In the separate sample of 64 spatial draws at 62 cells, 5,731 valid historical–future season pairs gave a weather contribution of +9.00 days of normalized HAD loss and a wheat-development contribution of −6.36 days, leaving a net +2.64-day change. Crop development offset 70.6% of the weather contribution; the model-specific fractions ranged from 63.6% to 80.3%. All three models showed a positive weather contribution and a negative wheat-development contribution. The sampled net change differs slightly from the full-grid estimate because the analyses use different cells and valid season pairs (Supplementary Tables S12a, b).</w:t>
+        <w:t>Changes in wheat development offset 70.6% of the increase in canopy damage attributable to weather under late-century SSP5–8.5 (Fig. 4). The weather contribution increased normalized HAD loss by 9.00 days, while wheat development reduced it by 6.36 days, giving a net increase of 2.64 days. All three climate models showed these opposing effects, with offsets of 63.6–80.3%. The decomposition uses 5,731 valid season pairs from 62 wheat-growing grid cells. Its net estimate is close to the full-grid increase of 2.66 days, although the two calculations use different sets of cells and valid seasons (Supplementary Tables S12a, b).</w:t>
       </w:r>
     </w:p>
     <w:p>
       <w:r>
-        <w:t>In that diagnostic sample, flowering and soft dough advanced by 26.77 and 26.64 days after sowing, while mean grain-fill duration changed little. The wheat-development contribution combines changing leaf availability with changes in the seasonal weather encountered by those leaves. A −2.78-day weather–crop interaction was allocated equally between the two Shapley contributions. Twenty additional finite pairs were excluded because recombined weather and crop trajectories exceeded the accepted temperature range on an active day (Supplementary Fig. S16).</w:t>
+        <w:t>Flowering and soft dough advanced by 26.77 and 26.64 days after sowing, while mean grain-fill duration changed little. The wheat-development contribution combines changing leaf availability with changes in the seasonal weather encountered by those leaves. A −2.78-day weather–crop interaction was allocated equally between the two Shapley contributions. Twenty additional finite pairs were excluded because recombined weather and crop trajectories exceeded the accepted temperature range on an active day (Supplementary Fig. S16).</w:t>
       </w:r>
     </w:p>
     <w:p>
@@ -172,7 +172,7 @@
     </w:p>
     <w:p>
       <w:r>
-        <w:t>All fourteen tested combinations of model structure, symptom detection and canopy assumptions gave earlier symptoms and increased HAD loss in all three climate models under late-century SSP5–8.5. In this diagnostic sample, mean symptom shifts spanned −5.46 to −1.54 days and HAD increases 0.63–2.80 days. These comparisons describe sensitivity to selected model assumptions and do not cover every source of uncertainty in future disease outbreaks (Supplementary Fig. S15; Supplementary Table S10).</w:t>
+        <w:t>All fourteen tested combinations of model structure, symptom detection and canopy assumptions gave earlier symptoms and increased HAD loss in all three climate models under late-century SSP5–8.5. Across these settings, mean symptom shifts spanned −5.46 to −1.54 days and HAD increases 0.63–2.80 days. These comparisons describe sensitivity to selected model assumptions and do not cover every source of uncertainty in future disease outbreaks (Supplementary Fig. S15; Supplementary Table S10).</w:t>
       </w:r>
     </w:p>
     <w:p>
@@ -224,7 +224,7 @@
     </w:p>
     <w:p>
       <w:r>
-        <w:t xml:space="preserve">For European food-security policy, the practical contribution is a regional framework for testing climate-related disease damage alongside wheat development. Coordinated observations of crop stages, disease symptoms, healthy leaf area and harvested grain would help identify whether adaptation reduces exposure, prevents damage or improves yield tolerance. Resistance and calendar trials across contrasting regions can evaluate these mechanisms under consistent measurement definitions. The simulations alone do not establish the effectiveness of a specific intervention or quantify Europe-wide food-security outcomes. </w:t>
+        <w:t xml:space="preserve">Regional adaptation assessments for European wheat need to consider disease resistance alongside crop development and canopy persistence. Coordinated observations of crop stages, disease symptoms, healthy leaf area and harvested grain would help identify whether adaptation reduces exposure, prevents damage or improves yield tolerance. Resistance and calendar trials across contrasting regions can evaluate these mechanisms under consistent measurement definitions. Intervention effectiveness and effects on production require validation in field trials. </w:t>
       </w:r>
       <w:r>
         <w:rPr>

</xml_diff>

<commit_message>
Clarify wheat phenology and disease-induced healthy-area loss
</commit_message>
<xml_diff>
--- a/publication/european_wheat_stb/Manuscript.docx
+++ b/publication/european_wheat_stb/Manuscript.docx
@@ -7,7 +7,7 @@
         <w:pStyle w:val="Title"/>
       </w:pPr>
       <w:r>
-        <w:t>Wheat development partly offsets projected increases in Septoria damage across Europe</w:t>
+        <w:t>Wheat phenology partly offsets projected increases in Septoria damage across Europe</w:t>
       </w:r>
     </w:p>
     <w:p>
@@ -35,7 +35,7 @@
     </w:p>
     <w:p>
       <w:r>
-        <w:t>Septoria tritici blotch threatens European wheat production, but its response to climate change depends on both pathogen and crop development. How changes in wheat development modify disease damage across European growing regions remains poorly quantified. We projected regional canopy damage using linked models of wheat development and Septoria disease, with climate projections from three models under three emissions pathways. Under SSP5–8.5 in 2071–2100, normalized healthy-area-duration loss increased by 2.66 days relative to 1991–2020, with increasing damage over 77.3% of reference wheat area. Regional changes ranged from -1.40 days in the Mediterranean to +7.84 days in the Boreal region. Relative healthy-area-duration loss increased by 8.04 percentage points. Wheat development offset an estimated 71% of the increase in canopy damage attributable to weather. These projections identify crop development as a major control on disease damage and reveal contrasting regional priorities for protecting European wheat production.</w:t>
+        <w:t>Septoria tritici blotch threatens European wheat production as climate change alters conditions for disease. How shifts in leaf emergence, flowering and grain filling modify future disease damage remains poorly quantified. We linked wheat phenology and Septoria disease models to project canopy damage across Europe using three climate models and three emissions pathways. Under SSP5–8.5 in 2071–2100, normalized loss of healthy-area duration during grain filling increased by 2.66 days relative to 1991–2020, with greater damage across 77.3% of reference wheat area. Regional changes ranged from -1.40 days in the Mediterranean to +7.84 days in the Boreal region. The fraction of healthy-area duration lost increased by 8.04 percentage points. Shifts in wheat phenology offset an estimated 71% of the increase in canopy damage attributable to weather. These projections show that crop timing strongly modifies climate-driven disease damage, with contrasting regional priorities for protecting European wheat production.</w:t>
       </w:r>
     </w:p>
     <w:p>
@@ -54,7 +54,7 @@
     </w:p>
     <w:p>
       <w:r>
-        <w:t xml:space="preserve">Weather favourable for infection does not by itself determine yield loss. Wheat development controls when leaves emerge and when grain filling occurs; disease development determines when those leaves become damaged. A shift in either process changes the amount of healthy canopy available during grain filling. Climate assessments based only on infection conditions can therefore miss changes in the timing of damage relative to crop development. </w:t>
+        <w:t xml:space="preserve">Weather favourable for infection does not by itself determine yield loss. Wheat phenology, including the timing of upper-leaf emergence, flowering and grain filling, determines which leaves are exposed and when they support grain growth. Disease progression determines when those leaves become damaged. A shift in either process changes the amount of healthy canopy available during grain filling. Climate assessments based only on infection conditions can therefore miss changes in the timing of damage relative to crop phenology. </w:t>
       </w:r>
       <w:r>
         <w:rPr>
@@ -76,7 +76,7 @@
     </w:p>
     <w:p>
       <w:r>
-        <w:t>The unresolved question is how climate effects on wheat development modify Septoria damage across European growing regions. A linked wheat-development and disease model quantifies changes in symptoms and canopy damage across the complete wheat land-use grid under three emissions pathways. Environmental-region and country summaries describe where these changes occur. A separate analysis distinguishes weather effects on disease from the effects of changing wheat development. Published canopy–yield relationships provide conditional estimates of the disease-related component of yield change, while field observations establish the limits of model prediction accuracy.</w:t>
+        <w:t>The unresolved question is how climate effects on wheat phenology modify Septoria damage across European growing regions. A linked wheat-phenology and disease model quantifies changes in symptoms and canopy damage across the complete wheat land-use grid under three emissions pathways. Environmental-region and country summaries describe where these changes occur. A separate analysis distinguishes weather effects on disease from the effects of changing wheat phenology. Published canopy–yield relationships provide conditional estimates of the disease-related component of yield change, while field observations establish the limits of model prediction accuracy.</w:t>
       </w:r>
     </w:p>
     <w:p>
@@ -91,7 +91,7 @@
     </w:p>
     <w:p>
       <w:r>
-        <w:t>Projected Septoria-related canopy damage varied across European wheat-growing grids and emissions pathways (Fig. 1). By 2071–2100, the harvested-area-weighted normalized healthy-area-duration (HAD) loss changed by +1.45, +1.55 and +2.66 days under SSP1–2.6, SSP2–4.5 and SSP5–8.5, respectively, relative to 1991–2020. The corresponding mid-century changes were +1.11, +0.77 and +1.53 days. Normalized HAD loss is the loss of healthy leaf area over time divided by maximum reference upper-canopy leaf area index (LAI), with units of days. Larger values indicate greater accumulated damage. The averages combine areas of increasing and declining damage (Supplementary Table S9).</w:t>
+        <w:t>Projected Septoria-related canopy damage varied across European wheat-growing grids and emissions pathways (Fig. 1). By 2071–2100, the harvested-area-weighted normalized disease-induced loss of healthy-area duration (HAD) changed by +1.45, +1.55 and +2.66 days under SSP1–2.6, SSP2–4.5 and SSP5–8.5, respectively, relative to 1991–2020. The corresponding mid-century changes were +1.11, +0.77 and +1.53 days. Normalized HAD loss is the time-integrated loss of healthy leaf area divided by maximum reference upper-canopy leaf area index (LAI), expressed as equivalent days of reference canopy function lost to disease. Larger values indicate greater accumulated damage. The averages combine areas of increasing and declining damage (Supplementary Table S9).</w:t>
       </w:r>
     </w:p>
     <w:p>
@@ -111,7 +111,7 @@
     </w:p>
     <w:p>
       <w:r>
-        <w:t>Flag-leaf symptoms appeared 3.46 days earlier relative to flowering, with model-specific changes of -6.02 to -1.57 days. The interval from the fixed sowing date to first symptoms shortened by 30.78 days, spanning -45.39 to -18.74 days across climate models (Fig. 2b, d). Flag-leaf symptoms were present during 97.37% of grain-fill days in 1991–2020 and 97.42% in the future. The number of grain-fill days with symptoms changed by +0.24 days, alongside a +0.25-day change in the flowering-to-soft-dough interval. The large advance in symptoms after sowing accompanied earlier wheat development, with little change in the duration of grain filling. Timing estimates include symptoms detected in both paired seasons; frequency estimates also include complete seasons without symptoms (Supplementary Figs. S12 and S14).</w:t>
+        <w:t>Flag-leaf symptoms appeared 3.46 days earlier relative to flowering, with model-specific changes of -6.02 to -1.57 days. The interval from the fixed sowing date to first symptoms shortened by 30.78 days, spanning -45.39 to -18.74 days across climate models (Fig. 2b, d). Flag-leaf symptoms were present during 97.37% of grain-fill days in 1991–2020 and 97.42% in the future. The number of grain-fill days with symptoms changed by +0.24 days, alongside a +0.25-day change in the flowering-to-soft-dough interval. The large advance in symptoms after sowing accompanied earlier flowering and soft dough, with little change in the duration of grain filling. Timing estimates include symptoms detected in both paired seasons; frequency estimates also include complete seasons without symptoms (Supplementary Figs. S12 and S14).</w:t>
       </w:r>
     </w:p>
     <w:p>
@@ -152,17 +152,17 @@
     </w:p>
     <w:p>
       <w:r>
-        <w:t>Wheat development offsets part of the increase in disease damage</w:t>
+        <w:t>Wheat phenology offsets part of the increase in disease damage</w:t>
       </w:r>
     </w:p>
     <w:p>
       <w:r>
-        <w:t>Changes in wheat development offset 70.6% of the increase in canopy damage attributable to weather under late-century SSP5–8.5 (Fig. 4). The weather contribution increased normalized HAD loss by 9.00 days, while wheat development reduced it by 6.36 days, giving a net increase of 2.64 days. All three climate models showed these opposing effects, with offsets of 63.6–80.3%. The decomposition uses 5,731 valid season pairs from 62 wheat-growing grid cells. Its net estimate is close to the full-grid increase of 2.66 days, although the two calculations use different sets of cells and valid seasons (Supplementary Tables S12a, b).</w:t>
+        <w:t>Changes in wheat phenology offset 70.6% of the increase in canopy damage attributable to weather under late-century SSP5–8.5 (Fig. 4). The weather contribution increased normalized HAD loss by 9.00 days, while wheat phenology reduced it by 6.36 days, giving a net increase of 2.64 days. All three climate models showed these opposing effects, with offsets of 63.6–80.3%. The decomposition uses 5,731 valid season pairs from 62 wheat-growing grid cells. Its net estimate is close to the full-grid increase of 2.66 days, although the two calculations use different sets of cells and valid seasons (Supplementary Tables S12a, b).</w:t>
       </w:r>
     </w:p>
     <w:p>
       <w:r>
-        <w:t>Flowering and soft dough advanced by 26.77 and 26.64 days after sowing, while mean grain-fill duration changed little. The wheat-development contribution combines changing leaf availability with changes in the seasonal weather encountered by those leaves. A −2.78-day weather–crop interaction was allocated equally between the two Shapley contributions. Twenty additional finite pairs were excluded because recombined weather and crop trajectories exceeded the accepted temperature range on an active day (Supplementary Fig. S16).</w:t>
+        <w:t>Flowering and soft dough advanced by 26.77 and 26.64 days after sowing, while mean grain-fill duration changed little. The wheat-phenology contribution combines changes in upper-leaf appearance and unfolding with shifts in flowering and soft-dough dates. These changes alter leaf availability and the seasonal weather experienced by the upper canopy. A −2.78-day weather–crop interaction was allocated equally between the two Shapley contributions. Twenty additional finite pairs were excluded because recombined weather and crop trajectories exceeded the accepted temperature range on an active day (Supplementary Fig. S16).</w:t>
       </w:r>
     </w:p>
     <w:p>
@@ -187,12 +187,12 @@
     </w:p>
     <w:p>
       <w:r>
-        <w:t>The simulations project increasing average Septoria damage across European wheat-growing areas, alongside decreases in some regions. These differences arise from weather effects on disease combined with changes in wheat development. Because symptoms were predicted in almost every season, symptom presence alone was a weak measure of the projected change. The timing of symptoms and the amount of healthy canopy lost during grain filling provided more information about the modelled disease impact.</w:t>
+        <w:t>The simulations project increasing average Septoria damage across European wheat-growing areas, alongside decreases in some regions. These differences arise from weather effects on disease combined with changes in wheat phenology. Because symptoms were predicted in almost every season, symptom presence alone was a weak measure of the projected change. The timing of symptoms and the amount of healthy canopy lost during grain filling provided more information about the modelled disease impact.</w:t>
       </w:r>
     </w:p>
     <w:p>
       <w:r>
-        <w:t xml:space="preserve">The analysis links three processes: weather affects wheat development and disease progression; wheat development determines the leaves and seasonal conditions available to the disease; and disease damage reduces the assumed healthy canopy contributing to grain filling. The opposing weather and development contributions show why favourable infection conditions do not translate directly into proportional increases in canopy damage. The crop–disease interaction is represented through leaf availability and timing. Disease damage is converted to a yield estimate after simulation, while disease feedback on wheat development and a complete crop carbon balance are absent. These distinctions separate the projected disease component from the total effect of climate change on wheat production. </w:t>
+        <w:t xml:space="preserve">The analysis links three processes: weather affects wheat phenology and disease progression; wheat phenology determines the leaves and seasonal conditions available to the disease; and disease damage reduces the assumed healthy canopy contributing to grain filling. The opposing weather and phenology contributions show why favourable infection conditions do not translate directly into proportional increases in canopy damage. The crop–disease interaction is represented through leaf availability and timing. Disease damage is converted to a yield estimate after simulation, while disease feedback on wheat phenology and a complete crop carbon balance are absent. These distinctions separate the projected disease component from the total effect of climate change on wheat production. </w:t>
       </w:r>
       <w:r>
         <w:rPr>
@@ -224,7 +224,7 @@
     </w:p>
     <w:p>
       <w:r>
-        <w:t xml:space="preserve">Regional adaptation assessments for European wheat need to consider disease resistance alongside crop development and canopy persistence. Coordinated observations of crop stages, disease symptoms, healthy leaf area and harvested grain would help identify whether adaptation reduces exposure, prevents damage or improves yield tolerance. Resistance and calendar trials across contrasting regions can evaluate these mechanisms under consistent measurement definitions. Intervention effectiveness and effects on production require validation in field trials. </w:t>
+        <w:t xml:space="preserve">Regional adaptation assessments for European wheat need to consider disease resistance alongside crop phenology and canopy persistence. Coordinated observations of crop stages, disease symptoms, healthy leaf area and harvested grain would help identify whether adaptation reduces exposure, prevents damage or improves yield tolerance. Resistance and calendar trials across contrasting regions can evaluate these mechanisms under consistent measurement definitions. Intervention effectiveness and effects on production require validation in field trials. </w:t>
       </w:r>
       <w:r>
         <w:rPr>
@@ -272,12 +272,12 @@
     </w:p>
     <w:p>
       <w:r>
-        <w:t>Linking wheat development to Septoria disease</w:t>
+        <w:t>Linking wheat phenology to Septoria disease</w:t>
       </w:r>
     </w:p>
     <w:p>
       <w:r>
-        <w:t xml:space="preserve">A temperature–photoperiod–vernalization model calculates wheat development from sowing to soft dough. Additional ordered developmental thresholds determine upper-leaf appearance and unfolding, and a calibrated flowering threshold defines the start of the grain-filling interval. These crop trajectories determine which leaves are available to infection and the seasonal weather experienced by each leaf. The Septoria module calculates disease establishment, progression and visible damage using weather and these leaf trajectories. Disease damage does not alter the calculated crop-development trajectory. Model equations, parameter sources and observation definitions appear in the supplementary model specification and the 84-entry parameter inventory. </w:t>
+        <w:t xml:space="preserve">A temperature–photoperiod–vernalization model calculates wheat phenological stages from sowing to soft dough. Additional ordered developmental thresholds determine upper-leaf appearance and unfolding, and a calibrated flowering threshold defines the start of the grain-filling interval. These crop trajectories determine which leaves are available to infection and the seasonal weather experienced by each leaf. The Septoria module calculates disease establishment, progression and visible damage using weather and these leaf trajectories. Disease damage does not alter the calculated crop-development trajectory. Model equations, parameter sources and observation definitions appear in the supplementary model specification and the 84-entry parameter inventory. </w:t>
       </w:r>
       <w:r>
         <w:rPr>
@@ -303,7 +303,13 @@
     </w:p>
     <w:p>
       <w:r>
-        <w:t>The disease-damage fraction after symptom detection is treated as the fraction of reference leaf area that has lost function. This assumption connects modelled disease to canopy damage. HAD loss integrates this fraction multiplied by daily reference leaf area across the flag leaf and two leaves below it. The primary interval is flowering to soft dough (GS65–85), with GS31–85 used for sensitivity analysis. Unnormalized HAD has units of green leaf area index multiplied by days (GLAI-days). Normalized HAD loss divides it by maximum reference upper-canopy LAI and has units of days. With reference LAI equal to one, normalization leaves numerical values unchanged. Relative HAD loss is HAD loss divided by reference HAD, expressed as a percentage; it describes average accumulated canopy-function loss, not instantaneous lesion percentage.</w:t>
+        <w:t xml:space="preserve">The disease-damage fraction after symptom detection is treated as the fraction of reference leaf area that has lost function. This assumption connects modelled disease to canopy damage. HAD loss integrates this fraction multiplied by daily reference leaf area across the flag leaf and two leaves below it. The primary interval is flowering to soft dough (GS65–85), with GS31–85 used for sensitivity analysis. HAD and disease-induced HAD loss have units of green leaf area index multiplied by days (GLAI-days). Normalized HAD loss divides the time-integrated functional loss by maximum reference upper-canopy LAI and expresses it as equivalent days of reference canopy function lost. With reference LAI equal to one, normalization leaves numerical values unchanged. Relative HAD loss is HAD loss divided by reference HAD, expressed as a percentage; it describes average accumulated canopy-function loss, not instantaneous lesion percentage. </w:t>
+      </w:r>
+      <w:r>
+        <w:rPr>
+          <w:vertAlign w:val="superscript"/>
+        </w:rPr>
+        <w:t>[2, 12]</w:t>
       </w:r>
     </w:p>
     <w:p>
@@ -350,17 +356,17 @@
     </w:p>
     <w:p>
       <w:r>
-        <w:t>Separating weather and wheat-development effects</w:t>
+        <w:t>Separating weather and wheat-phenology effects</w:t>
       </w:r>
     </w:p>
     <w:p>
       <w:r>
-        <w:t>The decomposition and fourteen-setting sensitivity analysis use 64 harvested-area-proportional draws at 62 unique cells. Four simulations combine historical or future disease weather with historical or future wheat-development trajectories. Their differences separate weather and wheat-development contributions, with one half of their interaction allocated to each Shapley contribution. Of 5,751 finite historical–future pairs, 20 have an active day outside the accepted temperature range in a recombined trajectory and are excluded, leaving 5,731 pairs. Spatial Monte Carlo standard errors apply to this sample and are separate from full-grid climate estimates.</w:t>
+        <w:t>The decomposition and fourteen-setting sensitivity analysis use 64 harvested-area-proportional draws at 62 unique cells. Four simulations combine historical or future disease weather with historical or future wheat-phenology trajectories. Their differences separate weather and wheat-phenology contributions, with one half of their interaction allocated to each Shapley contribution. Of 5,751 finite historical–future pairs, 20 have an active day outside the accepted temperature range in a recombined trajectory and are excluded, leaving 5,731 pairs. Spatial Monte Carlo standard errors apply to this sample and are separate from full-grid climate estimates.</w:t>
       </w:r>
     </w:p>
     <w:p>
       <w:r>
-        <w:t>The development offset is −100 times the development contribution divided by the weather contribution, using identical valid pairs. The ensemble percentage is the ratio of three-model mean contributions. Sensitivity settings vary model structure, symptom detection, reference canopy area and damage-to-function conversion. These calculations assess model assumptions and do not represent trials of a sowing-date or cultivar intervention.</w:t>
+        <w:t>The phenology offset is −100 times the phenology contribution divided by the weather contribution, using identical valid pairs. The ensemble percentage is the ratio of three-model mean contributions. Sensitivity settings vary model structure, symptom detection, reference canopy area and damage-to-function conversion. These calculations assess model assumptions and do not represent trials of a sowing-date or cultivar intervention.</w:t>
       </w:r>
     </w:p>
     <w:p>
@@ -386,7 +392,7 @@
     </w:p>
     <w:p>
       <w:r>
-        <w:t xml:space="preserve">Wheat development is evaluated on 40,878 matched events from German stations held out of calibration, at BBCH 10, 31, 51 and 85. Added leaf stages use pooled field observation intervals, with calibration observations reported separately. Evaluation of the canopy–yield relationship uses eight published treatment-mean contrasts across five genetic backgrounds, including STB, yellow rust and mixed disease. Leaving each background out of fitting gives backgrounds equal evaluation weight. Severity-based yield models use their specified held-out trial or year comparisons and corresponding training-mean benchmarks. </w:t>
+        <w:t xml:space="preserve">Wheat phenological stage dates are evaluated on 40,878 matched events from German stations held out of calibration, at BBCH 10, 31, 51 and 85. Added leaf stages use pooled field observation intervals, with calibration observations reported separately. Evaluation of the canopy–yield relationship uses eight published treatment-mean contrasts across five genetic backgrounds, including STB, yellow rust and mixed disease. Leaving each background out of fitting gives backgrounds equal evaluation weight. Severity-based yield models use their specified held-out trial or year comparisons and corresponding training-mean benchmarks. </w:t>
       </w:r>
       <w:r>
         <w:rPr>
@@ -2152,7 +2158,7 @@
     </w:p>
     <w:p>
       <w:r>
-        <w:t>Figure 1 | Projected changes in Septoria-related canopy damage across European wheat-growing areas. (a–f) Three-climate-model mean changes in normalized healthy-area-duration (HAD) loss during flowering to soft dough for two future periods relative to 1991–2020. HAD loss is divided by maximum reference upper-three-leaf LAI and expressed in days. Each 0.25° pixel represents a separately simulated wheat-growing cell. Positive values indicate increasing accumulated canopy damage; negative values indicate decreasing damage. The six maps share a symmetric colour scale. The fixed SPAM2020 all-wheat mask contains 14,941 cells, of which 14,932 have a winter-wheat rainfed calendar. Grey wheat pixels have unavailable estimates. Country and regional summaries use fixed harvested-area weights. Supplementary Fig. S19 shows agreement among climate models.</w:t>
+        <w:t>Figure 1 | Projected changes in Septoria-related canopy damage across European wheat-growing areas. (a–f) Three-climate-model mean changes in normalized loss of healthy-area duration (HAD) during flowering to soft dough for two future periods relative to 1991–2020. HAD loss is divided by maximum reference upper-three-leaf LAI and expressed in days. Each 0.25° pixel represents a separately simulated wheat-growing cell. Positive values indicate increasing accumulated canopy damage; negative values indicate decreasing damage. The six maps share a symmetric colour scale. The fixed SPAM2020 all-wheat mask contains 14,941 cells, of which 14,932 have a winter-wheat rainfed calendar. Grey wheat pixels have unavailable estimates. Country and regional summaries use fixed harvested-area weights. Supplementary Fig. S19 shows agreement among climate models.</w:t>
       </w:r>
     </w:p>
     <w:p>
@@ -2256,7 +2262,7 @@
       <w:r>
         <w:drawing>
           <wp:inline xmlns:a="http://schemas.openxmlformats.org/drawingml/2006/main" xmlns:pic="http://schemas.openxmlformats.org/drawingml/2006/picture">
-            <wp:extent cx="5715000" cy="2622666"/>
+            <wp:extent cx="5715000" cy="2679172"/>
             <wp:docPr id="4" name="Picture 4"/>
             <wp:cNvGraphicFramePr>
               <a:graphicFrameLocks noChangeAspect="1"/>
@@ -2277,7 +2283,7 @@
                   <pic:spPr>
                     <a:xfrm>
                       <a:off x="0" y="0"/>
-                      <a:ext cx="5715000" cy="2622666"/>
+                      <a:ext cx="5715000" cy="2679172"/>
                     </a:xfrm>
                     <a:prstGeom prst="rect"/>
                   </pic:spPr>
@@ -2290,7 +2296,7 @@
     </w:p>
     <w:p>
       <w:r>
-        <w:t>Figure 4 | Wheat development offsets part of the weather contribution to Septoria damage. (a) Weather and wheat-development contributions to normalized HAD loss during grain filling, and their sum, under late-century SSP5–8.5. The analysis uses 64 harvested-area-proportional draws at 62 cells and 5,731 valid season pairs. Grey segments span climate-model means; coloured whiskers show one spatial Monte Carlo standard error. Each Shapley contribution includes half of the weather–development interaction, shown separately in Supplementary Fig. S16. (b) Percentage of the weather contribution offset by wheat development in each climate model. The dashed line shows the ratio of ensemble contributions, 70.6%. These comparisons separate effects within the model; they do not estimate the effectiveness of changing sowing dates or cultivars.</w:t>
+        <w:t>Figure 4 | Wheat phenology offsets part of the weather contribution to Septoria damage. (a) Weather and wheat-phenology contributions to normalized HAD loss during grain filling, and their sum, under late-century SSP5–8.5. The phenology contribution includes changes in upper-leaf appearance and unfolding and the flowering-to-soft-dough interval. The analysis uses 64 harvested-area-proportional draws at 62 cells and 5,731 valid season pairs. Grey segments span climate-model means; coloured whiskers show one spatial Monte Carlo standard error. Each Shapley contribution includes half of the weather–phenology interaction, shown separately in Supplementary Fig. S16. (b) Percentage of the weather contribution offset by wheat phenology in each climate model. The dashed line shows the ratio of ensemble contributions, 70.6%. These comparisons separate effects within the model; they do not estimate the effectiveness of changing sowing dates or cultivars.</w:t>
       </w:r>
     </w:p>
     <w:sectPr>

</xml_diff>

<commit_message>
Prepare public research release and remove superseded artifacts
</commit_message>
<xml_diff>
--- a/publication/european_wheat_stb/Manuscript.docx
+++ b/publication/european_wheat_stb/Manuscript.docx
@@ -7,7 +7,7 @@
         <w:pStyle w:val="Title"/>
       </w:pPr>
       <w:r>
-        <w:t>Wheat phenology partly offsets projected increases in Septoria damage across Europe</w:t>
+        <w:t>Climate change reshapes Septoria tritici blotch damage across European wheat-growing regions</w:t>
       </w:r>
     </w:p>
     <w:p>
@@ -418,7 +418,7 @@
     </w:p>
     <w:p>
       <w:r>
-        <w:t xml:space="preserve">Dataset references identify the public disease archives, NEX-GDDP-CMIP6v2 climate data, GGCMI calendars, SPAM2020 wheat area and EEA environmental boundaries. Source_Data.xlsx contains completed grid summaries, environmental-region and country statistics, area shares by direction of change, pooled field evaluation and published canopy–yield evidence. Original labels and assessment definitions remain in the underlying records. </w:t>
+        <w:t xml:space="preserve">Source data and numerical evidence supporting the findings are publicly available at https://github.com/SmartAG-Team/paper_cc_impact_wheat_disease, with the manuscript-specific files in publication/european_wheat_stb. Dataset references identify the public disease archives, NEX-GDDP-CMIP6v2 climate data, GGCMI calendars, SPAM2020 wheat area and EEA environmental boundaries. Source_Data.xlsx contains completed grid summaries, environmental-region and country statistics, area shares by direction of change, pooled field evaluation and published canopy–yield evidence. Original labels and assessment definitions remain in the underlying records. </w:t>
       </w:r>
       <w:r>
         <w:rPr>
@@ -429,7 +429,7 @@
     </w:p>
     <w:p>
       <w:r>
-        <w:t>The software archive includes completed summaries, selected diagnostic outputs, input and output hashes, and numerical evidence for document regeneration. The complete raw climate and annual-output archives are external because of their size. Model reruns require the recorded climate products and adjustment files. Raw plot observations and physiological measurements unavailable in the source studies are not reconstructed.</w:t>
+        <w:t>The repository includes completed summaries, selected diagnostic outputs, input and output hashes, and numerical evidence for document regeneration. The complete raw climate and annual-output archives are external because of their size. Model reruns require the recorded climate products and adjustment files. Raw plot observations and physiological measurements unavailable in the source studies are not reconstructed.</w:t>
       </w:r>
     </w:p>
     <w:p>
@@ -439,7 +439,7 @@
     </w:p>
     <w:p>
       <w:r>
-        <w:t>Software_and_Evidence.zip contains simulation, statistical-analysis and document-generation code with evidence manifests. REPRODUCIBILITY.txt documents regeneration and model-rerun requirements. The supplementary model specification contains 29 numbered equations, and Parameter_inventory.csv records 84 fixed, fitted and scenario quantities. The working Git Hub repository is private pending publication.</w:t>
+        <w:t>Simulation, statistical-analysis and document-generation code are publicly available at https://github.com/SmartAG-Team/paper_cc_impact_wheat_disease. The repository includes the accompanying evidence manifests. REPRODUCIBILITY.txt documents regeneration and model-rerun requirements. The supplementary model specification contains 29 numbered equations, and Parameter_inventory.csv records 84 fixed, fitted and scenario quantities.</w:t>
       </w:r>
     </w:p>
     <w:p>

</xml_diff>

<commit_message>
Validate disease-associated yield responses with expanded field evidence
</commit_message>
<xml_diff>
--- a/publication/european_wheat_stb/Manuscript.docx
+++ b/publication/european_wheat_stb/Manuscript.docx
@@ -7,7 +7,7 @@
         <w:pStyle w:val="Title"/>
       </w:pPr>
       <w:r>
-        <w:t>Climate change reshapes Septoria tritici blotch damage across European wheat-growing regions</w:t>
+        <w:t>Wheat phenology partly offsets projected increases in Septoria damage across Europe</w:t>
       </w:r>
     </w:p>
     <w:p>
@@ -141,13 +141,35 @@
     </w:p>
     <w:p>
       <w:r>
-        <w:t xml:space="preserve">Evaluation of the canopy–yield relationship showed limited prediction accuracy across genetic backgrounds. Eight treatment-mean contrasts across five genetic backgrounds gave leave-one-background-out relative-yield RMSE of 5.16 percentage points and R² of 0.247, but absolute-yield RMSE of 0.617 t ha⁻¹ and R² of −0.432. Two contrasts concerned STB alone; the other six involved yellow rust or mixed diseases. Models based on disease severity also had larger errors than their training-mean benchmarks. The grid estimates provide a disease-related yield index under specified assumptions. Total wheat yield and national production changes require additional crop-yield modelling and validation (Supplementary Figs. S9–S11; Supplementary Tables S5–S8). </w:t>
+        <w:t xml:space="preserve">Evaluation of the canopy–yield relationship showed limited prediction accuracy across genetic backgrounds. Eight treatment-mean contrasts across five genetic backgrounds gave leave-one-background-out relative-yield RMSE of 5.16 percentage points and R² of 0.247, but absolute-yield RMSE of 0.617 t ha⁻¹ and R² of −0.432. Two contrasts concerned STB alone; the other six involved yellow rust or mixed diseases. The grid estimates provide a disease-related yield index under specified assumptions. Total wheat yield and national production changes require additional crop-yield modelling and validation (Supplementary Figs. S9–S11; Supplementary Tables S5–S8). </w:t>
       </w:r>
       <w:r>
         <w:rPr>
           <w:vertAlign w:val="superscript"/>
         </w:rPr>
         <w:t>[2, 11]</w:t>
+      </w:r>
+    </w:p>
+    <w:p>
+      <w:r>
+        <w:t xml:space="preserve">Severity-based yield responses transfer poorly across field environments. In five Nordic trials, 62 treated–untreated contrasts gave trial-held-out RMSE of 4.83 percentage points for severity regression and 5.02 for the training mean. Adding assessment stage reduced error to 3.99 points in the four-trial subset with recorded stages, but the paired difference interval included zero and three of four conditional severity slopes opposed a monotone damage response. In Tunisia, flag- and lower-leaf severity gave cross-year yield RMSE of 3.32 t ha⁻¹, compared with 3.24 for the training mean across 82 plot-season yields (Supplementary Figs. S22 and S23; Supplementary Tables S17–S19). </w:t>
+      </w:r>
+      <w:r>
+        <w:rPr>
+          <w:vertAlign w:val="superscript"/>
+        </w:rPr>
+        <w:t>[14, 15]</w:t>
+      </w:r>
+    </w:p>
+    <w:p>
+      <w:r>
+        <w:t xml:space="preserve">German field data provided a broader test across 3,264 cultivar–management comparisons in 16 site-years at five locations. Endpoint Septoria severity had geographic-site-held-out yield-response RMSE of 18.51 percentage points, compared with 18.48 for the training mean. Nitrogen and water regime reduced forward-transfer error from 19.56 to 17.55 points; adding severity changed it to 17.51 points. These responses concerned protection against multiple diseases. Endpoint severity supplied little additional predictive information beyond crop management, and none of the field comparisons validated the conversion from simulated HAD loss to grain yield (Supplementary Fig. S24; Supplementary Table S20). </w:t>
+      </w:r>
+      <w:r>
+        <w:rPr>
+          <w:vertAlign w:val="superscript"/>
+        </w:rPr>
+        <w:t>[16]</w:t>
       </w:r>
     </w:p>
     <w:p>
@@ -219,6 +241,17 @@
     </w:p>
     <w:p>
       <w:r>
+        <w:t xml:space="preserve">A physiological yield calculation requires crop condition as well as disease severity. Layer-specific green leaf area determines light interception, while grain formation depends on pre-anthesis reserves, grain number and assimilate supply during grain filling. Published damage frameworks represent these pathways within crop-growth models, including WOFOST and DSSAT formulations. The field comparisons support this distinction: lower regression error alone does not establish a physiological loss function, and observations without compatible leaf area and timing cannot identify its parameters. Crop-growth calibration and evaluation of disease-related yield loss require separate field environments. </w:t>
+      </w:r>
+      <w:r>
+        <w:rPr>
+          <w:vertAlign w:val="superscript"/>
+        </w:rPr>
+        <w:t>[17, 18, 19]</w:t>
+      </w:r>
+    </w:p>
+    <w:p>
+      <w:r>
         <w:t>Disease-model performance adds substantial uncertainty. The model had greater symptom-onset error than the phenology benchmark and underestimated measured disease severity. High symptom-detection sensitivity with low specificity is consistent with the near-universal symptom occurrence in the simulations. Added developmental stages, including the end of the grain-filling interval, have limited informative field observations. Agreement among climate models cannot establish epidemic prediction accuracy. Reconstructed humidity, fixed inoculum assumptions, cultivar resistance and future pathogen adaptation also affect the applicability of the projected changes.</w:t>
       </w:r>
     </w:p>
@@ -230,7 +263,7 @@
         <w:rPr>
           <w:vertAlign w:val="superscript"/>
         </w:rPr>
-        <w:t>[14, 15]</w:t>
+        <w:t>[20, 21]</w:t>
       </w:r>
     </w:p>
     <w:p>
@@ -251,7 +284,7 @@
         <w:rPr>
           <w:vertAlign w:val="superscript"/>
         </w:rPr>
-        <w:t>[16, 17]</w:t>
+        <w:t>[22, 23]</w:t>
       </w:r>
     </w:p>
     <w:p>
@@ -262,7 +295,7 @@
         <w:rPr>
           <w:vertAlign w:val="superscript"/>
         </w:rPr>
-        <w:t>[18]</w:t>
+        <w:t>[24]</w:t>
       </w:r>
     </w:p>
     <w:p>
@@ -314,6 +347,17 @@
     </w:p>
     <w:p>
       <w:r>
+        <w:t xml:space="preserve">Flowering provides a reference for grain filling rather than the start of disease simulation or a universal crop-protection threshold. Disease calculations begin during crop establishment and include upper-leaf appearance and unfolding before flowering. Stem extension and upper-leaf emergence define earlier exposure relevant to canopy protection. The GS65–85 integral describes grain-filling canopy damage; it does not quantify every effect of pre-flowering disease on grain number or assimilate reserves. </w:t>
+      </w:r>
+      <w:r>
+        <w:rPr>
+          <w:vertAlign w:val="superscript"/>
+        </w:rPr>
+        <w:t>[2, 17]</w:t>
+      </w:r>
+    </w:p>
+    <w:p>
+      <w:r>
         <w:t>Historical–future comparisons and spatial summaries</w:t>
       </w:r>
     </w:p>
@@ -330,7 +374,7 @@
         <w:rPr>
           <w:vertAlign w:val="superscript"/>
         </w:rPr>
-        <w:t>[19]</w:t>
+        <w:t>[25]</w:t>
       </w:r>
     </w:p>
     <w:p>
@@ -382,7 +426,7 @@
         <w:rPr>
           <w:vertAlign w:val="superscript"/>
         </w:rPr>
-        <w:t>[20, 21]</w:t>
+        <w:t>[26, 27]</w:t>
       </w:r>
     </w:p>
     <w:p>
@@ -403,6 +447,33 @@
     </w:p>
     <w:p>
       <w:r>
+        <w:t xml:space="preserve">Additional yield-response tests retain the measurement hierarchy of each public source. Nordic assessment dates sharing a treatment yield remain in the same trial fold; eight post-harvest assessments and three rows of a pooled-control alias are excluded. Stage zero remains missing. Tunisia supplies 82 unprotected plot-season yields with two leaf assessments per outcome and 40 protected references in 2019. Flag and lower leaves were assessed on different dates. Protected-plot severity is unobserved and is not assigned zero. Whole-year transfer tests absolute yield, while mixture and replicate holdouts test relative protected-reference gaps within 2019. </w:t>
+      </w:r>
+      <w:r>
+        <w:rPr>
+          <w:vertAlign w:val="superscript"/>
+        </w:rPr>
+        <w:t>[14, 15, 28]</w:t>
+      </w:r>
+    </w:p>
+    <w:p>
+      <w:r>
+        <w:t xml:space="preserve">German original site files supply protection comparisons matched by location, year, cultivar, nitrogen and source-coded water regime. Unsuffixed HN/LN × NF/WF treatments enter; drought-suffixed references remain separate. Original fractional disease scores and missing values are preserved. Harvest treatment means use all eligible positive yield observations; severity means use only recorded assessments, with their replicate coverage retained. The relative response is 1 − unprotected yield / protected yield. German dry-mass yields are not pooled with other sources for absolute-yield fitting. Entire site-years or geographic sites are excluded from fitting, and forward transfer fits 2015–2017 and evaluates 2018–2019. Cultivar identities may occur in both training and evaluation; these comparisons test environmental transfer rather than prediction for unseen cultivars. </w:t>
+      </w:r>
+      <w:r>
+        <w:rPr>
+          <w:vertAlign w:val="superscript"/>
+        </w:rPr>
+        <w:t>[16]</w:t>
+      </w:r>
+    </w:p>
+    <w:p>
+      <w:r>
+        <w:t>All prespecified candidate models are compared with their corresponding training-mean benchmark. Weights are equal among held-out trial, year or location groups and then among outcomes within groups. Ridge models standardize predictors using training data and use a fixed penalty of 0.1. Nordic model choice uses inner training-trial validation. Paired Nordic intervals resample entire trials conditional on fixed predictions; they exclude refitting uncertainty. The nonnegative assessment-stage model is a secondary diagnostic following inspection of the stage-regression slopes. Infection dates, functional canopy trajectories and cause-specific STB losses are not validation targets of these severity-based comparisons.</w:t>
+      </w:r>
+    </w:p>
+    <w:p>
+      <w:r>
         <w:t>Reproducibility</w:t>
       </w:r>
     </w:p>
@@ -418,13 +489,13 @@
     </w:p>
     <w:p>
       <w:r>
-        <w:t xml:space="preserve">Source data and numerical evidence supporting the findings are publicly available at https://github.com/SmartAG-Team/paper_cc_impact_wheat_disease, with the manuscript-specific files in publication/european_wheat_stb. Dataset references identify the public disease archives, NEX-GDDP-CMIP6v2 climate data, GGCMI calendars, SPAM2020 wheat area and EEA environmental boundaries. Source_Data.xlsx contains completed grid summaries, environmental-region and country statistics, area shares by direction of change, pooled field evaluation and published canopy–yield evidence. Original labels and assessment definitions remain in the underlying records. </w:t>
+        <w:t xml:space="preserve">Source data and numerical evidence supporting the findings are deposited at https://github.com/SmartAG-Team/paper_cc_impact_wheat_disease, with the manuscript-specific files in publication/european_wheat_stb. The repository is private during manuscript preparation. Dataset references identify the public disease archives, the Nordic Field Trial System, Tunisian cultivar-mixture observations, German multi-environment field data, NEX-GDDP-CMIP6v2 climate data, GGCMI calendars, SPAM2020 wheat area and EEA environmental boundaries. Source_Data.xlsx contains completed grid summaries, environmental-region and country statistics, area shares by direction of change, pooled field evaluation, published canopy–yield evidence and the additional grouped yield-response tests. Original labels and assessment definitions remain in the underlying records. </w:t>
       </w:r>
       <w:r>
         <w:rPr>
           <w:vertAlign w:val="superscript"/>
         </w:rPr>
-        <w:t>[16, 17, 18, 19, 20, 21]</w:t>
+        <w:t>[14, 16, 22, 23, 24, 25, 26, 27, 28]</w:t>
       </w:r>
     </w:p>
     <w:p>
@@ -439,7 +510,7 @@
     </w:p>
     <w:p>
       <w:r>
-        <w:t>Simulation, statistical-analysis and document-generation code are publicly available at https://github.com/SmartAG-Team/paper_cc_impact_wheat_disease. The repository includes the accompanying evidence manifests. REPRODUCIBILITY.txt documents regeneration and model-rerun requirements. The supplementary model specification contains 29 numbered equations, and Parameter_inventory.csv records 84 fixed, fitted and scenario quantities.</w:t>
+        <w:t>Simulation, statistical-analysis and document-generation code are deposited in the same repository, which remains private during manuscript preparation. The repository includes evidence manifests and an executed field-yield validation notebook. REPRODUCIBILITY.txt documents regeneration and model-rerun requirements. The supplementary model specification contains 29 numbered equations, and Parameter_inventory.csv records 84 fixed, fitted and scenario quantities.</w:t>
       </w:r>
     </w:p>
     <w:p>
@@ -1015,6 +1086,228 @@
         <w:rPr>
           <w:i w:val="0"/>
         </w:rPr>
+        <w:t>Nordic Field Trial System. Nordic Field Trial System: wheat disease assessments and harvest-yield treatment means, 2023–2025. (2026).</w:t>
+      </w:r>
+    </w:p>
+    <w:p>
+      <w:pPr>
+        <w:ind w:left="432" w:hanging="432"/>
+      </w:pPr>
+      <w:r>
+        <w:rPr>
+          <w:i w:val="0"/>
+        </w:rPr>
+        <w:t>15.</w:t>
+      </w:r>
+      <w:r>
+        <w:rPr>
+          <w:i w:val="0"/>
+        </w:rPr>
+        <w:t xml:space="preserve">Ben M’Barek, S. </w:t>
+      </w:r>
+      <w:r>
+        <w:rPr>
+          <w:i/>
+        </w:rPr>
+        <w:t>et al.</w:t>
+      </w:r>
+      <w:r>
+        <w:rPr>
+          <w:i w:val="0"/>
+        </w:rPr>
+        <w:t xml:space="preserve"> Improved control of septoria tritici blotch in durum wheat using cultivar mixtures. </w:t>
+      </w:r>
+      <w:r>
+        <w:rPr>
+          <w:i/>
+        </w:rPr>
+        <w:t>Plant Pathology</w:t>
+      </w:r>
+      <w:r>
+        <w:rPr>
+          <w:i w:val="0"/>
+        </w:rPr>
+        <w:t>69</w:t>
+      </w:r>
+      <w:r>
+        <w:rPr>
+          <w:i w:val="0"/>
+        </w:rPr>
+        <w:t>, 1655–1665 (2020).</w:t>
+      </w:r>
+    </w:p>
+    <w:p>
+      <w:pPr>
+        <w:ind w:left="432" w:hanging="432"/>
+      </w:pPr>
+      <w:r>
+        <w:rPr>
+          <w:i w:val="0"/>
+        </w:rPr>
+        <w:t>16.</w:t>
+      </w:r>
+      <w:r>
+        <w:rPr>
+          <w:i w:val="0"/>
+        </w:rPr>
+        <w:t xml:space="preserve">Wang, T.-C. </w:t>
+      </w:r>
+      <w:r>
+        <w:rPr>
+          <w:i/>
+        </w:rPr>
+        <w:t>et al.</w:t>
+      </w:r>
+      <w:r>
+        <w:rPr>
+          <w:i w:val="0"/>
+        </w:rPr>
+        <w:t xml:space="preserve"> Multi-environment field trials for wheat yield, stability and breeding progress in Germany. https://doi.org/10.6084/m9.figshare.27910269.v1 (2025).</w:t>
+      </w:r>
+    </w:p>
+    <w:p>
+      <w:pPr>
+        <w:ind w:left="432" w:hanging="432"/>
+      </w:pPr>
+      <w:r>
+        <w:rPr>
+          <w:i w:val="0"/>
+        </w:rPr>
+        <w:t>17.</w:t>
+      </w:r>
+      <w:r>
+        <w:rPr>
+          <w:i w:val="0"/>
+        </w:rPr>
+        <w:t xml:space="preserve">Bancal, M.-O., Robert, C. &amp; Ney, B. Modelling wheat growth and yield losses from late epidemics of foliar diseases using loss of green leaf area per layer and pre-anthesis reserves. </w:t>
+      </w:r>
+      <w:r>
+        <w:rPr>
+          <w:i/>
+        </w:rPr>
+        <w:t>Annals of Botany</w:t>
+      </w:r>
+      <w:r>
+        <w:rPr>
+          <w:i w:val="0"/>
+        </w:rPr>
+        <w:t>100</w:t>
+      </w:r>
+      <w:r>
+        <w:rPr>
+          <w:i w:val="0"/>
+        </w:rPr>
+        <w:t>, 777–789 (2007).</w:t>
+      </w:r>
+    </w:p>
+    <w:p>
+      <w:pPr>
+        <w:ind w:left="432" w:hanging="432"/>
+      </w:pPr>
+      <w:r>
+        <w:rPr>
+          <w:i w:val="0"/>
+        </w:rPr>
+        <w:t>18.</w:t>
+      </w:r>
+      <w:r>
+        <w:rPr>
+          <w:i w:val="0"/>
+        </w:rPr>
+        <w:t xml:space="preserve">Bancal, P., Bancal, M.-O., Collin, F. &amp; Gouache, D. Identifying traits leading to tolerance of wheat to </w:t>
+      </w:r>
+      <w:r>
+        <w:rPr>
+          <w:i/>
+        </w:rPr>
+        <w:t>Septoria tritici</w:t>
+      </w:r>
+      <w:r>
+        <w:rPr>
+          <w:i w:val="0"/>
+        </w:rPr>
+        <w:t xml:space="preserve"> blotch. </w:t>
+      </w:r>
+      <w:r>
+        <w:rPr>
+          <w:i/>
+        </w:rPr>
+        <w:t>Field Crops Research</w:t>
+      </w:r>
+      <w:r>
+        <w:rPr>
+          <w:i w:val="0"/>
+        </w:rPr>
+        <w:t>180</w:t>
+      </w:r>
+      <w:r>
+        <w:rPr>
+          <w:i w:val="0"/>
+        </w:rPr>
+        <w:t>, 176–185 (2015).</w:t>
+      </w:r>
+    </w:p>
+    <w:p>
+      <w:pPr>
+        <w:ind w:left="432" w:hanging="432"/>
+      </w:pPr>
+      <w:r>
+        <w:rPr>
+          <w:i w:val="0"/>
+        </w:rPr>
+        <w:t>19.</w:t>
+      </w:r>
+      <w:r>
+        <w:rPr>
+          <w:i w:val="0"/>
+        </w:rPr>
+        <w:t xml:space="preserve">Bregaglio, S. </w:t>
+      </w:r>
+      <w:r>
+        <w:rPr>
+          <w:i/>
+        </w:rPr>
+        <w:t>et al.</w:t>
+      </w:r>
+      <w:r>
+        <w:rPr>
+          <w:i w:val="0"/>
+        </w:rPr>
+        <w:t xml:space="preserve"> Comparing process-based wheat growth models in their simulation of yield losses caused by plant diseases. </w:t>
+      </w:r>
+      <w:r>
+        <w:rPr>
+          <w:i/>
+        </w:rPr>
+        <w:t>Field Crops Research</w:t>
+      </w:r>
+      <w:r>
+        <w:rPr>
+          <w:i w:val="0"/>
+        </w:rPr>
+        <w:t>265</w:t>
+      </w:r>
+      <w:r>
+        <w:rPr>
+          <w:i w:val="0"/>
+        </w:rPr>
+        <w:t>, 108108 (2021).</w:t>
+      </w:r>
+    </w:p>
+    <w:p>
+      <w:pPr>
+        <w:ind w:left="432" w:hanging="432"/>
+      </w:pPr>
+      <w:r>
+        <w:rPr>
+          <w:i w:val="0"/>
+        </w:rPr>
+        <w:t>20.</w:t>
+      </w:r>
+      <w:r>
+        <w:rPr>
+          <w:i w:val="0"/>
+        </w:rPr>
         <w:t xml:space="preserve">McDonald, A. J. </w:t>
       </w:r>
       <w:r>
@@ -1056,7 +1349,7 @@
         <w:rPr>
           <w:i w:val="0"/>
         </w:rPr>
-        <w:t>15.</w:t>
+        <w:t>21.</w:t>
       </w:r>
       <w:r>
         <w:rPr>
@@ -1085,7 +1378,7 @@
         <w:rPr>
           <w:i w:val="0"/>
         </w:rPr>
-        <w:t>16.</w:t>
+        <w:t>22.</w:t>
       </w:r>
       <w:r>
         <w:rPr>
@@ -1102,7 +1395,7 @@
         <w:rPr>
           <w:i w:val="0"/>
         </w:rPr>
-        <w:t>17.</w:t>
+        <w:t>23.</w:t>
       </w:r>
       <w:r>
         <w:rPr>
@@ -1119,7 +1412,7 @@
         <w:rPr>
           <w:i w:val="0"/>
         </w:rPr>
-        <w:t>18.</w:t>
+        <w:t>24.</w:t>
       </w:r>
       <w:r>
         <w:rPr>
@@ -1148,7 +1441,7 @@
         <w:rPr>
           <w:i w:val="0"/>
         </w:rPr>
-        <w:t>19.</w:t>
+        <w:t>25.</w:t>
       </w:r>
       <w:r>
         <w:rPr>
@@ -1165,7 +1458,7 @@
         <w:rPr>
           <w:i w:val="0"/>
         </w:rPr>
-        <w:t>20.</w:t>
+        <w:t>26.</w:t>
       </w:r>
       <w:r>
         <w:rPr>
@@ -1182,13 +1475,42 @@
         <w:rPr>
           <w:i w:val="0"/>
         </w:rPr>
-        <w:t>21.</w:t>
+        <w:t>27.</w:t>
       </w:r>
       <w:r>
         <w:rPr>
           <w:i w:val="0"/>
         </w:rPr>
         <w:t>Holst, N. &amp; Donner, M. Data from 168 fungicide trials in wheat fields across Europe 2014–2018. Zenodo https://doi.org/10.5281/zenodo.6352615 (2022).</w:t>
+      </w:r>
+    </w:p>
+    <w:p>
+      <w:pPr>
+        <w:ind w:left="432" w:hanging="432"/>
+      </w:pPr>
+      <w:r>
+        <w:rPr>
+          <w:i w:val="0"/>
+        </w:rPr>
+        <w:t>28.</w:t>
+      </w:r>
+      <w:r>
+        <w:rPr>
+          <w:i w:val="0"/>
+        </w:rPr>
+        <w:t xml:space="preserve">Karisto, P. </w:t>
+      </w:r>
+      <w:r>
+        <w:rPr>
+          <w:i/>
+        </w:rPr>
+        <w:t>et al.</w:t>
+      </w:r>
+      <w:r>
+        <w:rPr>
+          <w:i w:val="0"/>
+        </w:rPr>
+        <w:t xml:space="preserve"> Improved control of Septoria tritici blotch in durum wheat using cultivar mixtures. https://doi.org/10.5061/dryad.r2280gbb5 (2020).</w:t>
       </w:r>
     </w:p>
     <w:p>

</xml_diff>

<commit_message>
Strengthen wheat manuscript with production exposure and grouped yield evidence
</commit_message>
<xml_diff>
--- a/publication/european_wheat_stb/Manuscript.docx
+++ b/publication/european_wheat_stb/Manuscript.docx
@@ -35,7 +35,7 @@
     </w:p>
     <w:p>
       <w:r>
-        <w:t>Septoria tritici blotch threatens European wheat production as climate change alters conditions for disease. How shifts in leaf emergence, flowering and grain filling modify future disease damage remains poorly quantified. We linked wheat phenology and Septoria disease models to project canopy damage across Europe using three climate models and three emissions pathways. Under SSP5–8.5 in 2071–2100, normalized loss of healthy-area duration during grain filling increased by 2.66 days relative to 1991–2020, with greater damage across 77.3% of reference wheat area. Regional changes ranged from -1.40 days in the Mediterranean to +7.84 days in the Boreal region. The fraction of healthy-area duration lost increased by 8.04 percentage points. Shifts in wheat phenology offset an estimated 71% of the increase in canopy damage attributable to weather. These projections show that crop timing strongly modifies climate-driven disease damage, with contrasting regional priorities for protecting European wheat production.</w:t>
+        <w:t>Septoria tritici blotch threatens European wheat production as climate change alters conditions for disease. How crop phenology modifies regional disease impacts and the wheat production exposed to them remains unresolved. We combined phenology–disease modelling, field evaluation and fixed wheat-production weights across Europe under three climate models and emissions pathways. Under SSP5–8.5 in 2071–2100, normalized loss of healthy-area duration during grain filling increased by 2.66 days relative to 1991–2020, with all three models agreeing on increasing damage in cells representing 67.1% of baseline wheat production. Continental production exposure was nearly six times that of the Boreal region. Shifts in wheat phenology offset an estimated 71% of the increase in canopy damage attributable to weather. However, disease and yield-response predictions did not consistently outperform benchmarks. These conditional projections identify regional priorities for monitoring and field trials; harvested-yield losses and adaptation benefits require compatible canopy-function and grain-yield observations.</w:t>
       </w:r>
     </w:p>
     <w:p>
@@ -76,7 +76,7 @@
     </w:p>
     <w:p>
       <w:r>
-        <w:t>The unresolved question is how climate effects on wheat phenology modify Septoria damage across European growing regions. A linked wheat-phenology and disease model quantifies changes in symptoms and canopy damage across the complete wheat land-use grid under three emissions pathways. Environmental-region and country summaries describe where these changes occur. A separate analysis distinguishes weather effects on disease from the effects of changing wheat phenology. Published canopy–yield relationships provide conditional estimates of the disease-related component of yield change, while field observations establish the limits of model prediction accuracy.</w:t>
+        <w:t>The unresolved question is how climate-driven crop timing modifies disease damage and the production exposed to it. A linked phenology–disease model describes canopy responses across the complete European wheat grid under three emissions pathways. Field observations evaluate predictive support, fixed production weights identify regional exposure, and a weather–phenology decomposition separates opposing model responses. These quantities distinguish where disease pressure changes from how much wheat production those locations represent. Published canopy–yield relationships provide a supplementary conditional index; physiological grain loss remains a separate validation target.</w:t>
       </w:r>
     </w:p>
     <w:p>
@@ -86,62 +86,44 @@
     </w:p>
     <w:p>
       <w:r>
-        <w:t>Regional differences in projected Septoria damage</w:t>
+        <w:t>Predictive support differs among model components</w:t>
       </w:r>
     </w:p>
     <w:p>
       <w:r>
-        <w:t>Projected Septoria-related canopy damage varied across European wheat-growing grids and emissions pathways (Fig. 1). By 2071–2100, the harvested-area-weighted normalized disease-induced loss of healthy-area duration (HAD) changed by +1.45, +1.55 and +2.66 days under SSP1–2.6, SSP2–4.5 and SSP5–8.5, respectively, relative to 1991–2020. The corresponding mid-century changes were +1.11, +0.77 and +1.53 days. Normalized HAD loss is the time-integrated loss of healthy leaf area divided by maximum reference upper-canopy leaf area index (LAI), expressed as equivalent days of reference canopy function lost to disease. Larger values indicate greater accumulated damage. The averages combine areas of increasing and declining damage (Supplementary Table S9).</w:t>
+        <w:t>The retained wheat-phenology formulation predicted 40,878 matched German station-test events with mean absolute error of 8.02 days, compared with 12.07 days for thermal time alone (Fig. 1a). The station split evaluates spatial transfer under observed weather and known sowing dates; calendar years were not held out. Support for the subsequently added upper-leaf stages and flowering-to-soft-dough window was more limited. The disease-field evaluation contained only five two-sided soft-dough observation intervals, with mean interval-excess error of 10.50 days (Supplementary Fig. S18; Supplementary Tables S1 and S2).</w:t>
       </w:r>
     </w:p>
     <w:p>
       <w:r>
-        <w:t>Under late-century SSP5–8.5, the European normalized HAD loss changed from 6.30 to 8.95 days; the three-climate-model change range was +1.23 to +4.57 days. The ensemble mean indicated increasing damage across 77.3% of the available reference wheat area. All three models agreed on greater damage across 65.2% of area and less damage across 14.9%; model predictions differed in sign across 20.0%. The continental increase thus coexisted with areas of declining damage (Supplementary Fig. S19; Supplementary Table S15).</w:t>
+        <w:t>Disease predictions did not improve consistently on calibration-selected benchmarks (Fig. 1b, c). Mean symptom-onset error was 5.32 days versus 2.79 days across 136 histories; the paired excess was +2.54 days (95% coordinate-year bootstrap interval 1.15–3.93). Severity RMSE was 31.19 versus 29.83 percentage points across 2,033 assessments from 188 field seasons. Model bias was -17.56 points, and the paired RMSE-difference interval included zero (-0.20–2.82). These retrospective comparisons exclude calibration records but retain uncertainty associated with prior model development (Supplementary Fig. S20; Supplementary Table S3).</w:t>
       </w:r>
     </w:p>
     <w:p>
       <w:r>
-        <w:t>Disease symptoms and canopy damage during grain filling</w:t>
+        <w:t xml:space="preserve">Independent field environments also showed limited transfer of severity-based yield responses (Fig. 1d). Across five Nordic trials, endpoint severity gave held-out RMSE of 4.83 percentage points versus 5.02 for the training mean. Across two Tunisian years, the two-leaf model gave 3.32 t ha⁻¹ versus 3.24. Across five German locations, endpoint severity gave 18.51 percentage points versus 18.48 on 3,264 cultivar–management comparisons. Assessment-stage information improved Nordic error in a smaller subset, but uncertainty included no improvement and three of four fitted conditional slopes opposed a monotone damage response. German management covariates explained more predictive variation than endpoint severity. These datasets evaluate yield associations or management responses and do not validate physiological STB-attributable grain loss (Supplementary Figs. S22–S24; Supplementary Tables S17–S20). </w:t>
+      </w:r>
+      <w:r>
+        <w:rPr>
+          <w:vertAlign w:val="superscript"/>
+        </w:rPr>
+        <w:t>[14, 15, 16]</w:t>
       </w:r>
     </w:p>
     <w:p>
       <w:r>
-        <w:t>Symptom frequency changed little despite increasing canopy damage (Fig. 2). The area-weighted frequency of flag-leaf symptoms before soft dough was 99.731% in 1991–2020 and 99.332% under late-century SSP5–8.5, a change of -0.400 percentage points. Symptoms were predicted in almost every complete season in both periods. The mean fraction of reference HAD lost during grain filling increased from 18.03% to 26.07%, or +8.04 percentage points, with a climate-model range of +4.08 to +13.53 points. Relative HAD loss describes accumulated canopy-function loss; observed lesion percentage measures a different quantity (Supplementary Tables S9 and S13b).</w:t>
+        <w:t xml:space="preserve">An additional audit identified 948 unique plot harvests, comprising 724 Swiss plots from ten site-years at five locations and 224 French plots from one site-year. In an exploratory Swiss location-held-out analysis, ordinal STB ratings gave yield RMSE of 0.926 t ha⁻¹ versus 1.142 for the training mean. Adding STB ratings to cultivar-composition and management predictors reduced RMSE from 0.914 to 0.877 t ha⁻¹, but five-site resampling showed unstable improvement. The French source lacked independent environmental replication. Neither source contained a compatible functional-canopy time series or an identified STB-specific yield counterfactual. These results extend statistical yield evidence without establishing end-to-end grain-loss validation (Fig. 1d; Supplementary Tables S24 and S25). </w:t>
+      </w:r>
+      <w:r>
+        <w:rPr>
+          <w:vertAlign w:val="superscript"/>
+        </w:rPr>
+        <w:t>[17, 18]</w:t>
       </w:r>
     </w:p>
     <w:p>
       <w:r>
-        <w:t>Flag-leaf symptoms appeared 3.46 days earlier relative to flowering, with model-specific changes of -6.02 to -1.57 days. The interval from the fixed sowing date to first symptoms shortened by 30.78 days, spanning -45.39 to -18.74 days across climate models (Fig. 2b, d). Flag-leaf symptoms were present during 97.37% of grain-fill days in 1991–2020 and 97.42% in the future. The number of grain-fill days with symptoms changed by +0.24 days, alongside a +0.25-day change in the flowering-to-soft-dough interval. The large advance in symptoms after sowing accompanied earlier flowering and soft dough, with little change in the duration of grain filling. Timing estimates include symptoms detected in both paired seasons; frequency estimates also include complete seasons without symptoms (Supplementary Figs. S12 and S14).</w:t>
-      </w:r>
-    </w:p>
-    <w:p>
-      <w:r>
-        <w:t>Differences among environmental regions and countries</w:t>
-      </w:r>
-    </w:p>
-    <w:p>
-      <w:r>
-        <w:t>Environmental-region means differed substantially (Fig. 3a; Table 1). Under late-century SSP5–8.5, normalized HAD-loss changes were +4.85 days in the Atlantic region, +3.45 days in the Continental region, +7.84 days in the Boreal region, -1.40 days in the Mediterranean region, and +0.37 days in the Steppic region. Among the eight named environmental regions, the largest mean increase occurred in the Boreal region and the largest decrease in the Mediterranean region. The Boreal change spanned +5.06 to +12.52 days across climate models, compared with -1.88 to -1.13 days in the Mediterranean region. Alpine, Pannonian and Black Sea cells were included alongside the five larger regions (Supplementary Tables S13a–c and S16).</w:t>
-      </w:r>
-    </w:p>
-    <w:p>
-      <w:r>
-        <w:t>Country summaries also showed increasing and declining damage. Among the twelve country groups with the largest reference wheat area, late-century SSP5–8.5 HAD changes ranged from -2.02 days in Italy to +10.43 days in Lithuania. Yield changes inferred from their canopy damage differed in sign and magnitude (Fig. 3b). The full set of country means and climate-model ranges includes all country-assigned wheat cells within the study domain, with calendar eligibility and valid-season coverage reported for each group (Supplementary Table S14).</w:t>
-      </w:r>
-    </w:p>
-    <w:p>
-      <w:r>
-        <w:t>Yield changes inferred from canopy damage</w:t>
-      </w:r>
-    </w:p>
-    <w:p>
-      <w:r>
-        <w:t>Applying the reference HAD–yield coefficient converted the late-century SSP5–8.5 HAD change into an estimated disease-related yield change of -47.8 kg ha⁻¹ per unit reference upper-canopy LAI. The three-climate-model range was -82.3 to -22.2 kg ha⁻¹ per reference LAI. At coefficients of 0.0141–0.0207 t ha⁻¹ per green-leaf-area-index day (GLAI-day), the same canopy response produced a conversion range of -55.0 to -37.4 kg ha⁻¹ per reference LAI. A negative change indicates greater estimated disease-related yield loss. These estimates depend on the assumed canopy area and linear HAD–yield relationship (Fig. 3b; Supplementary Fig. S13).</w:t>
-      </w:r>
-    </w:p>
-    <w:p>
-      <w:r>
-        <w:t xml:space="preserve">Evaluation of the canopy–yield relationship showed limited prediction accuracy across genetic backgrounds. Eight treatment-mean contrasts across five genetic backgrounds gave leave-one-background-out relative-yield RMSE of 5.16 percentage points and R² of 0.247, but absolute-yield RMSE of 0.617 t ha⁻¹ and R² of −0.432. Two contrasts concerned STB alone; the other six involved yellow rust or mixed diseases. The grid estimates provide a disease-related yield index under specified assumptions. Total wheat yield and national production changes require additional crop-yield modelling and validation (Supplementary Figs. S9–S11; Supplementary Tables S5–S8). </w:t>
+        <w:t xml:space="preserve">Published canopy–yield contrasts likewise provided partial support. Leaving each of five genetic backgrounds out of fitting gave relative-yield RMSE of 5.16 percentage points and R² of 0.247, but absolute-yield R² of −0.432 across eight treatment-mean contrasts. Only two contrasts involved STB alone. The linear conversion from normalized HAD loss to yield therefore remains a conditional index, retained in the supplementary evidence (Supplementary Figs. S9–S11 and S13; Supplementary Tables S5–S8). </w:t>
       </w:r>
       <w:r>
         <w:rPr>
@@ -152,18 +134,357 @@
     </w:p>
     <w:p>
       <w:r>
-        <w:t xml:space="preserve">Severity-based yield responses transfer poorly across field environments. In five Nordic trials, 62 treated–untreated contrasts gave trial-held-out RMSE of 4.83 percentage points for severity regression and 5.02 for the training mean. Adding assessment stage reduced error to 3.99 points in the four-trial subset with recorded stages, but the paired difference interval included zero and three of four conditional severity slopes opposed a monotone damage response. In Tunisia, flag- and lower-leaf severity gave cross-year yield RMSE of 3.32 t ha⁻¹, compared with 3.24 for the training mean across 82 plot-season yields (Supplementary Figs. S22 and S23; Supplementary Tables S17–S19). </w:t>
+        <w:t>Climate change redistributes canopy damage</w:t>
+      </w:r>
+    </w:p>
+    <w:p>
+      <w:r>
+        <w:t>Projected canopy damage increased on average while differing in sign among wheat-growing regions (Fig. 2). By 2071–2100, harvested-area-weighted normalized loss of healthy-area duration (HAD) changed by +1.45, +1.55 and +2.66 days under SSP1–2.6, SSP2–4.5 and SSP5–8.5, respectively, relative to 1991–2020. Mid-century changes were +1.11, +0.77 and +1.53 days. Normalized HAD loss is the time-integrated loss of assumed functional green leaf area divided by maximum reference upper-canopy LAI, expressed as equivalent days of canopy function lost during flowering to soft dough (Supplementary Fig. S25; Supplementary Table S9).</w:t>
+      </w:r>
+    </w:p>
+    <w:p>
+      <w:r>
+        <w:t>Under late-century SSP5–8.5, European normalized HAD loss increased from 6.30 to 8.95 days; climate-model changes spanned +1.23 to +4.57 days. The ensemble indicated increasing damage across 77.3% of available reference wheat area. All three models agreed on an increase across 65.2% and a decrease across 14.9%; signs differed across 20.0% (Fig. 2b; Supplementary Table S15). Model agreement measures consistency among climate projections, rather than predictive validation.</w:t>
+      </w:r>
+    </w:p>
+    <w:p>
+      <w:r>
+        <w:t>Area-weighted regional changes were +4.85 days in the Atlantic region, +3.45 days in the Continental region, +7.84 days in the Boreal region, -1.40 days in the Mediterranean region, and +0.37 days in the Steppic region. The largest mean increase therefore occurred in the Boreal region. Relative HAD loss increased from 18.03% to 26.07% across Europe, whereas symptom occurrence remained close to saturation (99.73% and 99.33%). Symptom presence alone consequently distinguished little of the projected change in accumulated canopy damage (Supplementary Figs. S14 and S27; Supplementary Tables S13 and S16).</w:t>
+      </w:r>
+    </w:p>
+    <w:p>
+      <w:r>
+        <w:t>Crop timing moderates weather-driven damage</w:t>
+      </w:r>
+    </w:p>
+    <w:p>
+      <w:r>
+        <w:t>First symptoms relative to flowering provide the primary timing reference because crop development determines the period in which damaged leaves support grain growth (Fig. 3a). The full-grid map describes this alignment; the sampled attribution distinguishes weather and phenology contributions to canopy damage.</w:t>
+      </w:r>
+    </w:p>
+    <w:p>
+      <w:r>
+        <w:t>On identical complete historical–future season pairs, symptoms advanced by 30.78 days after sowing, flowering by 27.32 days and soft dough by 27.07 days under late-century SSP5–8.5 (Supplementary Fig. S26a). Symptoms therefore advanced by 3.46 days relative to flowering. The elapsed flowering-to-soft-dough interval changed by +0.25 days. The much larger advance after sowing mostly accompanied earlier crop development, rather than an equally large shift in disease timing within grain filling (Supplementary Table S22).</w:t>
+      </w:r>
+    </w:p>
+    <w:p>
+      <w:r>
+        <w:t>In the separate 62-cell diagnostic sample, the weather contribution increased normalized HAD loss by 9.00 days, while wheat phenology reduced it by 6.36 days, giving a net increase of 2.64 days (Fig. 3b). The ratio of ensemble contributions corresponds to a 70.6% offset, with individual climate-model offsets of 63.6–80.3%. The calculation retains 5,731 valid season pairs and allocates the −2.78-day weather–phenology interaction equally between the two Shapley contributions. Its net estimate is close to the full-grid change, although the populations differ. This decomposition identifies opposing responses within the model; it does not estimate avoided yield loss or the effectiveness of changing sowing date or cultivar (Supplementary Fig. S16; Supplementary Tables S12a, b).</w:t>
+      </w:r>
+    </w:p>
+    <w:p>
+      <w:r>
+        <w:t>The phenology offset also differed among sampled regions (Fig. 3c). It was 39.1% in the Boreal region, 63.6% in the Continental region and 160.4% in the Mediterranean region. Values above 100% denote a phenology contribution larger than the positive weather contribution, producing a negative net change. These regional diagnostic samples contained 14, 18 and nine draws, respectively. Alpine and Black Sea regions had no draws, and Pannonian had one; regional sampling gaps prevent a complete attribution census (Source Data).</w:t>
+      </w:r>
+    </w:p>
+    <w:p>
+      <w:r>
+        <w:t>Production exposure changes regional priorities</w:t>
+      </w:r>
+    </w:p>
+    <w:p>
+      <w:r>
+        <w:t>The fixed SPAM2020 wheat-production baseline contained 241.84 million tonnes within the study domain (Fig. 4; Table 1). Under late-century SSP5–8.5, cells with increasing ensemble-mean damage represented 194.87 million tonnes (80.6% of baseline production). Cells with increases in all three climate models represented 162.21 million tonnes (67.1%). These amounts quantify the baseline production located in exposed cells; they are neither projected production nor tonnes lost.</w:t>
+      </w:r>
+    </w:p>
+    <w:p>
+      <w:r>
+        <w:t>The Continental region contained 106.62 million tonnes of baseline production, compared with 14.65 million tonnes in the Boreal region. Production in cells with unanimous projected increases was 82.81 and 14.17 million tonnes, respectively. The region with the largest damage increase per unit canopy thus differed from the region with the greatest production exposure. Surveillance and validation priorities depend on both impact intensity and the amount of production represented, while cells with differing model signs warrant observation of the direction of change (Fig. 4a, b).</w:t>
+      </w:r>
+    </w:p>
+    <w:p>
+      <w:r>
+        <w:t>Exposure did not increase monotonically under stronger forcing (Fig. 4c). Ensemble-increase exposure was 228.91 million tonnes under SSP1–2.6 and 194.87 million tonnes under SSP5–8.5. In contrast, unanimous-increase exposure rose from 97.04 to 162.21 million tonnes, while production-weighted HAD-loss change rose from 1.60 to 3.36 days. The geographic extent of positive mean responses, their intensity and agreement among climate models are therefore distinct indicators; a smaller exposed footprint does not imply less damage.</w:t>
+      </w:r>
+    </w:p>
+    <w:p>
+      <w:r>
+        <w:t>Production-weighted European HAD-loss change was +3.36 days, with climate-model values from +1.38 to +5.69 days. Fixed production weights describe the present geography of exposure under alternative climate pathways (Fig. 4c). They exclude future shifts in cropped area, yield, trade, irrigation and crop type. The imposed winter-wheat rainfed calendar applies to the all-wheat mask, so the estimates remain scenario-specific even where climate models agree. Country production exposure uses fractional source-country contributions within border cells (Supplementary Table S21; Source Data).</w:t>
+      </w:r>
+    </w:p>
+    <w:p>
+      <w:r>
+        <w:t>All fourteen tested combinations of model structure, symptom detection and canopy assumptions gave increased HAD loss under late-century SSP5–8.5, with ensemble increases spanning 0.63–2.80 days. This more than fourfold variation in magnitude limits quantitative interpretation despite agreement in the direction of the European mean. Climate-model ranges, selected structural sensitivities and grouped field-evaluation intervals describe different uncertainties and cannot be combined into a single confidence interval for future grain loss (Supplementary Fig. S15; Supplementary Table S10).</w:t>
+      </w:r>
+    </w:p>
+    <w:p>
+      <w:r>
+        <w:t>Discussion</w:t>
+      </w:r>
+    </w:p>
+    <w:p>
+      <w:r>
+        <w:t xml:space="preserve">Climate-driven changes in wheat phenology can offset much of the increase in Septoria damage attributable to weather, while leaving a positive European mean and contrasting regional responses. Earlier symptoms after sowing largely accompany earlier crop development; their shift relative to flowering is considerably smaller. Consequently, infection-favourable weather and symptom occurrence alone provide incomplete measures of the disease impact during grain filling. This mechanism remains conditional on the model structure and its observed predictive limitations. </w:t>
       </w:r>
       <w:r>
         <w:rPr>
           <w:vertAlign w:val="superscript"/>
         </w:rPr>
-        <w:t>[14, 15]</w:t>
+        <w:t>[4, 5]</w:t>
       </w:r>
     </w:p>
     <w:p>
       <w:r>
-        <w:t xml:space="preserve">German field data provided a broader test across 3,264 cultivar–management comparisons in 16 site-years at five locations. Endpoint Septoria severity had geographic-site-held-out yield-response RMSE of 18.51 percentage points, compared with 18.48 for the training mean. Nitrogen and water regime reduced forward-transfer error from 19.56 to 17.55 points; adding severity changed it to 17.51 points. These responses concerned protection against multiple diseases. Endpoint severity supplied little additional predictive information beyond crop management, and none of the field comparisons validated the conversion from simulated HAD loss to grain yield (Supplementary Fig. S24; Supplementary Table S20). </w:t>
+        <w:t>Production exposure adds a decision-relevant dimension to the regional damage gradient. Boreal wheat has the largest mean canopy-damage increase, whereas the greater production represented in the Continental region increases the scale of its exposure. A surveillance network organized only by the largest per-area change would miss this distinction. Joint consideration of baseline production, damage direction and climate-model disagreement supports selection of regional monitoring and field-validation sites. It does not supply a quantitative estimate of food shortages, trade disruption or grain lost.</w:t>
+      </w:r>
+    </w:p>
+    <w:p>
+      <w:r>
+        <w:t xml:space="preserve">The immediate policy implication is differentiated investment in evidence and preparedness. Regions combining substantial production with consistent projected increases are candidates for coordinated disease surveillance and testing of crop resistance and phenology. Regions with model disagreement require observations that resolve whether seasonal exposure is rising or falling. Declining Mediterranean disease pressure does not establish improved wheat productivity because heat and water stress can reduce grain yield independently. These priorities remain conditional on an all-wheat production baseline represented by a winter-wheat rainfed calendar; winter and spring wheat and irrigated systems require separate evaluation before operational targeting. </w:t>
+      </w:r>
+      <w:r>
+        <w:rPr>
+          <w:vertAlign w:val="superscript"/>
+        </w:rPr>
+        <w:t>[19]</w:t>
+      </w:r>
+    </w:p>
+    <w:p>
+      <w:r>
+        <w:t xml:space="preserve">Climate-driven phenological escape is not equivalent to an achievable adaptation benefit. Earlier crop development can change disease exposure while also changing canopy duration, pre-anthesis growth, heat exposure and water use. A useful adaptation comparison therefore requires grain yield and resource outcomes under feasible sowing dates, cultivar maturity and resistance, with each disease scenario paired to the same climate and management without disease. Baseline disease loss, future disease loss and their difference are distinct endpoints. Net benefits additionally depend on implementation costs and production variability. The 70.6% phenology offset cannot be interpreted as yield protected by an intervention. </w:t>
+      </w:r>
+      <w:r>
+        <w:rPr>
+          <w:vertAlign w:val="superscript"/>
+        </w:rPr>
+        <w:t>[20, 21, 22]</w:t>
+      </w:r>
+    </w:p>
+    <w:p>
+      <w:r>
+        <w:t xml:space="preserve">The largest evidential gap concerns the conversion from disease to harvested grain. Endpoint lesion scores, time-integrated functional canopy loss and grain yield differ in their biological meaning. The model assumes a reference upper-three-leaf canopy and a damage-to-function relationship; it lacks a complete crop carbon balance and observed senescence trajectory. Published HAD–yield coefficients concern a wider stage interval than the primary climate calculation, and the small cross-background evaluation contains predominantly mixed diseases. Additional endpoint-yield datasets increase the evidence for statistical associations but cannot reconstruct missing canopy trajectories. Independent environments with matched crop stages, repeated disease observations, functional green leaf area and grain yield are needed to test the full prediction chain. </w:t>
+      </w:r>
+      <w:r>
+        <w:rPr>
+          <w:vertAlign w:val="superscript"/>
+        </w:rPr>
+        <w:t>[2, 11, 12, 23]</w:t>
+      </w:r>
+    </w:p>
+    <w:p>
+      <w:r>
+        <w:t>Disease prediction itself also constrains confidence in the projected magnitudes. Symptom-onset error exceeded that of the phenology benchmark, and numerical severity was underestimated. High sensitivity with low specificity is consistent with the near-universal symptom occurrence in the climate experiment. Reconstructed humidity, fixed biological and management assumptions, sparse observations of added crop stages and climate-model selection contribute further uncertainty. Emissions-pathway contrasts and regional exposure identify hypotheses and priorities for validation; they do not establish optimized sowing advice, fungicide-reduction targets or production benefits from adaptation.</w:t>
+      </w:r>
+    </w:p>
+    <w:p>
+      <w:r>
+        <w:t>Methods</w:t>
+      </w:r>
+    </w:p>
+    <w:p>
+      <w:r>
+        <w:t>Wheat-growing area and climate data</w:t>
+      </w:r>
+    </w:p>
+    <w:p>
+      <w:r>
+        <w:t xml:space="preserve">The European SPAM2020 all-wheat registry contains 14,941 cells with positive harvested wheat area at 0.25° resolution. A fixed GGCMI winter-wheat rainfed calendar is available for 14,932 cells; nine cells have unavailable simulation outcomes. The all-wheat area mask combined with a winter-wheat rainfed calendar defines the crop-management scenario. It is not a census of observed winter-wheat management. Harvested area provides fixed weights for spatial aggregation. Supplementary Fig. S21 shows the study area, field-observation locations and environmental regions. </w:t>
+      </w:r>
+      <w:r>
+        <w:rPr>
+          <w:vertAlign w:val="superscript"/>
+        </w:rPr>
+        <w:t>[24, 25]</w:t>
+      </w:r>
+    </w:p>
+    <w:p>
+      <w:r>
+        <w:t xml:space="preserve">Daily NEX-GDDP-CMIP6v2 data represent ACCESS-CM2, MPI-ESM1-2-HR and MRI-ESM2-0 under SSP1–2.6, SSP2–4.5 and SSP5–8.5. The harvest periods are 1991–2020, 2031–2060 and 2071–2100. The 810 model–scenario–year combinations cover 12,094,920 calendar-eligible grid-seasons. Monthly adjustment coefficients align climate variables with the reference weather data, with separate historical adjustments for each SSP continuation. Daily series include the preceding calendar year to represent overwintering seasons. Input files, adjustment coefficients and model configurations are identified by checksums. </w:t>
+      </w:r>
+      <w:r>
+        <w:rPr>
+          <w:vertAlign w:val="superscript"/>
+        </w:rPr>
+        <w:t>[26]</w:t>
+      </w:r>
+    </w:p>
+    <w:p>
+      <w:r>
+        <w:t>Disease calculations use daily temperature, relative humidity and rainfall. A synthetic reconstruction of humidity within each day estimates moisture exposure from daily forcing; it does not supply measured leaf wetness. Missing weather and daily mean temperatures above 40 °C produce unavailable outcomes under the model input rules.</w:t>
+      </w:r>
+    </w:p>
+    <w:p>
+      <w:r>
+        <w:t>Linking wheat phenology to Septoria disease</w:t>
+      </w:r>
+    </w:p>
+    <w:p>
+      <w:r>
+        <w:t xml:space="preserve">A temperature–photoperiod–vernalization model calculates wheat phenological stages from sowing to soft dough. Additional ordered developmental thresholds determine upper-leaf appearance and unfolding, and a calibrated flowering threshold defines the start of the grain-filling interval. These crop trajectories determine which leaves are available to infection and the seasonal weather experienced by each leaf. The Septoria module calculates disease establishment, progression and visible damage using weather and these leaf trajectories. Disease damage does not alter the calculated crop-development trajectory. Model equations, parameter sources and observation definitions appear in the supplementary model specification and the 84-entry parameter inventory. </w:t>
+      </w:r>
+      <w:r>
+        <w:rPr>
+          <w:vertAlign w:val="superscript"/>
+        </w:rPr>
+        <w:t>[6, 7, 8, 9, 10]</w:t>
+      </w:r>
+    </w:p>
+    <w:p>
+      <w:r>
+        <w:t>Calibrated parameters remain fixed across climate scenarios. The maximum reference LAI of the upper three leaves is one, divided equally among leaves and scaled by unfolding. Cultivar-specific canopy area and future changes in resistance are not estimated. Soft dough marks season completion. Missing crop calendars, invalid weather and failure to reach the endpoint remain separate unavailable outcomes, rather than zero disease or zero loss.</w:t>
+      </w:r>
+    </w:p>
+    <w:p>
+      <w:r>
+        <w:t>Symptoms, canopy damage and healthy-area duration</w:t>
+      </w:r>
+    </w:p>
+    <w:p>
+      <w:r>
+        <w:t>Symptom frequency is the fraction of complete simulated seasons with detectable flag-leaf symptoms before soft dough. First-symptom timing is measured relative to flowering or sowing and is unavailable when symptoms are not detected. Symptomatic grain-fill days count days with detectable flag-leaf symptoms between flowering and soft dough. Symptoms are visible model states following disease development; their dates are distinct from the modelled dates of initial infection.</w:t>
+      </w:r>
+    </w:p>
+    <w:p>
+      <w:r>
+        <w:t xml:space="preserve">The disease-damage fraction after symptom detection is treated as the fraction of reference leaf area that has lost function. This assumption connects modelled disease to canopy damage. HAD loss integrates this fraction multiplied by daily reference leaf area across the flag leaf and two leaves below it. The primary interval is flowering to soft dough (GS65–85), with GS31–85 used for sensitivity analysis. HAD and disease-induced HAD loss have units of green leaf area index multiplied by days (GLAI-days). Normalized HAD loss divides the time-integrated functional loss by maximum reference upper-canopy LAI and expresses it as equivalent days of reference canopy function lost. With reference LAI equal to one, normalization leaves numerical values unchanged. Relative HAD loss is HAD loss divided by reference HAD, expressed as a percentage; it describes average accumulated canopy-function loss, not instantaneous lesion percentage. </w:t>
+      </w:r>
+      <w:r>
+        <w:rPr>
+          <w:vertAlign w:val="superscript"/>
+        </w:rPr>
+        <w:t>[2, 12]</w:t>
+      </w:r>
+    </w:p>
+    <w:p>
+      <w:r>
+        <w:t xml:space="preserve">Flowering provides a reference for grain filling rather than the start of disease simulation or a universal crop-protection threshold. Disease calculations begin during crop establishment and include upper-leaf appearance and unfolding before flowering. Stem extension and upper-leaf emergence define earlier exposure relevant to canopy protection. The GS65–85 integral describes grain-filling canopy damage; it does not quantify every effect of pre-flowering disease on grain number or assimilate reserves. </w:t>
+      </w:r>
+      <w:r>
+        <w:rPr>
+          <w:vertAlign w:val="superscript"/>
+        </w:rPr>
+        <w:t>[2, 21]</w:t>
+      </w:r>
+    </w:p>
+    <w:p>
+      <w:r>
+        <w:t>Historical–future comparisons and spatial summaries</w:t>
+      </w:r>
+    </w:p>
+    <w:p>
+      <w:r>
+        <w:t>Each future harvest year is paired with the corresponding position in the 30-year historical period for the same climate model and SSP. This indexing supports comparisons of period means without identifying historical and future years as the same physical event. A pair is included only when both metric values are finite. For grid i, x_i is the sum of valid paired differences divided by 30, and z_i is the number of valid pairs divided by 30. The grid mean change is x_i/z_i. Reference and future means use the same valid pairs. The valid seasons may differ among symptom timing, symptom frequency and canopy metrics.</w:t>
+      </w:r>
+    </w:p>
+    <w:p>
+      <w:r>
+        <w:t xml:space="preserve">For domain indicator I_i and fixed harvested area w_i, the mean change is Σw_i I_i x_i / Σw_i I_i z_i. Separate estimates for each climate model give the reported three-model mean and range. EEA 2016 boundaries assign environmental regions from wheat-cell centroids. Country assignment uses the dominant SPAM source-country label of each cell; cross-border cells are not divided among countries. Country estimates apply only to represented wheat cells within the study domain. Source Data includes all eight named environmental regions, outside-region and unassigned cells, and all country groups. </w:t>
+      </w:r>
+      <w:r>
+        <w:rPr>
+          <w:vertAlign w:val="superscript"/>
+        </w:rPr>
+        <w:t>[27]</w:t>
+      </w:r>
+    </w:p>
+    <w:p>
+      <w:r>
+        <w:t>Maps show model means at the native 0.25° grid resolution, without interpolation or filling unavailable cells. Area shares by direction of change use fixed harvested-area weights over cells with complete three-model estimates. Model ranges describe spread among three climate models and are not confidence intervals. All wheat cells are simulated, so full-grid estimates have no spatial-sampling Monte Carlo error. Other uncertainties include climate-model choice, model parameters, observations and the canopy–yield relationship. Full scenario-period maps are retained in Supplementary Fig. S25; saturated symptom-frequency and conditional yield-conversion results remain supplementary.</w:t>
+      </w:r>
+    </w:p>
+    <w:p>
+      <w:r>
+        <w:t>Production exposure and common-population timing</w:t>
+      </w:r>
+    </w:p>
+    <w:p>
+      <w:r>
+        <w:t xml:space="preserve">Fixed SPAM2020 production weights represent tonnes of all-wheat production in the reference geography. Quarter-degree cell identities, coordinates, positive harvested-area support and production totals are reconciled against the current climate registry. Native source-country fractions partition production in cross-border cells; environmental regions use the existing cell-centroid assignment. The same cell-specific climate response applies to each source-country fraction. Production exposure retains all reference production in its denominator, with unavailable climate responses explicit. </w:t>
+      </w:r>
+      <w:r>
+        <w:rPr>
+          <w:vertAlign w:val="superscript"/>
+        </w:rPr>
+        <w:t>[24]</w:t>
+      </w:r>
+    </w:p>
+    <w:p>
+      <w:r>
+        <w:t>For each scenario and period, ensemble-increase exposure sums baseline production in cells whose equally weighted three-model mean HAD change is positive. Unanimous-increase exposure requires positive changes in all three models; unanimous decreases, differing signs, zero responses and unavailable estimates remain distinguishable in Source Data. Production-weighted continuous HAD changes use production multiplied by the number of valid metric-specific season pairs within each model, followed by equal weighting across three model estimates. Climate-model ranges are deterministic spread. A coverage sensitivity requires at least 27 of 30 paired seasons in every model; excluded production remains in the reference denominator. Exposed tonnes describe spatial coincidence with increasing modelled damage, not tonnes of lost or future production.</w:t>
+      </w:r>
+    </w:p>
+    <w:p>
+      <w:r>
+        <w:t>The timing comparison under late-century SSP5–8.5 uses complete historical–future season pairs with finite symptom, flowering and soft-dough dates in both seasons. Actual date subtraction measures elapsed days from each recorded sowing date, including leap years. Every event and relative interval uses this identical pair population. Within each climate model, fixed harvested area times the valid-pair count weights cell means; three model means then receive equal weight. Symptom timing relative to flowering equals symptom timing after sowing minus flowering after sowing exactly on this common population. Grain-fill elapsed duration excludes inclusive-day counting. The full-grid timing population differs from the sampled weather–phenology decomposition.</w:t>
+      </w:r>
+    </w:p>
+    <w:p>
+      <w:r>
+        <w:t>Estimating the disease-related yield response</w:t>
+      </w:r>
+    </w:p>
+    <w:p>
+      <w:r>
+        <w:t xml:space="preserve">The estimated disease-related yield change is −b times the change in HAD loss. The reference coefficient b is 0.018 t ha⁻¹ per GLAI-day, with 0.0141 and 0.0207 used as fixed alternatives from the published upper-three-leaf study. Multiplication by 1,000 converts t ha⁻¹ to kg ha⁻¹. Results are expressed per unit reference upper-canopy LAI because actual canopy area is unspecified. The source relationship began at GS31, whereas the primary climate calculation covers GS65–85; its use in this shorter interval is an unvalidated adaptation. Coefficient alternatives represent cultivar differences, not statistical confidence limits. The calculation estimates a disease-related yield component under these assumptions, without modelling the direct effects of heat, water limitation, CO₂ or other stresses on total grain yield. Yield percentages and national production tonnages require independently validated canopy area and grain yield. </w:t>
+      </w:r>
+      <w:r>
+        <w:rPr>
+          <w:vertAlign w:val="superscript"/>
+        </w:rPr>
+        <w:t>[2, 11]</w:t>
+      </w:r>
+    </w:p>
+    <w:p>
+      <w:r>
+        <w:t>Separating weather and wheat-phenology effects</w:t>
+      </w:r>
+    </w:p>
+    <w:p>
+      <w:r>
+        <w:t>The decomposition and fourteen-setting sensitivity analysis use 64 harvested-area-proportional draws at 62 unique cells. Four simulations combine historical or future disease weather with historical or future wheat-phenology trajectories. Their differences separate weather and wheat-phenology contributions, with one half of their interaction allocated to each Shapley contribution. Of 5,751 finite historical–future pairs, 20 have an active day outside the accepted temperature range in a recombined trajectory and are excluded, leaving 5,731 pairs. Spatial Monte Carlo standard errors apply to this sample and are separate from full-grid climate estimates.</w:t>
+      </w:r>
+    </w:p>
+    <w:p>
+      <w:r>
+        <w:t>The phenology offset is −100 times the phenology contribution divided by the weather contribution, using identical valid pairs. The ensemble percentage is the ratio of three-model mean contributions. Sensitivity settings vary model structure, symptom detection, reference canopy area and damage-to-function conversion. These calculations assess model assumptions and do not represent trials of a sowing-date or cultivar intervention.</w:t>
+      </w:r>
+    </w:p>
+    <w:p>
+      <w:r>
+        <w:t>Field evaluation</w:t>
+      </w:r>
+    </w:p>
+    <w:p>
+      <w:r>
+        <w:t xml:space="preserve">Disease observations from the two public field archives are pooled after exclusion of calibration records and application of geographic eligibility criteria. The evaluation contains 2,033 assessments from 188 field seasons in 140 coordinate-years and 136 symptom-onset histories from 78 field seasons in 62 coordinate-years. Onset histories concern source-defined leaves 1–3 and have observations bracketing symptom appearance. Original identifiers, units and percentage denominators remain in the evidence files. Source leaf numbers do not establish a common final-leaf rank across archives. </w:t>
+      </w:r>
+      <w:r>
+        <w:rPr>
+          <w:vertAlign w:val="superscript"/>
+        </w:rPr>
+        <w:t>[28, 29]</w:t>
+      </w:r>
+    </w:p>
+    <w:p>
+      <w:r>
+        <w:t>Evaluation weights are equal among coordinate-years, fields within coordinate-years, source leaves within fields and assessments within leaves. Symptom-onset error measures distance outside the two-sided observation interval, with the predefined penalty for missed positive observations. Severity predictions are compared with the calibration-leaf-mean benchmark; timing and detection use the phenology benchmark selected on calibration data. Model and benchmark predictions are compared on identical records. The 95% intervals use 20,000 paired bootstrap resamples of entire coordinate-year groups. They describe uncertainty in these fixed predictions on reused retrospective observations and exclude parameter-selection uncertainty. Duplicate coordinate-year identities are grouped across archives.</w:t>
+      </w:r>
+    </w:p>
+    <w:p>
+      <w:r>
+        <w:t xml:space="preserve">Wheat phenological stage dates are evaluated on 40,878 matched events from German stations held out of calibration, at BBCH 10, 31, 51 and 85. Added leaf stages use pooled field observation intervals, with calibration observations reported separately. Evaluation of the canopy–yield relationship uses eight published treatment-mean contrasts across five genetic backgrounds, including STB, yellow rust and mixed disease. Leaving each background out of fitting gives backgrounds equal evaluation weight. Severity-based yield models use their specified held-out trial or year comparisons and corresponding training-mean benchmarks. </w:t>
+      </w:r>
+      <w:r>
+        <w:rPr>
+          <w:vertAlign w:val="superscript"/>
+        </w:rPr>
+        <w:t>[11]</w:t>
+      </w:r>
+    </w:p>
+    <w:p>
+      <w:r>
+        <w:t xml:space="preserve">Additional yield-response tests retain the measurement hierarchy of each public source. Nordic assessment dates sharing a treatment yield remain in the same trial fold; eight post-harvest assessments and three rows of a pooled-control alias are excluded. Stage zero remains missing. Tunisia supplies 82 unprotected plot-season yields with two leaf assessments per outcome and 40 protected references in 2019. Flag and lower leaves were assessed on different dates. Protected-plot severity is unobserved and is not assigned zero. Whole-year transfer tests absolute yield, while mixture and replicate holdouts test relative protected-reference gaps within 2019. </w:t>
+      </w:r>
+      <w:r>
+        <w:rPr>
+          <w:vertAlign w:val="superscript"/>
+        </w:rPr>
+        <w:t>[14, 15, 30]</w:t>
+      </w:r>
+    </w:p>
+    <w:p>
+      <w:r>
+        <w:t xml:space="preserve">German original site files supply protection comparisons matched by location, year, cultivar, nitrogen and source-coded water regime. Unsuffixed HN/LN × NF/WF treatments enter; drought-suffixed references remain separate. Original fractional disease scores and missing values are preserved. Harvest treatment means use all eligible positive yield observations; severity means use only recorded assessments, with their replicate coverage retained. The relative response is 1 − unprotected yield / protected yield. German dry-mass yields are not pooled with other sources for absolute-yield fitting. Entire site-years or geographic sites are excluded from fitting, and forward transfer fits 2015–2017 and evaluates 2018–2019. Cultivar identities may occur in both training and evaluation; these comparisons test environmental transfer rather than prediction for unseen cultivars. </w:t>
       </w:r>
       <w:r>
         <w:rPr>
@@ -174,343 +495,59 @@
     </w:p>
     <w:p>
       <w:r>
-        <w:t>Wheat phenology offsets part of the increase in disease damage</w:t>
+        <w:t>All prespecified candidate models are compared with their corresponding training-mean benchmark. Weights are equal among held-out trial, year or location groups and then among outcomes within groups. Ridge models standardize predictors using training data and use a fixed penalty of 0.1. Nordic model choice uses inner training-trial validation. Paired Nordic intervals resample entire trials conditional on fixed predictions; they exclude refitting uncertainty. The nonnegative assessment-stage model is a secondary diagnostic following inspection of the stage-regression slopes. Infection dates, functional canopy trajectories and cause-specific STB losses are not validation targets of these severity-based comparisons.</w:t>
       </w:r>
     </w:p>
     <w:p>
       <w:r>
-        <w:t>Changes in wheat phenology offset 70.6% of the increase in canopy damage attributable to weather under late-century SSP5–8.5 (Fig. 4). The weather contribution increased normalized HAD loss by 9.00 days, while wheat phenology reduced it by 6.36 days, giving a net increase of 2.64 days. All three climate models showed these opposing effects, with offsets of 63.6–80.3%. The decomposition uses 5,731 valid season pairs from 62 wheat-growing grid cells. Its net estimate is close to the full-grid increase of 2.66 days, although the two calculations use different sets of cells and valid seasons (Supplementary Tables S12a, b).</w:t>
-      </w:r>
-    </w:p>
-    <w:p>
-      <w:r>
-        <w:t>Flowering and soft dough advanced by 26.77 and 26.64 days after sowing, while mean grain-fill duration changed little. The wheat-phenology contribution combines changes in upper-leaf appearance and unfolding with shifts in flowering and soft-dough dates. These changes alter leaf availability and the seasonal weather experienced by the upper canopy. A −2.78-day weather–crop interaction was allocated equally between the two Shapley contributions. Twenty additional finite pairs were excluded because recombined weather and crop trajectories exceeded the accepted temperature range on an active day (Supplementary Fig. S16).</w:t>
-      </w:r>
-    </w:p>
-    <w:p>
-      <w:r>
-        <w:t>Sensitivity and prediction accuracy</w:t>
-      </w:r>
-    </w:p>
-    <w:p>
-      <w:r>
-        <w:t>All fourteen tested combinations of model structure, symptom detection and canopy assumptions gave earlier symptoms and increased HAD loss in all three climate models under late-century SSP5–8.5. Across these settings, mean symptom shifts spanned −5.46 to −1.54 days and HAD increases 0.63–2.80 days. These comparisons describe sensitivity to selected model assumptions and do not cover every source of uncertainty in future disease outbreaks (Supplementary Fig. S15; Supplementary Table S10).</w:t>
-      </w:r>
-    </w:p>
-    <w:p>
-      <w:r>
-        <w:t>Pooled field evaluation gave mean symptom-onset error outside the observation interval of 5.32 days versus 2.79 days for the phenology benchmark across 136 histories. The paired difference was +2.54 days (95% grouped-bootstrap interval 1.15–3.93). Across 2,033 disease assessments from 188 field seasons, severity RMSE was 31.19 versus 29.83 percentage points, with model bias -17.56 points. The paired RMSE difference was +1.36 points (95% interval -0.20–2.82). Wheat-stage predictions had station-held-out MAE of 8.02 days across 40,878 events. Disease prediction accuracy remains a major limitation on the interpretation of future damage magnitudes (Supplementary Figs. S18 and S20; Supplementary Tables S1–S4).</w:t>
-      </w:r>
-    </w:p>
-    <w:p>
-      <w:r>
-        <w:t>Discussion</w:t>
-      </w:r>
-    </w:p>
-    <w:p>
-      <w:r>
-        <w:t>The simulations project increasing average Septoria damage across European wheat-growing areas, alongside decreases in some regions. These differences arise from weather effects on disease combined with changes in wheat phenology. Because symptoms were predicted in almost every season, symptom presence alone was a weak measure of the projected change. The timing of symptoms and the amount of healthy canopy lost during grain filling provided more information about the modelled disease impact.</w:t>
-      </w:r>
-    </w:p>
-    <w:p>
-      <w:r>
-        <w:t xml:space="preserve">The analysis links three processes: weather affects wheat phenology and disease progression; wheat phenology determines the leaves and seasonal conditions available to the disease; and disease damage reduces the assumed healthy canopy contributing to grain filling. The opposing weather and phenology contributions show why favourable infection conditions do not translate directly into proportional increases in canopy damage. The crop–disease interaction is represented through leaf availability and timing. Disease damage is converted to a yield estimate after simulation, while disease feedback on wheat phenology and a complete crop carbon balance are absent. These distinctions separate the projected disease component from the total effect of climate change on wheat production. </w:t>
+        <w:t xml:space="preserve">Additional source reconciliation preserves unique harvest units across repeated disease assessments and parallel archive copies. The Swiss and French records retain ordinal disease scores without conversion to percentage leaf area. The Swiss exploratory protocol was specified after source inspection and before fitting; it was not preregistered. Six fixed ridge models compare training means, ordinal STB categories, cultivar composition and management, and recorded co-disease ratings. Encoding, scaling and fitting use training folds only. Primary validation excludes entire Swiss locations; a secondary analysis excludes site-years. Harvest-derived predictors are excluded. Reported errors give site-years equal weight. Five-site resampling describes stability of fixed out-of-fold comparisons and excludes parameter-selection and refitting uncertainty. The single French environment supplies measurement and yield-source checks rather than an environmental-transfer test. </w:t>
       </w:r>
       <w:r>
         <w:rPr>
           <w:vertAlign w:val="superscript"/>
         </w:rPr>
-        <w:t>[3, 4, 5]</w:t>
+        <w:t>[17, 18]</w:t>
       </w:r>
     </w:p>
     <w:p>
       <w:r>
-        <w:t>The regional contrasts identify areas where crop and disease observations would be informative for adaptation trials. Greater projected damage in Boreal and Atlantic wheat-growing areas warrants testing disease resistance, crop calendars and canopy persistence together. Declining disease damage in the Mediterranean region also requires field verification because a decline in the disease component does not establish an increase in total grain yield. Country estimates describe the area included in the fixed wheat grid and imposed winter-wheat calendar. Differences in cultivar, irrigation, crop management and cross-border grid assignment limit their interpretation as national forecasts.</w:t>
+        <w:t>Reproducibility</w:t>
       </w:r>
     </w:p>
     <w:p>
       <w:r>
-        <w:t xml:space="preserve">The link from disease damage to grain yield is the least directly validated part of the analysis. Disease-assessment percentages, functional canopy loss and grain yield describe different quantities. The assumed conversion from disease damage to functional loss requires physiological measurements, and the published HAD–yield coefficients were fitted to a wider growth-stage interval than the main flowering-to-soft-dough calculation. The available treatment means span mixed diseases and give poor absolute-yield predictions across genetic backgrounds. Canopy-based yield estimates remain conditional indices, with actual production losses requiring compatible measurements of leaf area, canopy function and grain yield. </w:t>
+        <w:t>Annual outputs record input-weather identities, model configurations, grid-cell order, numerical checks and output hashes. Aggregation records source hashes, counts of valid pairs and spatial coverage for each metric. Independent calculations check pooled field scores and selected full-grid regional means. Source Data contains figure and table values. The public repository regenerates documents from completed numerical evidence; a climate-driven model rerun additionally requires the external raw weather products.</w:t>
+      </w:r>
+    </w:p>
+    <w:p>
+      <w:r>
+        <w:t>Data availability</w:t>
+      </w:r>
+    </w:p>
+    <w:p>
+      <w:r>
+        <w:t xml:space="preserve">Source data and numerical evidence supporting the findings are deposited at https://github.com/SmartAG-Team/paper_cc_impact_wheat_disease, with the manuscript-specific files in publication/european_wheat_stb. The repository is publicly accessible. Dataset references identify the public disease archives, the Nordic Field Trial System, Tunisian cultivar-mixture observations, German multi-environment field data, Swiss and French cultivar-mixture observations, NEX-GDDP-CMIP6v2 climate data, GGCMI calendars, SPAM2020 wheat area and EEA environmental boundaries. Source_Data.xlsx contains completed grid summaries, environmental-region and country statistics, area shares by direction of change, pooled field evaluation, published canopy–yield evidence, grouped yield-response tests, fixed-production exposure and common-population timing comparisons. Original labels and assessment definitions remain in the underlying records. </w:t>
       </w:r>
       <w:r>
         <w:rPr>
           <w:vertAlign w:val="superscript"/>
         </w:rPr>
-        <w:t>[2, 11, 12]</w:t>
+        <w:t>[14, 16, 17, 18, 24, 25, 26, 27, 28, 29, 30]</w:t>
       </w:r>
     </w:p>
     <w:p>
       <w:r>
-        <w:t xml:space="preserve">A physiological yield calculation requires crop condition as well as disease severity. Layer-specific green leaf area determines light interception, while grain formation depends on pre-anthesis reserves, grain number and assimilate supply during grain filling. Published damage frameworks represent these pathways within crop-growth models, including WOFOST and DSSAT formulations. The field comparisons support this distinction: lower regression error alone does not establish a physiological loss function, and observations without compatible leaf area and timing cannot identify its parameters. Crop-growth calibration and evaluation of disease-related yield loss require separate field environments. </w:t>
-      </w:r>
-      <w:r>
-        <w:rPr>
-          <w:vertAlign w:val="superscript"/>
-        </w:rPr>
-        <w:t>[17, 18, 19]</w:t>
+        <w:t>The repository includes completed summaries, selected diagnostic outputs, input and output hashes, and numerical evidence for document regeneration. The complete raw climate and annual-output archives are external because of their size. Model reruns require the recorded climate products and adjustment files. Raw plot observations and physiological measurements unavailable in the source studies are not reconstructed.</w:t>
       </w:r>
     </w:p>
     <w:p>
       <w:r>
-        <w:t>Disease-model performance adds substantial uncertainty. The model had greater symptom-onset error than the phenology benchmark and underestimated measured disease severity. High symptom-detection sensitivity with low specificity is consistent with the near-universal symptom occurrence in the simulations. Added developmental stages, including the end of the grain-filling interval, have limited informative field observations. Agreement among climate models cannot establish epidemic prediction accuracy. Reconstructed humidity, fixed inoculum assumptions, cultivar resistance and future pathogen adaptation also affect the applicability of the projected changes.</w:t>
+        <w:t>Code availability</w:t>
       </w:r>
     </w:p>
     <w:p>
       <w:r>
-        <w:t xml:space="preserve">Regional adaptation assessments for European wheat need to consider disease resistance alongside crop phenology and canopy persistence. Coordinated observations of crop stages, disease symptoms, healthy leaf area and harvested grain would help identify whether adaptation reduces exposure, prevents damage or improves yield tolerance. Resistance and calendar trials across contrasting regions can evaluate these mechanisms under consistent measurement definitions. Intervention effectiveness and effects on production require validation in field trials. </w:t>
-      </w:r>
-      <w:r>
-        <w:rPr>
-          <w:vertAlign w:val="superscript"/>
-        </w:rPr>
-        <w:t>[20, 21]</w:t>
-      </w:r>
-    </w:p>
-    <w:p>
-      <w:r>
-        <w:t>Methods</w:t>
-      </w:r>
-    </w:p>
-    <w:p>
-      <w:r>
-        <w:t>Wheat-growing area and climate data</w:t>
-      </w:r>
-    </w:p>
-    <w:p>
-      <w:r>
-        <w:t xml:space="preserve">The European SPAM2020 all-wheat registry contains 14,941 cells with positive harvested wheat area at 0.25° resolution. A fixed GGCMI winter-wheat rainfed calendar is available for 14,932 cells; nine cells have unavailable simulation outcomes. The all-wheat area mask combined with a winter-wheat rainfed calendar defines the crop-management scenario. It is not a census of observed winter-wheat management. Harvested area provides fixed weights for spatial aggregation. Supplementary Fig. S21 shows the study area, field-observation locations and environmental regions. </w:t>
-      </w:r>
-      <w:r>
-        <w:rPr>
-          <w:vertAlign w:val="superscript"/>
-        </w:rPr>
-        <w:t>[22, 23]</w:t>
-      </w:r>
-    </w:p>
-    <w:p>
-      <w:r>
-        <w:t xml:space="preserve">Daily NEX-GDDP-CMIP6v2 data represent ACCESS-CM2, MPI-ESM1-2-HR and MRI-ESM2-0 under SSP1–2.6, SSP2–4.5 and SSP5–8.5. The harvest periods are 1991–2020, 2031–2060 and 2071–2100. The 810 model–scenario–year combinations cover 12,094,920 calendar-eligible grid-seasons. Monthly adjustment coefficients align climate variables with the reference weather data, with separate historical adjustments for each SSP continuation. Daily series include the preceding calendar year to represent overwintering seasons. Input files, adjustment coefficients and model configurations are identified by checksums. </w:t>
-      </w:r>
-      <w:r>
-        <w:rPr>
-          <w:vertAlign w:val="superscript"/>
-        </w:rPr>
-        <w:t>[24]</w:t>
-      </w:r>
-    </w:p>
-    <w:p>
-      <w:r>
-        <w:t>Disease calculations use daily temperature, relative humidity and rainfall. A synthetic reconstruction of humidity within each day estimates moisture exposure from daily forcing; it does not supply measured leaf wetness. Missing weather and daily mean temperatures above 40 °C produce unavailable outcomes under the model input rules.</w:t>
-      </w:r>
-    </w:p>
-    <w:p>
-      <w:r>
-        <w:t>Linking wheat phenology to Septoria disease</w:t>
-      </w:r>
-    </w:p>
-    <w:p>
-      <w:r>
-        <w:t xml:space="preserve">A temperature–photoperiod–vernalization model calculates wheat phenological stages from sowing to soft dough. Additional ordered developmental thresholds determine upper-leaf appearance and unfolding, and a calibrated flowering threshold defines the start of the grain-filling interval. These crop trajectories determine which leaves are available to infection and the seasonal weather experienced by each leaf. The Septoria module calculates disease establishment, progression and visible damage using weather and these leaf trajectories. Disease damage does not alter the calculated crop-development trajectory. Model equations, parameter sources and observation definitions appear in the supplementary model specification and the 84-entry parameter inventory. </w:t>
-      </w:r>
-      <w:r>
-        <w:rPr>
-          <w:vertAlign w:val="superscript"/>
-        </w:rPr>
-        <w:t>[6, 7, 8, 9, 10]</w:t>
-      </w:r>
-    </w:p>
-    <w:p>
-      <w:r>
-        <w:t>Calibrated parameters remain fixed across climate scenarios. The maximum reference LAI of the upper three leaves is one, divided equally among leaves and scaled by unfolding. Cultivar-specific canopy area and future changes in resistance are not estimated. Soft dough marks season completion. Missing crop calendars, invalid weather and failure to reach the endpoint remain separate unavailable outcomes, rather than zero disease or zero loss.</w:t>
-      </w:r>
-    </w:p>
-    <w:p>
-      <w:r>
-        <w:t>Symptoms, canopy damage and healthy-area duration</w:t>
-      </w:r>
-    </w:p>
-    <w:p>
-      <w:r>
-        <w:t>Symptom frequency is the fraction of complete simulated seasons with detectable flag-leaf symptoms before soft dough. First-symptom timing is measured relative to flowering or sowing and is unavailable when symptoms are not detected. Symptomatic grain-fill days count days with detectable flag-leaf symptoms between flowering and soft dough. Symptoms are visible model states following disease development; their dates are distinct from the modelled dates of initial infection.</w:t>
-      </w:r>
-    </w:p>
-    <w:p>
-      <w:r>
-        <w:t xml:space="preserve">The disease-damage fraction after symptom detection is treated as the fraction of reference leaf area that has lost function. This assumption connects modelled disease to canopy damage. HAD loss integrates this fraction multiplied by daily reference leaf area across the flag leaf and two leaves below it. The primary interval is flowering to soft dough (GS65–85), with GS31–85 used for sensitivity analysis. HAD and disease-induced HAD loss have units of green leaf area index multiplied by days (GLAI-days). Normalized HAD loss divides the time-integrated functional loss by maximum reference upper-canopy LAI and expresses it as equivalent days of reference canopy function lost. With reference LAI equal to one, normalization leaves numerical values unchanged. Relative HAD loss is HAD loss divided by reference HAD, expressed as a percentage; it describes average accumulated canopy-function loss, not instantaneous lesion percentage. </w:t>
-      </w:r>
-      <w:r>
-        <w:rPr>
-          <w:vertAlign w:val="superscript"/>
-        </w:rPr>
-        <w:t>[2, 12]</w:t>
-      </w:r>
-    </w:p>
-    <w:p>
-      <w:r>
-        <w:t xml:space="preserve">Flowering provides a reference for grain filling rather than the start of disease simulation or a universal crop-protection threshold. Disease calculations begin during crop establishment and include upper-leaf appearance and unfolding before flowering. Stem extension and upper-leaf emergence define earlier exposure relevant to canopy protection. The GS65–85 integral describes grain-filling canopy damage; it does not quantify every effect of pre-flowering disease on grain number or assimilate reserves. </w:t>
-      </w:r>
-      <w:r>
-        <w:rPr>
-          <w:vertAlign w:val="superscript"/>
-        </w:rPr>
-        <w:t>[2, 17]</w:t>
-      </w:r>
-    </w:p>
-    <w:p>
-      <w:r>
-        <w:t>Historical–future comparisons and spatial summaries</w:t>
-      </w:r>
-    </w:p>
-    <w:p>
-      <w:r>
-        <w:t>Each future harvest year is paired with the corresponding position in the 30-year historical period for the same climate model and SSP. This indexing supports comparisons of period means without identifying historical and future years as the same physical event. A pair is included only when both metric values are finite. For grid i, x_i is the sum of valid paired differences divided by 30, and z_i is the number of valid pairs divided by 30. The grid mean change is x_i/z_i. Reference and future means use the same valid pairs. The valid seasons may differ among symptom timing, symptom frequency and canopy metrics.</w:t>
-      </w:r>
-    </w:p>
-    <w:p>
-      <w:r>
-        <w:t xml:space="preserve">For domain indicator I_i and fixed harvested area w_i, the mean change is Σw_i I_i x_i / Σw_i I_i z_i. Separate estimates for each climate model give the reported three-model mean and range. EEA 2016 boundaries assign environmental regions from wheat-cell centroids. Country assignment uses the dominant SPAM source-country label of each cell; cross-border cells are not divided among countries. Country estimates apply only to represented wheat cells within the study domain. Source Data includes all eight named environmental regions, outside-region and unassigned cells, and all country groups. </w:t>
-      </w:r>
-      <w:r>
-        <w:rPr>
-          <w:vertAlign w:val="superscript"/>
-        </w:rPr>
-        <w:t>[25]</w:t>
-      </w:r>
-    </w:p>
-    <w:p>
-      <w:r>
-        <w:t>Maps show model means at the native 0.25° grid resolution, without interpolation or filling unavailable cells. Area shares by direction of change use fixed harvested-area weights over cells with complete three-model estimates. Model ranges describe spread among three climate models and are not confidence intervals. All wheat cells are simulated, so full-grid estimates have no spatial-sampling Monte Carlo error. Other uncertainties include climate-model choice, model parameters, observations and the canopy–yield relationship. The twelve countries in Fig. 3 are selected by reference wheat area independently of the projected change.</w:t>
-      </w:r>
-    </w:p>
-    <w:p>
-      <w:r>
-        <w:t>Estimating the disease-related yield response</w:t>
-      </w:r>
-    </w:p>
-    <w:p>
-      <w:r>
-        <w:t xml:space="preserve">The estimated disease-related yield change is −b times the change in HAD loss. The reference coefficient b is 0.018 t ha⁻¹ per GLAI-day, with 0.0141 and 0.0207 used as fixed alternatives from the published upper-three-leaf study. Multiplication by 1,000 converts t ha⁻¹ to kg ha⁻¹. Results are expressed per unit reference upper-canopy LAI because actual canopy area is unspecified. The source relationship began at GS31, whereas the primary climate calculation covers GS65–85; its use in this shorter interval is an unvalidated adaptation. Coefficient alternatives represent cultivar differences, not statistical confidence limits. The calculation estimates a disease-related yield component under these assumptions, without modelling the direct effects of heat, water limitation, CO₂ or other stresses on total grain yield. Yield percentages and national production tonnages require independently validated canopy area and grain yield. </w:t>
-      </w:r>
-      <w:r>
-        <w:rPr>
-          <w:vertAlign w:val="superscript"/>
-        </w:rPr>
-        <w:t>[2, 11]</w:t>
-      </w:r>
-    </w:p>
-    <w:p>
-      <w:r>
-        <w:t>Separating weather and wheat-phenology effects</w:t>
-      </w:r>
-    </w:p>
-    <w:p>
-      <w:r>
-        <w:t>The decomposition and fourteen-setting sensitivity analysis use 64 harvested-area-proportional draws at 62 unique cells. Four simulations combine historical or future disease weather with historical or future wheat-phenology trajectories. Their differences separate weather and wheat-phenology contributions, with one half of their interaction allocated to each Shapley contribution. Of 5,751 finite historical–future pairs, 20 have an active day outside the accepted temperature range in a recombined trajectory and are excluded, leaving 5,731 pairs. Spatial Monte Carlo standard errors apply to this sample and are separate from full-grid climate estimates.</w:t>
-      </w:r>
-    </w:p>
-    <w:p>
-      <w:r>
-        <w:t>The phenology offset is −100 times the phenology contribution divided by the weather contribution, using identical valid pairs. The ensemble percentage is the ratio of three-model mean contributions. Sensitivity settings vary model structure, symptom detection, reference canopy area and damage-to-function conversion. These calculations assess model assumptions and do not represent trials of a sowing-date or cultivar intervention.</w:t>
-      </w:r>
-    </w:p>
-    <w:p>
-      <w:r>
-        <w:t>Field evaluation</w:t>
-      </w:r>
-    </w:p>
-    <w:p>
-      <w:r>
-        <w:t xml:space="preserve">Disease observations from the two public field archives are pooled after exclusion of calibration records and application of geographic eligibility criteria. The evaluation contains 2,033 assessments from 188 field seasons in 140 coordinate-years and 136 symptom-onset histories from 78 field seasons in 62 coordinate-years. Onset histories concern source-defined leaves 1–3 and have observations bracketing symptom appearance. Original identifiers, units and percentage denominators remain in the evidence files. Source leaf numbers do not establish a common final-leaf rank across archives. </w:t>
-      </w:r>
-      <w:r>
-        <w:rPr>
-          <w:vertAlign w:val="superscript"/>
-        </w:rPr>
-        <w:t>[26, 27]</w:t>
-      </w:r>
-    </w:p>
-    <w:p>
-      <w:r>
-        <w:t>Evaluation weights are equal among coordinate-years, fields within coordinate-years, source leaves within fields and assessments within leaves. Symptom-onset error measures distance outside the two-sided observation interval, with the predefined penalty for missed positive observations. Severity predictions are compared with the calibration-leaf-mean benchmark; timing and detection use the phenology benchmark selected on calibration data. Model and benchmark predictions are compared on identical records. The 95% intervals use 20,000 paired bootstrap resamples of entire coordinate-year groups. They describe uncertainty in these fixed predictions on reused retrospective observations and exclude parameter-selection uncertainty. Duplicate coordinate-year identities are grouped across archives.</w:t>
-      </w:r>
-    </w:p>
-    <w:p>
-      <w:r>
-        <w:t xml:space="preserve">Wheat phenological stage dates are evaluated on 40,878 matched events from German stations held out of calibration, at BBCH 10, 31, 51 and 85. Added leaf stages use pooled field observation intervals, with calibration observations reported separately. Evaluation of the canopy–yield relationship uses eight published treatment-mean contrasts across five genetic backgrounds, including STB, yellow rust and mixed disease. Leaving each background out of fitting gives backgrounds equal evaluation weight. Severity-based yield models use their specified held-out trial or year comparisons and corresponding training-mean benchmarks. </w:t>
-      </w:r>
-      <w:r>
-        <w:rPr>
-          <w:vertAlign w:val="superscript"/>
-        </w:rPr>
-        <w:t>[11]</w:t>
-      </w:r>
-    </w:p>
-    <w:p>
-      <w:r>
-        <w:t xml:space="preserve">Additional yield-response tests retain the measurement hierarchy of each public source. Nordic assessment dates sharing a treatment yield remain in the same trial fold; eight post-harvest assessments and three rows of a pooled-control alias are excluded. Stage zero remains missing. Tunisia supplies 82 unprotected plot-season yields with two leaf assessments per outcome and 40 protected references in 2019. Flag and lower leaves were assessed on different dates. Protected-plot severity is unobserved and is not assigned zero. Whole-year transfer tests absolute yield, while mixture and replicate holdouts test relative protected-reference gaps within 2019. </w:t>
-      </w:r>
-      <w:r>
-        <w:rPr>
-          <w:vertAlign w:val="superscript"/>
-        </w:rPr>
-        <w:t>[14, 15, 28]</w:t>
-      </w:r>
-    </w:p>
-    <w:p>
-      <w:r>
-        <w:t xml:space="preserve">German original site files supply protection comparisons matched by location, year, cultivar, nitrogen and source-coded water regime. Unsuffixed HN/LN × NF/WF treatments enter; drought-suffixed references remain separate. Original fractional disease scores and missing values are preserved. Harvest treatment means use all eligible positive yield observations; severity means use only recorded assessments, with their replicate coverage retained. The relative response is 1 − unprotected yield / protected yield. German dry-mass yields are not pooled with other sources for absolute-yield fitting. Entire site-years or geographic sites are excluded from fitting, and forward transfer fits 2015–2017 and evaluates 2018–2019. Cultivar identities may occur in both training and evaluation; these comparisons test environmental transfer rather than prediction for unseen cultivars. </w:t>
-      </w:r>
-      <w:r>
-        <w:rPr>
-          <w:vertAlign w:val="superscript"/>
-        </w:rPr>
-        <w:t>[16]</w:t>
-      </w:r>
-    </w:p>
-    <w:p>
-      <w:r>
-        <w:t>All prespecified candidate models are compared with their corresponding training-mean benchmark. Weights are equal among held-out trial, year or location groups and then among outcomes within groups. Ridge models standardize predictors using training data and use a fixed penalty of 0.1. Nordic model choice uses inner training-trial validation. Paired Nordic intervals resample entire trials conditional on fixed predictions; they exclude refitting uncertainty. The nonnegative assessment-stage model is a secondary diagnostic following inspection of the stage-regression slopes. Infection dates, functional canopy trajectories and cause-specific STB losses are not validation targets of these severity-based comparisons.</w:t>
-      </w:r>
-    </w:p>
-    <w:p>
-      <w:r>
-        <w:t>Reproducibility</w:t>
-      </w:r>
-    </w:p>
-    <w:p>
-      <w:r>
-        <w:t>Annual outputs record input-weather identities, model configurations, grid-cell order, numerical checks and output hashes. Aggregation records source hashes, counts of valid pairs and spatial coverage for each metric. Independent calculations check pooled field scores and selected full-grid regional means. Source Data contains figure and table values. The software archive regenerates documents from completed numerical evidence; a climate-driven model rerun additionally requires the external raw weather products.</w:t>
-      </w:r>
-    </w:p>
-    <w:p>
-      <w:r>
-        <w:t>Data availability</w:t>
-      </w:r>
-    </w:p>
-    <w:p>
-      <w:r>
-        <w:t xml:space="preserve">Source data and numerical evidence supporting the findings are deposited at https://github.com/SmartAG-Team/paper_cc_impact_wheat_disease, with the manuscript-specific files in publication/european_wheat_stb. The repository is private during manuscript preparation. Dataset references identify the public disease archives, the Nordic Field Trial System, Tunisian cultivar-mixture observations, German multi-environment field data, NEX-GDDP-CMIP6v2 climate data, GGCMI calendars, SPAM2020 wheat area and EEA environmental boundaries. Source_Data.xlsx contains completed grid summaries, environmental-region and country statistics, area shares by direction of change, pooled field evaluation, published canopy–yield evidence and the additional grouped yield-response tests. Original labels and assessment definitions remain in the underlying records. </w:t>
-      </w:r>
-      <w:r>
-        <w:rPr>
-          <w:vertAlign w:val="superscript"/>
-        </w:rPr>
-        <w:t>[14, 16, 22, 23, 24, 25, 26, 27, 28]</w:t>
-      </w:r>
-    </w:p>
-    <w:p>
-      <w:r>
-        <w:t>The repository includes completed summaries, selected diagnostic outputs, input and output hashes, and numerical evidence for document regeneration. The complete raw climate and annual-output archives are external because of their size. Model reruns require the recorded climate products and adjustment files. Raw plot observations and physiological measurements unavailable in the source studies are not reconstructed.</w:t>
-      </w:r>
-    </w:p>
-    <w:p>
-      <w:r>
-        <w:t>Code availability</w:t>
-      </w:r>
-    </w:p>
-    <w:p>
-      <w:r>
-        <w:t>Simulation, statistical-analysis and document-generation code are deposited in the same repository, which remains private during manuscript preparation. The repository includes evidence manifests and an executed field-yield validation notebook. REPRODUCIBILITY.txt documents regeneration and model-rerun requirements. The supplementary model specification contains 29 numbered equations, and Parameter_inventory.csv records 84 fixed, fitted and scenario quantities.</w:t>
+        <w:t>Simulation, statistical-analysis and document-generation code are deposited in the same repository, which is publicly accessible. The repository includes evidence manifests and an executed field-yield validation notebook. REPRODUCIBILITY.txt documents regeneration and model-rerun requirements. The supplementary model specification contains 29 numbered equations, and Parameter_inventory.csv records 84 fixed, fitted and scenario quantities.</w:t>
       </w:r>
     </w:p>
     <w:p>
@@ -1179,25 +1216,19 @@
         <w:rPr>
           <w:i w:val="0"/>
         </w:rPr>
-        <w:t xml:space="preserve">Bancal, M.-O., Robert, C. &amp; Ney, B. Modelling wheat growth and yield losses from late epidemics of foliar diseases using loss of green leaf area per layer and pre-anthesis reserves. </w:t>
+        <w:t xml:space="preserve">Stefan, L. </w:t>
       </w:r>
       <w:r>
         <w:rPr>
           <w:i/>
         </w:rPr>
-        <w:t>Annals of Botany</w:t>
+        <w:t>et al.</w:t>
       </w:r>
       <w:r>
         <w:rPr>
           <w:i w:val="0"/>
         </w:rPr>
-        <w:t>100</w:t>
-      </w:r>
-      <w:r>
-        <w:rPr>
-          <w:i w:val="0"/>
-        </w:rPr>
-        <w:t>, 777–789 (2007).</w:t>
+        <w:t xml:space="preserve"> Agronomic performance of cultivar mixtures of winter wheat varieties, obtained from mixture field trials at 5 locations in Switzerland from 2019 to 2020, together with yield data from the varieties in pure stand obtained from the national variety testing trial network. Zenodo https://doi.org/10.5281/zenodo.17432866 (2023).</w:t>
       </w:r>
     </w:p>
     <w:p>
@@ -1214,37 +1245,19 @@
         <w:rPr>
           <w:i w:val="0"/>
         </w:rPr>
-        <w:t xml:space="preserve">Bancal, P., Bancal, M.-O., Collin, F. &amp; Gouache, D. Identifying traits leading to tolerance of wheat to </w:t>
+        <w:t xml:space="preserve">Montazeaud, G. </w:t>
       </w:r>
       <w:r>
         <w:rPr>
           <w:i/>
         </w:rPr>
-        <w:t>Septoria tritici</w:t>
+        <w:t>et al.</w:t>
       </w:r>
       <w:r>
         <w:rPr>
           <w:i w:val="0"/>
         </w:rPr>
-        <w:t xml:space="preserve"> blotch. </w:t>
-      </w:r>
-      <w:r>
-        <w:rPr>
-          <w:i/>
-        </w:rPr>
-        <w:t>Field Crops Research</w:t>
-      </w:r>
-      <w:r>
-        <w:rPr>
-          <w:i w:val="0"/>
-        </w:rPr>
-        <w:t>180</w:t>
-      </w:r>
-      <w:r>
-        <w:rPr>
-          <w:i w:val="0"/>
-        </w:rPr>
-        <w:t>, 176–185 (2015).</w:t>
+        <w:t xml:space="preserve"> Data from: “From cultivar mixtures to allelic mixtures: opposite effects of allelic richness between genotypes and genotype richness in wheat.” Zenodo https://doi.org/10.5281/zenodo.5393959 (2021).</w:t>
       </w:r>
     </w:p>
     <w:p>
@@ -1261,37 +1274,19 @@
         <w:rPr>
           <w:i w:val="0"/>
         </w:rPr>
-        <w:t xml:space="preserve">Bregaglio, S. </w:t>
+        <w:t xml:space="preserve">European Commission. </w:t>
       </w:r>
       <w:r>
         <w:rPr>
           <w:i/>
         </w:rPr>
-        <w:t>et al.</w:t>
+        <w:t>A Vision for Agriculture and Food</w:t>
       </w:r>
       <w:r>
         <w:rPr>
           <w:i w:val="0"/>
         </w:rPr>
-        <w:t xml:space="preserve"> Comparing process-based wheat growth models in their simulation of yield losses caused by plant diseases. </w:t>
-      </w:r>
-      <w:r>
-        <w:rPr>
-          <w:i/>
-        </w:rPr>
-        <w:t>Field Crops Research</w:t>
-      </w:r>
-      <w:r>
-        <w:rPr>
-          <w:i w:val="0"/>
-        </w:rPr>
-        <w:t>265</w:t>
-      </w:r>
-      <w:r>
-        <w:rPr>
-          <w:i w:val="0"/>
-        </w:rPr>
-        <w:t>, 108108 (2021).</w:t>
+        <w:t>. https://eur-lex.europa.eu/legal-content/EN/TXT/?uri=CELEX%3A52025DC0075 (2025).</w:t>
       </w:r>
     </w:p>
     <w:p>
@@ -1355,19 +1350,25 @@
         <w:rPr>
           <w:i w:val="0"/>
         </w:rPr>
-        <w:t xml:space="preserve">European Commission. </w:t>
+        <w:t xml:space="preserve">Bancal, M.-O., Robert, C. &amp; Ney, B. Modelling wheat growth and yield losses from late epidemics of foliar diseases using loss of green leaf area per layer and pre-anthesis reserves. </w:t>
       </w:r>
       <w:r>
         <w:rPr>
           <w:i/>
         </w:rPr>
-        <w:t>A Vision for Agriculture and Food</w:t>
+        <w:t>Annals of Botany</w:t>
       </w:r>
       <w:r>
         <w:rPr>
           <w:i w:val="0"/>
         </w:rPr>
-        <w:t>. https://eur-lex.europa.eu/legal-content/EN/TXT/?uri=CELEX%3A52025DC0075 (2025).</w:t>
+        <w:t>100</w:t>
+      </w:r>
+      <w:r>
+        <w:rPr>
+          <w:i w:val="0"/>
+        </w:rPr>
+        <w:t>, 777–789 (2007).</w:t>
       </w:r>
     </w:p>
     <w:p>
@@ -1384,7 +1385,37 @@
         <w:rPr>
           <w:i w:val="0"/>
         </w:rPr>
-        <w:t>International Food Policy Research Institute. Global Spatially-Disaggregated Crop Production Statistics Data for 2020, SPAM2020 v2r2. Harvard Dataverse https://doi.org/10.7910/DVN/SWPENT (2026).</w:t>
+        <w:t xml:space="preserve">Bancal, P., Bancal, M.-O., Collin, F. &amp; Gouache, D. Identifying traits leading to tolerance of wheat to </w:t>
+      </w:r>
+      <w:r>
+        <w:rPr>
+          <w:i/>
+        </w:rPr>
+        <w:t>Septoria tritici</w:t>
+      </w:r>
+      <w:r>
+        <w:rPr>
+          <w:i w:val="0"/>
+        </w:rPr>
+        <w:t xml:space="preserve"> blotch. </w:t>
+      </w:r>
+      <w:r>
+        <w:rPr>
+          <w:i/>
+        </w:rPr>
+        <w:t>Field Crops Research</w:t>
+      </w:r>
+      <w:r>
+        <w:rPr>
+          <w:i w:val="0"/>
+        </w:rPr>
+        <w:t>180</w:t>
+      </w:r>
+      <w:r>
+        <w:rPr>
+          <w:i w:val="0"/>
+        </w:rPr>
+        <w:t>, 176–185 (2015).</w:t>
       </w:r>
     </w:p>
     <w:p>
@@ -1401,7 +1432,37 @@
         <w:rPr>
           <w:i w:val="0"/>
         </w:rPr>
-        <w:t>Jägermeyr, J., Müller, C., Minoli, S., Ray, D. &amp; Siebert, S. GGCMI Phase 3 crop calendar. Zenodo https://doi.org/10.5281/zenodo.5062513 (2021).</w:t>
+        <w:t xml:space="preserve">Bregaglio, S. </w:t>
+      </w:r>
+      <w:r>
+        <w:rPr>
+          <w:i/>
+        </w:rPr>
+        <w:t>et al.</w:t>
+      </w:r>
+      <w:r>
+        <w:rPr>
+          <w:i w:val="0"/>
+        </w:rPr>
+        <w:t xml:space="preserve"> Comparing process-based wheat growth models in their simulation of yield losses caused by plant diseases. </w:t>
+      </w:r>
+      <w:r>
+        <w:rPr>
+          <w:i/>
+        </w:rPr>
+        <w:t>Field Crops Research</w:t>
+      </w:r>
+      <w:r>
+        <w:rPr>
+          <w:i w:val="0"/>
+        </w:rPr>
+        <w:t>265</w:t>
+      </w:r>
+      <w:r>
+        <w:rPr>
+          <w:i w:val="0"/>
+        </w:rPr>
+        <w:t>, 108108 (2021).</w:t>
       </w:r>
     </w:p>
     <w:p>
@@ -1418,19 +1479,7 @@
         <w:rPr>
           <w:i w:val="0"/>
         </w:rPr>
-        <w:t xml:space="preserve">NASA Center for Climate Simulation. </w:t>
-      </w:r>
-      <w:r>
-        <w:rPr>
-          <w:i/>
-        </w:rPr>
-        <w:t>NEX-GDDP-CMIP6 Version 2 Technical Note</w:t>
-      </w:r>
-      <w:r>
-        <w:rPr>
-          <w:i w:val="0"/>
-        </w:rPr>
-        <w:t>. https://www.nccs.nasa.gov/wp-content/uploads/2025/06/NEX-GDDP-CMIP6-v2-Tech_Note.pdf (2025).</w:t>
+        <w:t>International Food Policy Research Institute. Global Spatially-Disaggregated Crop Production Statistics Data for 2020, SPAM2020 v2r2. Harvard Dataverse https://doi.org/10.7910/DVN/SWPENT (2026).</w:t>
       </w:r>
     </w:p>
     <w:p>
@@ -1447,7 +1496,7 @@
         <w:rPr>
           <w:i w:val="0"/>
         </w:rPr>
-        <w:t>European Environment Agency. Biogeographical regions, Europe 2016, version 1. (2016).</w:t>
+        <w:t>Jägermeyr, J., Müller, C., Minoli, S., Ray, D. &amp; Siebert, S. GGCMI Phase 3 crop calendar. Zenodo https://doi.org/10.5281/zenodo.5062513 (2021).</w:t>
       </w:r>
     </w:p>
     <w:p>
@@ -1464,7 +1513,19 @@
         <w:rPr>
           <w:i w:val="0"/>
         </w:rPr>
-        <w:t>Holst, N. Data from 56 fungicide trials in wheat fields across Europe 2017–2019. Zenodo https://doi.org/10.5281/zenodo.6521175 (2022).</w:t>
+        <w:t xml:space="preserve">NASA Center for Climate Simulation. </w:t>
+      </w:r>
+      <w:r>
+        <w:rPr>
+          <w:i/>
+        </w:rPr>
+        <w:t>NEX-GDDP-CMIP6 Version 2 Technical Note</w:t>
+      </w:r>
+      <w:r>
+        <w:rPr>
+          <w:i w:val="0"/>
+        </w:rPr>
+        <w:t>. https://www.nccs.nasa.gov/wp-content/uploads/2025/06/NEX-GDDP-CMIP6-v2-Tech_Note.pdf (2025).</w:t>
       </w:r>
     </w:p>
     <w:p>
@@ -1481,7 +1542,7 @@
         <w:rPr>
           <w:i w:val="0"/>
         </w:rPr>
-        <w:t>Holst, N. &amp; Donner, M. Data from 168 fungicide trials in wheat fields across Europe 2014–2018. Zenodo https://doi.org/10.5281/zenodo.6352615 (2022).</w:t>
+        <w:t>European Environment Agency. Biogeographical regions, Europe 2016, version 1. (2016).</w:t>
       </w:r>
     </w:p>
     <w:p>
@@ -1498,6 +1559,40 @@
         <w:rPr>
           <w:i w:val="0"/>
         </w:rPr>
+        <w:t>Holst, N. Data from 56 fungicide trials in wheat fields across Europe 2017–2019. Zenodo https://doi.org/10.5281/zenodo.6521175 (2022).</w:t>
+      </w:r>
+    </w:p>
+    <w:p>
+      <w:pPr>
+        <w:ind w:left="432" w:hanging="432"/>
+      </w:pPr>
+      <w:r>
+        <w:rPr>
+          <w:i w:val="0"/>
+        </w:rPr>
+        <w:t>29.</w:t>
+      </w:r>
+      <w:r>
+        <w:rPr>
+          <w:i w:val="0"/>
+        </w:rPr>
+        <w:t>Holst, N. &amp; Donner, M. Data from 168 fungicide trials in wheat fields across Europe 2014–2018. Zenodo https://doi.org/10.5281/zenodo.6352615 (2022).</w:t>
+      </w:r>
+    </w:p>
+    <w:p>
+      <w:pPr>
+        <w:ind w:left="432" w:hanging="432"/>
+      </w:pPr>
+      <w:r>
+        <w:rPr>
+          <w:i w:val="0"/>
+        </w:rPr>
+        <w:t>30.</w:t>
+      </w:r>
+      <w:r>
+        <w:rPr>
+          <w:i w:val="0"/>
+        </w:rPr>
         <w:t xml:space="preserve">Karisto, P. </w:t>
       </w:r>
       <w:r>
@@ -1550,7 +1645,7 @@
     </w:p>
     <w:p>
       <w:r>
-        <w:t>Table 1 | Late-century climate impacts across European wheat environmental regions. Values are harvested-area-weighted three-climate-model mean paired changes under SSP5–8.5 in 2071–2100 relative to 1991–2020. Positive normalized HAD-loss and relative HAD-loss changes indicate greater accumulated loss of assumed canopy function; negative timing changes indicate earlier symptoms relative to flowering. Estimated disease-related yield change uses the fixed coefficient 0.018 t ha⁻¹ per GLAI-day and a nominal upper-three-leaf reference LAI of one. The yield column reports a disease-related index, not validated harvested yield. Model ranges, exact regional areas and valid-season coverage are supplied in Supplementary Table S13.</w:t>
+        <w:t>Table 1 | Baseline wheat production exposed to increasing canopy damage under late-century SSP5–8.5. Production with all-model increases sums fixed SPAM2020 production in cells with greater normalized HAD loss in all three climate models in 2071–2100 relative to 1991–2020. Shares use all reference production within each domain, including cells with unavailable climate responses. Mt denotes million tonnes of baseline production represented, not tonnes lost. Continuous HAD changes use production and metric-valid paired-season weights within each model, followed by equal model weighting; ranges are not confidence intervals. Europe also includes outside-region and unassigned cells. All-wheat production is represented by an imposed winter-wheat rainfed calendar.</w:t>
       </w:r>
     </w:p>
     <w:tbl>
@@ -1580,7 +1675,7 @@
                 <w:b/>
                 <w:sz w:val="16"/>
               </w:rPr>
-              <w:t>Environmental region</w:t>
+              <w:t>Region</w:t>
             </w:r>
           </w:p>
         </w:tc>
@@ -1597,7 +1692,7 @@
                 <w:b/>
                 <w:sz w:val="16"/>
               </w:rPr>
-              <w:t>Δ normalized HAD loss (days)</w:t>
+              <w:t>Baseline production (Mt)</w:t>
             </w:r>
           </w:p>
         </w:tc>
@@ -1614,7 +1709,7 @@
                 <w:b/>
                 <w:sz w:val="16"/>
               </w:rPr>
-              <w:t>Δ symptom timing (days)</w:t>
+              <w:t>Production with all-model increases (Mt)</w:t>
             </w:r>
           </w:p>
         </w:tc>
@@ -1631,7 +1726,7 @@
                 <w:b/>
                 <w:sz w:val="16"/>
               </w:rPr>
-              <w:t>Δ relative HAD loss (pp)</w:t>
+              <w:t>Share of baseline (%)</w:t>
             </w:r>
           </w:p>
         </w:tc>
@@ -1648,7 +1743,7 @@
                 <w:b/>
                 <w:sz w:val="16"/>
               </w:rPr>
-              <w:t>Estimated Δ yield (kg ha⁻¹ per unit LAI)</w:t>
+              <w:t>Production-weighted HAD change (days; model range)</w:t>
             </w:r>
           </w:p>
         </w:tc>
@@ -1684,7 +1779,7 @@
                 <w:b w:val="0"/>
                 <w:sz w:val="16"/>
               </w:rPr>
-              <w:t>+2.66</w:t>
+              <w:t>241.84</w:t>
             </w:r>
           </w:p>
         </w:tc>
@@ -1701,7 +1796,7 @@
                 <w:b w:val="0"/>
                 <w:sz w:val="16"/>
               </w:rPr>
-              <w:t>-3.46</w:t>
+              <w:t>162.21</w:t>
             </w:r>
           </w:p>
         </w:tc>
@@ -1718,7 +1813,7 @@
                 <w:b w:val="0"/>
                 <w:sz w:val="16"/>
               </w:rPr>
-              <w:t>+8.04</w:t>
+              <w:t>67.1</w:t>
             </w:r>
           </w:p>
         </w:tc>
@@ -1735,7 +1830,7 @@
                 <w:b w:val="0"/>
                 <w:sz w:val="16"/>
               </w:rPr>
-              <w:t>-47.8</w:t>
+              <w:t>+3.36 (+1.38 to +5.69)</w:t>
             </w:r>
           </w:p>
         </w:tc>
@@ -1771,7 +1866,7 @@
                 <w:b w:val="0"/>
                 <w:sz w:val="16"/>
               </w:rPr>
-              <w:t>+4.85</w:t>
+              <w:t>44.58</w:t>
             </w:r>
           </w:p>
         </w:tc>
@@ -1788,7 +1883,7 @@
                 <w:b w:val="0"/>
                 <w:sz w:val="16"/>
               </w:rPr>
-              <w:t>-3.23</w:t>
+              <w:t>29.18</w:t>
             </w:r>
           </w:p>
         </w:tc>
@@ -1805,7 +1900,7 @@
                 <w:b w:val="0"/>
                 <w:sz w:val="16"/>
               </w:rPr>
-              <w:t>+15.35</w:t>
+              <w:t>65.5</w:t>
             </w:r>
           </w:p>
         </w:tc>
@@ -1822,7 +1917,7 @@
                 <w:b w:val="0"/>
                 <w:sz w:val="16"/>
               </w:rPr>
-              <w:t>-87.3</w:t>
+              <w:t>+5.06 (+0.66 to +8.57)</w:t>
             </w:r>
           </w:p>
         </w:tc>
@@ -1858,7 +1953,7 @@
                 <w:b w:val="0"/>
                 <w:sz w:val="16"/>
               </w:rPr>
-              <w:t>+3.45</w:t>
+              <w:t>106.62</w:t>
             </w:r>
           </w:p>
         </w:tc>
@@ -1875,7 +1970,7 @@
                 <w:b w:val="0"/>
                 <w:sz w:val="16"/>
               </w:rPr>
-              <w:t>-4.41</w:t>
+              <w:t>82.81</w:t>
             </w:r>
           </w:p>
         </w:tc>
@@ -1892,7 +1987,7 @@
                 <w:b w:val="0"/>
                 <w:sz w:val="16"/>
               </w:rPr>
-              <w:t>+10.49</w:t>
+              <w:t>77.7</w:t>
             </w:r>
           </w:p>
         </w:tc>
@@ -1909,7 +2004,7 @@
                 <w:b w:val="0"/>
                 <w:sz w:val="16"/>
               </w:rPr>
-              <w:t>-62.2</w:t>
+              <w:t>+3.89 (+2.08 to +6.33)</w:t>
             </w:r>
           </w:p>
         </w:tc>
@@ -1945,7 +2040,7 @@
                 <w:b w:val="0"/>
                 <w:sz w:val="16"/>
               </w:rPr>
-              <w:t>+7.84</w:t>
+              <w:t>14.65</w:t>
             </w:r>
           </w:p>
         </w:tc>
@@ -1962,7 +2057,7 @@
                 <w:b w:val="0"/>
                 <w:sz w:val="16"/>
               </w:rPr>
-              <w:t>-7.43</w:t>
+              <w:t>14.17</w:t>
             </w:r>
           </w:p>
         </w:tc>
@@ -1979,7 +2074,7 @@
                 <w:b w:val="0"/>
                 <w:sz w:val="16"/>
               </w:rPr>
-              <w:t>+23.99</w:t>
+              <w:t>96.7</w:t>
             </w:r>
           </w:p>
         </w:tc>
@@ -1996,7 +2091,7 @@
                 <w:b w:val="0"/>
                 <w:sz w:val="16"/>
               </w:rPr>
-              <w:t>-141.1</w:t>
+              <w:t>+8.28 (+5.15 to +13.27)</w:t>
             </w:r>
           </w:p>
         </w:tc>
@@ -2032,7 +2127,7 @@
                 <w:b w:val="0"/>
                 <w:sz w:val="16"/>
               </w:rPr>
-              <w:t>-1.40</w:t>
+              <w:t>13.31</w:t>
             </w:r>
           </w:p>
         </w:tc>
@@ -2049,7 +2144,7 @@
                 <w:b w:val="0"/>
                 <w:sz w:val="16"/>
               </w:rPr>
-              <w:t>+3.86</w:t>
+              <w:t>1.01</w:t>
             </w:r>
           </w:p>
         </w:tc>
@@ -2066,7 +2161,7 @@
                 <w:b w:val="0"/>
                 <w:sz w:val="16"/>
               </w:rPr>
-              <w:t>-4.00</w:t>
+              <w:t>7.6</w:t>
             </w:r>
           </w:p>
         </w:tc>
@@ -2083,7 +2178,7 @@
                 <w:b w:val="0"/>
                 <w:sz w:val="16"/>
               </w:rPr>
-              <w:t>+25.2</w:t>
+              <w:t>-1.15 (-1.64 to -0.88)</w:t>
             </w:r>
           </w:p>
         </w:tc>
@@ -2119,7 +2214,7 @@
                 <w:b w:val="0"/>
                 <w:sz w:val="16"/>
               </w:rPr>
-              <w:t>+0.37</w:t>
+              <w:t>45.94</w:t>
             </w:r>
           </w:p>
         </w:tc>
@@ -2136,7 +2231,7 @@
                 <w:b w:val="0"/>
                 <w:sz w:val="16"/>
               </w:rPr>
-              <w:t>-3.02</w:t>
+              <w:t>21.23</w:t>
             </w:r>
           </w:p>
         </w:tc>
@@ -2153,7 +2248,7 @@
                 <w:b w:val="0"/>
                 <w:sz w:val="16"/>
               </w:rPr>
-              <w:t>+0.59</w:t>
+              <w:t>46.2</w:t>
             </w:r>
           </w:p>
         </w:tc>
@@ -2170,7 +2265,7 @@
                 <w:b w:val="0"/>
                 <w:sz w:val="16"/>
               </w:rPr>
-              <w:t>-6.6</w:t>
+              <w:t>+0.25 (-0.22 to +1.08)</w:t>
             </w:r>
           </w:p>
         </w:tc>
@@ -2206,7 +2301,7 @@
                 <w:b w:val="0"/>
                 <w:sz w:val="16"/>
               </w:rPr>
-              <w:t>+3.34</w:t>
+              <w:t>9.02</w:t>
             </w:r>
           </w:p>
         </w:tc>
@@ -2223,7 +2318,7 @@
                 <w:b w:val="0"/>
                 <w:sz w:val="16"/>
               </w:rPr>
-              <w:t>-3.11</w:t>
+              <w:t>9.00</w:t>
             </w:r>
           </w:p>
         </w:tc>
@@ -2240,7 +2335,7 @@
                 <w:b w:val="0"/>
                 <w:sz w:val="16"/>
               </w:rPr>
-              <w:t>+9.89</w:t>
+              <w:t>99.7</w:t>
             </w:r>
           </w:p>
         </w:tc>
@@ -2257,7 +2352,7 @@
                 <w:b w:val="0"/>
                 <w:sz w:val="16"/>
               </w:rPr>
-              <w:t>-60.0</w:t>
+              <w:t>+3.35 (+2.35 to +5.22)</w:t>
             </w:r>
           </w:p>
         </w:tc>
@@ -2293,7 +2388,7 @@
                 <w:b w:val="0"/>
                 <w:sz w:val="16"/>
               </w:rPr>
-              <w:t>+2.28</w:t>
+              <w:t>4.41</w:t>
             </w:r>
           </w:p>
         </w:tc>
@@ -2310,7 +2405,7 @@
                 <w:b w:val="0"/>
                 <w:sz w:val="16"/>
               </w:rPr>
-              <w:t>-2.47</w:t>
+              <w:t>2.98</w:t>
             </w:r>
           </w:p>
         </w:tc>
@@ -2327,7 +2422,7 @@
                 <w:b w:val="0"/>
                 <w:sz w:val="16"/>
               </w:rPr>
-              <w:t>+8.54</w:t>
+              <w:t>67.4</w:t>
             </w:r>
           </w:p>
         </w:tc>
@@ -2344,7 +2439,7 @@
                 <w:b w:val="0"/>
                 <w:sz w:val="16"/>
               </w:rPr>
-              <w:t>-41.0</w:t>
+              <w:t>+2.55 (+1.50 to +4.33)</w:t>
             </w:r>
           </w:p>
         </w:tc>
@@ -2380,7 +2475,7 @@
                 <w:b w:val="0"/>
                 <w:sz w:val="16"/>
               </w:rPr>
-              <w:t>-0.62</w:t>
+              <w:t>0.50</w:t>
             </w:r>
           </w:p>
         </w:tc>
@@ -2397,7 +2492,7 @@
                 <w:b w:val="0"/>
                 <w:sz w:val="16"/>
               </w:rPr>
-              <w:t>-0.84</w:t>
+              <w:t>0.01</w:t>
             </w:r>
           </w:p>
         </w:tc>
@@ -2414,7 +2509,7 @@
                 <w:b w:val="0"/>
                 <w:sz w:val="16"/>
               </w:rPr>
-              <w:t>-3.30</w:t>
+              <w:t>1.4</w:t>
             </w:r>
           </w:p>
         </w:tc>
@@ -2431,7 +2526,7 @@
                 <w:b w:val="0"/>
                 <w:sz w:val="16"/>
               </w:rPr>
-              <w:t>+11.2</w:t>
+              <w:t>-0.74 (-2.12 to +0.32)</w:t>
             </w:r>
           </w:p>
         </w:tc>
@@ -2446,7 +2541,7 @@
       <w:r>
         <w:drawing>
           <wp:inline xmlns:a="http://schemas.openxmlformats.org/drawingml/2006/main" xmlns:pic="http://schemas.openxmlformats.org/drawingml/2006/picture">
-            <wp:extent cx="5715000" cy="3666006"/>
+            <wp:extent cx="5715000" cy="3813189"/>
             <wp:docPr id="1" name="Picture 1"/>
             <wp:cNvGraphicFramePr>
               <a:graphicFrameLocks noChangeAspect="1"/>
@@ -2455,7 +2550,7 @@
               <a:graphicData uri="http://schemas.openxmlformats.org/drawingml/2006/picture">
                 <pic:pic>
                   <pic:nvPicPr>
-                    <pic:cNvPr id="0" name="fig1_grid_climate_canopy_impacts.png"/>
+                    <pic:cNvPr id="0" name="fig1_predictive_support.png"/>
                     <pic:cNvPicPr/>
                   </pic:nvPicPr>
                   <pic:blipFill>
@@ -2467,7 +2562,7 @@
                   <pic:spPr>
                     <a:xfrm>
                       <a:off x="0" y="0"/>
-                      <a:ext cx="5715000" cy="3666006"/>
+                      <a:ext cx="5715000" cy="3813189"/>
                     </a:xfrm>
                     <a:prstGeom prst="rect"/>
                   </pic:spPr>
@@ -2480,7 +2575,7 @@
     </w:p>
     <w:p>
       <w:r>
-        <w:t>Figure 1 | Projected changes in Septoria-related canopy damage across European wheat-growing areas. (a–f) Three-climate-model mean changes in normalized loss of healthy-area duration (HAD) during flowering to soft dough for two future periods relative to 1991–2020. HAD loss is divided by maximum reference upper-three-leaf LAI and expressed in days. Each 0.25° pixel represents a separately simulated wheat-growing cell. Positive values indicate increasing accumulated canopy damage; negative values indicate decreasing damage. The six maps share a symmetric colour scale. The fixed SPAM2020 all-wheat mask contains 14,941 cells, of which 14,932 have a winter-wheat rainfed calendar. Grey wheat pixels have unavailable estimates. Country and regional summaries use fixed harvested-area weights. Supplementary Fig. S19 shows agreement among climate models.</w:t>
+        <w:t>Figure 1 | Predictive support for crop, disease and yield-response components. (a) Stage-specific mean absolute error on 40,878 matched German station-test events. T–P–V denotes temperature, photoperiod and vernalization; years are not held out. (b) Symptom-onset interval-excess error on 136 histories. (c) Severity RMSE on 2,033 assessments. Disease comparisons exclude calibration records; whiskers are 95% paired coordinate-year bootstrap intervals for fixed predictions. (d) Severity-based yield-response RMSE divided by the corresponding held-out training-mean RMSE: 62 Nordic treatment contrasts, 82 Tunisian plot-season yields, 3,264 German cultivar–management comparisons and 724 Swiss plot harvests. Validation excludes entire trials, years or locations, respectively. Nordic and German outcomes are relative management-associated yield responses; Tunisia and Switzerland use absolute yield. The Swiss analysis is exploratory and retains ordinal ratings as categories. These regressions assess transferability of severity–yield associations and do not validate the canopy-to-yield conversion. The panels use distinct populations and endpoints; lower errors in one component do not validate the full crop–disease–yield chain.</w:t>
       </w:r>
     </w:p>
     <w:p>
@@ -2492,7 +2587,7 @@
       <w:r>
         <w:drawing>
           <wp:inline xmlns:a="http://schemas.openxmlformats.org/drawingml/2006/main" xmlns:pic="http://schemas.openxmlformats.org/drawingml/2006/picture">
-            <wp:extent cx="5715000" cy="5229812"/>
+            <wp:extent cx="5715000" cy="4502029"/>
             <wp:docPr id="2" name="Picture 2"/>
             <wp:cNvGraphicFramePr>
               <a:graphicFrameLocks noChangeAspect="1"/>
@@ -2501,7 +2596,7 @@
               <a:graphicData uri="http://schemas.openxmlformats.org/drawingml/2006/picture">
                 <pic:pic>
                   <pic:nvPicPr>
-                    <pic:cNvPr id="0" name="fig2_disease_frequency_timing_severity.png"/>
+                    <pic:cNvPr id="0" name="fig2_climate_damage_and_agreement.png"/>
                     <pic:cNvPicPr/>
                   </pic:nvPicPr>
                   <pic:blipFill>
@@ -2513,7 +2608,7 @@
                   <pic:spPr>
                     <a:xfrm>
                       <a:off x="0" y="0"/>
-                      <a:ext cx="5715000" cy="5229812"/>
+                      <a:ext cx="5715000" cy="4502029"/>
                     </a:xfrm>
                     <a:prstGeom prst="rect"/>
                   </pic:spPr>
@@ -2526,7 +2621,7 @@
     </w:p>
     <w:p>
       <w:r>
-        <w:t>Figure 2 | Projected changes in Septoria symptoms and canopy damage. Panels show three-model mean changes under SSP5–8.5 in 2071–2100 relative to 1991–2020. (a) Frequency of seasons with flag-leaf symptoms before soft dough. (b) First symptoms relative to flowering; negative changes indicate earlier symptoms. (c) Relative HAD loss, the fraction of reference healthy-area duration lost during grain filling, expressed as a percentage-point change. This modelled loss of canopy function differs from measured lesion percentage. (d) Days from the fixed sowing date to first symptoms; negative changes indicate a shorter interval. Each panel has its own symmetric colour scale; panel d uses a continuous linear scale spanning all finite changes. Timing requires symptoms in both paired seasons, whereas frequency includes complete seasons without symptoms. Grey wheat pixels have unavailable estimates.</w:t>
+        <w:t>Figure 2 | Projected canopy damage, climate-model agreement and emissions pathways. (a) Three-model mean change in normalized loss of healthy-area duration (HAD) under SSP5–8.5 in 2071–2100 relative to 1991–2020. HAD loss is divided by maximum reference upper-three-leaf LAI and expressed in equivalent days of canopy function lost during flowering to soft dough. (b) Direction of change across climate models; grey indicates differing signs or zero, and dark-grey wheat cells lack complete estimates. (c) Harvested-area-weighted European changes under three emissions pathways in two future periods. Points show three-model means; whiskers span model estimates, not confidence intervals. The fixed all-wheat mask contains 14,941 cells with 14,932 imposed winter-wheat rainfed calendars. The values describe conditional canopy damage; neither model agreement nor the scenario contrast establishes harvested-yield loss. Supplementary Fig. S25 contains all six scenario-period maps.</w:t>
       </w:r>
     </w:p>
     <w:p>
@@ -2538,7 +2633,7 @@
       <w:r>
         <w:drawing>
           <wp:inline xmlns:a="http://schemas.openxmlformats.org/drawingml/2006/main" xmlns:pic="http://schemas.openxmlformats.org/drawingml/2006/picture">
-            <wp:extent cx="5715000" cy="3260336"/>
+            <wp:extent cx="5715000" cy="4156024"/>
             <wp:docPr id="3" name="Picture 3"/>
             <wp:cNvGraphicFramePr>
               <a:graphicFrameLocks noChangeAspect="1"/>
@@ -2547,7 +2642,7 @@
               <a:graphicData uri="http://schemas.openxmlformats.org/drawingml/2006/picture">
                 <pic:pic>
                   <pic:nvPicPr>
-                    <pic:cNvPr id="0" name="fig3_regional_and_country_impacts.png"/>
+                    <pic:cNvPr id="0" name="fig3_crop_relative_timing_and_mechanism.png"/>
                     <pic:cNvPicPr/>
                   </pic:nvPicPr>
                   <pic:blipFill>
@@ -2559,7 +2654,7 @@
                   <pic:spPr>
                     <a:xfrm>
                       <a:off x="0" y="0"/>
-                      <a:ext cx="5715000" cy="3260336"/>
+                      <a:ext cx="5715000" cy="4156024"/>
                     </a:xfrm>
                     <a:prstGeom prst="rect"/>
                   </pic:spPr>
@@ -2572,7 +2667,7 @@
     </w:p>
     <w:p>
       <w:r>
-        <w:t>Figure 3 | Regional differences in canopy damage and inferred yield response. (a) Harvested-area-weighted changes in normalized HAD loss within eight EEA biogeographical regions. (b) Estimated disease-related yield changes for the twelve countries with the largest reference wheat area within the study domain. Both panels compare 2071–2100 with 1991–2020 under three emissions pathways. Points show three-model means; whiskers span model-specific estimates and are not confidence intervals. Country assignment follows the dominant SPAM source-country label of each cell. The yield estimate uses the change in HAD loss and the fixed coefficient 0.018 t ha⁻¹ per GLAI-day, normalized to unit reference upper-canopy LAI. Negative values indicate increased estimated disease-related yield loss. These estimates require validation of the canopy–yield relationship and do not describe total national production. Source Data includes all country groups.</w:t>
+        <w:t>Figure 3 | Crop-relative timing and opposing weather–phenology contributions. All panels concern SSP5–8.5 in 2071–2100 relative to 1991–2020. (a) Full-grid three-model mean change in first symptoms relative to flowering; negative values indicate earlier symptoms within crop development. Timing requires symptoms in both paired seasons. (b) Weather, phenology and net contributions to normalized HAD loss in the separate diagnostic sample (64 area-proportional draws at 62 cells; 5,731 valid pairs). Grey segments span climate-model means; coloured whiskers show one spatial Monte Carlo standard error. Each Shapley contribution includes half the interaction; the 70.6% offset is a ratio of ensemble contributions. (c) Contributions within the five regions with at least four diagnostic draws; n denotes draws, not independent field experiments. Points are model means and whiskers model ranges. Pannonian, Alpine and Black Sea regions lack sufficient sampled support for this display. Regional offsets and spatial sampling errors are supplied in Source Data. Full-grid and sampled estimates have different populations. These projections do not estimate benefits of sowing-date or cultivar interventions. Supplementary Fig. S26 shows dates after sowing on identical season pairs.</w:t>
       </w:r>
     </w:p>
     <w:p>
@@ -2584,7 +2679,7 @@
       <w:r>
         <w:drawing>
           <wp:inline xmlns:a="http://schemas.openxmlformats.org/drawingml/2006/main" xmlns:pic="http://schemas.openxmlformats.org/drawingml/2006/picture">
-            <wp:extent cx="5715000" cy="2679172"/>
+            <wp:extent cx="5715000" cy="4053506"/>
             <wp:docPr id="4" name="Picture 4"/>
             <wp:cNvGraphicFramePr>
               <a:graphicFrameLocks noChangeAspect="1"/>
@@ -2593,7 +2688,7 @@
               <a:graphicData uri="http://schemas.openxmlformats.org/drawingml/2006/picture">
                 <pic:pic>
                   <pic:nvPicPr>
-                    <pic:cNvPr id="0" name="fig4_weather_and_crop_contributions.png"/>
+                    <pic:cNvPr id="0" name="fig4_wheat_production_exposure.png"/>
                     <pic:cNvPicPr/>
                   </pic:nvPicPr>
                   <pic:blipFill>
@@ -2605,7 +2700,7 @@
                   <pic:spPr>
                     <a:xfrm>
                       <a:off x="0" y="0"/>
-                      <a:ext cx="5715000" cy="2679172"/>
+                      <a:ext cx="5715000" cy="4053506"/>
                     </a:xfrm>
                     <a:prstGeom prst="rect"/>
                   </pic:spPr>
@@ -2618,7 +2713,7 @@
     </w:p>
     <w:p>
       <w:r>
-        <w:t>Figure 4 | Wheat phenology offsets part of the weather contribution to Septoria damage. (a) Weather and wheat-phenology contributions to normalized HAD loss during grain filling, and their sum, under late-century SSP5–8.5. The phenology contribution includes changes in upper-leaf appearance and unfolding and the flowering-to-soft-dough interval. The analysis uses 64 harvested-area-proportional draws at 62 cells and 5,731 valid season pairs. Grey segments span climate-model means; coloured whiskers show one spatial Monte Carlo standard error. Each Shapley contribution includes half of the weather–phenology interaction, shown separately in Supplementary Fig. S16. (b) Percentage of the weather contribution offset by wheat phenology in each climate model. The dashed line shows the ratio of ensemble contributions, 70.6%. These comparisons separate effects within the model; they do not estimate the effectiveness of changing sowing dates or cultivars.</w:t>
+        <w:t>Figure 4 | Production exposure changes the regional interpretation of disease impacts. (a) Production-weighted change in normalized HAD loss under SSP5–8.5 in 2071–2100 relative to 1991–2020. Points are equal three-climate-model means after production and valid-season weighting; whiskers span model estimates. (b) Fixed SPAM2020 production in the same environmental regions, partitioned by agreement in the sign of cell-level changes. Regions are ordered by baseline production. Mixed signs and zero responses are combined for display and retained separately in Source Data. (c) European baseline production in cells with positive changes in all three models or in their ensemble mean under each emissions pathway. The two criteria overlap and are shown as separate bars, not additive categories. All amounts are baseline production located in exposed cells, not estimated tonnes lost or future production. The fixed all-wheat baseline is represented by imposed winter-wheat rainfed calendars; missing responses remain explicit in the denominators. Eight named regions are displayed; European totals also include outside-region and unassigned cells.</w:t>
       </w:r>
     </w:p>
     <w:sectPr>

</xml_diff>

<commit_message>
Add annual canopy risk and observed management-grain evidence
</commit_message>
<xml_diff>
--- a/publication/european_wheat_stb/Manuscript.docx
+++ b/publication/european_wheat_stb/Manuscript.docx
@@ -35,7 +35,7 @@
     </w:p>
     <w:p>
       <w:r>
-        <w:t>Septoria tritici blotch threatens European wheat production as climate change alters conditions for disease. How crop phenology modifies regional disease impacts and the wheat production exposed to them remains unresolved. We combined phenology–disease modelling, field evaluation and fixed wheat-production weights across Europe under three climate models and emissions pathways. Under SSP5–8.5 in 2071–2100, normalized loss of healthy-area duration during grain filling increased by 2.66 days relative to 1991–2020, with all three models agreeing on increasing damage in cells representing 67.1% of baseline wheat production. Continental production exposure was nearly six times that of the Boreal region. Shifts in wheat phenology offset an estimated 71% of the increase in canopy damage attributable to weather. However, disease and yield-response predictions did not consistently outperform benchmarks. These conditional projections identify regional priorities for monitoring and field trials; harvested-yield losses and adaptation benefits require compatible canopy-function and grain-yield observations.</w:t>
+        <w:t>Septoria tritici blotch threatens European wheat production as climate change alters conditions for disease. How crop phenology modifies regional canopy damage, its interannual variability and production exposure remains unresolved. We combined phenology–disease modelling, field evaluation and production-weighted analyses across Europe under three climate models and emissions pathways. Under SSP5–8.5 in 2071–2100, normalized healthy-area-duration loss increased by 2.66 days, with unanimous increases in cells representing 67.1% of baseline production. Climate-driven phenology offset 71% of the weather contribution. On cells complete in both periods, future years exceeding historical 90 th-percentile European canopy damage averaged 65.6% (model range 40–90%). Continental production exposure was nearly six times the Boreal amount. These conditional projections distinguish impact intensity, production exposure and annual risk, supporting regional monitoring priorities. Inconsistent field predictive skill and missing canopy–grain observations limit quantitative grain-loss and adaptation claims.</w:t>
       </w:r>
     </w:p>
     <w:p>
@@ -194,17 +194,54 @@
     </w:p>
     <w:p>
       <w:r>
-        <w:t>Exposure did not increase monotonically under stronger forcing (Fig. 4c). Ensemble-increase exposure was 228.91 million tonnes under SSP1–2.6 and 194.87 million tonnes under SSP5–8.5. In contrast, unanimous-increase exposure rose from 97.04 to 162.21 million tonnes, while production-weighted HAD-loss change rose from 1.60 to 3.36 days. The geographic extent of positive mean responses, their intensity and agreement among climate models are therefore distinct indicators; a smaller exposed footprint does not imply less damage.</w:t>
+        <w:t>Exposure did not increase monotonically under stronger forcing (Supplementary Table S21). Ensemble-increase exposure was 228.91 million tonnes under SSP1–2.6 and 194.87 million tonnes under SSP5–8.5. In contrast, unanimous-increase exposure rose from 97.04 to 162.21 million tonnes, while production-weighted HAD-loss change rose from 1.60 to 3.36 days. The geographic extent of positive mean responses, their intensity and agreement among climate models are therefore distinct indicators; a smaller exposed footprint does not imply less damage.</w:t>
       </w:r>
     </w:p>
     <w:p>
       <w:r>
-        <w:t>Production-weighted European HAD-loss change was +3.36 days, with climate-model values from +1.38 to +5.69 days. Fixed production weights describe the present geography of exposure under alternative climate pathways (Fig. 4c). They exclude future shifts in cropped area, yield, trade, irrigation and crop type. The imposed winter-wheat rainfed calendar applies to the all-wheat mask, so the estimates remain scenario-specific even where climate models agree. Country production exposure uses fractional source-country contributions within border cells (Supplementary Table S21; Source Data).</w:t>
+        <w:t>Production-weighted European HAD-loss change was +3.36 days, with climate-model values from +1.38 to +5.69 days. Fixed production weights describe the present geography of exposure under alternative climate pathways (Supplementary Table S21). They exclude future shifts in cropped area, yield, trade, irrigation and crop type. The imposed winter-wheat rainfed calendar applies to the all-wheat mask, so the estimates remain scenario-specific even where climate models agree. Country production exposure uses fractional source-country contributions within border cells (Supplementary Table S21; Source Data).</w:t>
       </w:r>
     </w:p>
     <w:p>
       <w:r>
+        <w:t>High-damage years became more frequent on an identical complete population representing 99.0% of baseline production (Fig. 4c). Under late-century SSP5–8.5, the fraction of years above each climate model’s historical 90 th percentile of European production-weighted canopy damage averaged 65.6%, with a model range of 40–90%. The three-model mean of the annual 90 th-percentile damage increased from 9.50 to 13.72 days. Exceedance frequency was non-monotonic across pathways. These empirical frequencies describe canopy damage on fixed cells, rather than calibrated probabilities of grain loss (Supplementary Fig. S29; Supplementary Table S27).</w:t>
+      </w:r>
+    </w:p>
+    <w:p>
+      <w:r>
+        <w:t>The European harvested-area mean was insensitive to 30 circular year pairings: the largest difference from the original late-century SSP5–8.5 estimate was below 0.001 day. Cells complete in every historical and future year and all three models retained 98.1% of baseline harvested area and gave a change of 2.68 days. Regional mean-change signs were unchanged across pairing and support comparisons. Reweighting by rainfed production gave a European change of 3.36 days versus 3.36 using all-wheat production. This tests aggregation coverage without resolving winter–spring crop representation or irrigation effects (Supplementary Fig. S28; Supplementary Tables S26 and S28).</w:t>
+      </w:r>
+    </w:p>
+    <w:p>
+      <w:r>
         <w:t>All fourteen tested combinations of model structure, symptom detection and canopy assumptions gave increased HAD loss under late-century SSP5–8.5, with ensemble increases spanning 0.63–2.80 days. This more than fourfold variation in magnitude limits quantitative interpretation despite agreement in the direction of the European mean. Climate-model ranges, selected structural sensitivities and grouped field-evaluation intervals describe different uncertainties and cannot be combined into a single confidence interval for future grain loss (Supplementary Fig. S15; Supplementary Table S10).</w:t>
+      </w:r>
+    </w:p>
+    <w:p>
+      <w:r>
+        <w:t>Observed management responses remain environment-specific</w:t>
+      </w:r>
+    </w:p>
+    <w:p>
+      <w:r>
+        <w:t xml:space="preserve">The Nordic/Baltic 2012–2016 archive supplied 307 observed treated-minus-untreated yield contrasts across 263 reported trial identifiers and 25 country–year groups (Fig. 5a). The trial-weighted mean gain was 0.980 t ha⁻¹ (95% country–year cluster interval 0.804–1.142); nine contrasts were negative. Country–year-held-out RMSE was 0.628 t ha⁻¹ for the training mean, compared with 0.636 using treatment count and 0.638 using crop–treatment categories. Thus, the observed average response did not establish prediction of its environmental variation. Disease species, severity and functional canopy were unobserved, preventing STB-specific attribution (Supplementary Tables S29 and S30). </w:t>
+      </w:r>
+      <w:r>
+        <w:rPr>
+          <w:vertAlign w:val="superscript"/>
+        </w:rPr>
+        <w:t>[19, 20]</w:t>
+      </w:r>
+    </w:p>
+    <w:p>
+      <w:r>
+        <w:t xml:space="preserve">In the randomized Mauguio durum-wheat experiment, 195 mixtures with complete constituent references averaged 0.378 t ha⁻¹ above the constituent baseline, but 40.5% yielded less (Fig. 5b). The mean difference was 0.176 t ha⁻¹ using source spatially adjusted estimates. This single-environment comparison includes harvests without disease scores and overlaps the earlier French yield inventory. Shared controls connect 189 comparisons, precluding an independent-environment interval. Alternating-row experimental lines and fungicide protection after early disease assessment limit commercial and disease-mediated interpretation. In Switzerland, none of 637 eligible binary mixtures had both constituent controls within the mixture experiment; external national-network controls therefore supply noncausal diagnostics (Supplementary Tables S31 and S32). </w:t>
+      </w:r>
+      <w:r>
+        <w:rPr>
+          <w:vertAlign w:val="superscript"/>
+        </w:rPr>
+        <w:t>[17, 18]</w:t>
       </w:r>
     </w:p>
     <w:p>
@@ -230,13 +267,18 @@
     </w:p>
     <w:p>
       <w:r>
+        <w:t>Annual damage distributions add information beyond changes in period means. More frequent high-damage years can increase the demand for surveillance and timely field assessment, even where the mean climate response is modest. The large climate-model spread in exceedance frequency limits numerical planning targets. Production losses, storage requirements and income risk require validated grain-yield responses and additional economic information.</w:t>
+      </w:r>
+    </w:p>
+    <w:p>
+      <w:r>
         <w:t xml:space="preserve">The immediate policy implication is differentiated investment in evidence and preparedness. Regions combining substantial production with consistent projected increases are candidates for coordinated disease surveillance and testing of crop resistance and phenology. Regions with model disagreement require observations that resolve whether seasonal exposure is rising or falling. Declining Mediterranean disease pressure does not establish improved wheat productivity because heat and water stress can reduce grain yield independently. These priorities remain conditional on an all-wheat production baseline represented by a winter-wheat rainfed calendar; winter and spring wheat and irrigated systems require separate evaluation before operational targeting. </w:t>
       </w:r>
       <w:r>
         <w:rPr>
           <w:vertAlign w:val="superscript"/>
         </w:rPr>
-        <w:t>[19]</w:t>
+        <w:t>[21]</w:t>
       </w:r>
     </w:p>
     <w:p>
@@ -247,7 +289,12 @@
         <w:rPr>
           <w:vertAlign w:val="superscript"/>
         </w:rPr>
-        <w:t>[20, 21, 22]</w:t>
+        <w:t>[22, 23, 24]</w:t>
+      </w:r>
+    </w:p>
+    <w:p>
+      <w:r>
+        <w:t>Observed management outcomes further constrain policy interpretation. Positive average grain responses coexist with heterogeneous trial and mixture performance, sensitivity to spatial adjustment and weak transfer of simple response benchmarks. Regional surveillance can prioritize where production is exposed, while replicated local comparisons are needed to choose interventions. Neither a mean protection-associated response nor an experimental mixture advantage supplies a blanket recommendation, an STB-specific yield coefficient or a future input-reduction target.</w:t>
       </w:r>
     </w:p>
     <w:p>
@@ -258,7 +305,7 @@
         <w:rPr>
           <w:vertAlign w:val="superscript"/>
         </w:rPr>
-        <w:t>[2, 11, 12, 23]</w:t>
+        <w:t>[2, 11, 12, 25]</w:t>
       </w:r>
     </w:p>
     <w:p>
@@ -284,12 +331,127 @@
         <w:rPr>
           <w:vertAlign w:val="superscript"/>
         </w:rPr>
-        <w:t>[24, 25]</w:t>
+        <w:t>[26, 27]</w:t>
       </w:r>
     </w:p>
     <w:p>
       <w:r>
         <w:t xml:space="preserve">Daily NEX-GDDP-CMIP6v2 data represent ACCESS-CM2, MPI-ESM1-2-HR and MRI-ESM2-0 under SSP1–2.6, SSP2–4.5 and SSP5–8.5. The harvest periods are 1991–2020, 2031–2060 and 2071–2100. The 810 model–scenario–year combinations cover 12,094,920 calendar-eligible grid-seasons. Monthly adjustment coefficients align climate variables with the reference weather data, with separate historical adjustments for each SSP continuation. Daily series include the preceding calendar year to represent overwintering seasons. Input files, adjustment coefficients and model configurations are identified by checksums. </w:t>
+      </w:r>
+      <w:r>
+        <w:rPr>
+          <w:vertAlign w:val="superscript"/>
+        </w:rPr>
+        <w:t>[28]</w:t>
+      </w:r>
+    </w:p>
+    <w:p>
+      <w:r>
+        <w:t>Disease calculations use daily temperature, relative humidity and rainfall. A synthetic reconstruction of humidity within each day estimates moisture exposure from daily forcing; it does not supply measured leaf wetness. Missing weather and daily mean temperatures above 40 °C produce unavailable outcomes under the model input rules.</w:t>
+      </w:r>
+    </w:p>
+    <w:p>
+      <w:r>
+        <w:t>Linking wheat phenology to Septoria disease</w:t>
+      </w:r>
+    </w:p>
+    <w:p>
+      <w:r>
+        <w:t xml:space="preserve">A temperature–photoperiod–vernalization model calculates wheat phenological stages from sowing to soft dough. Additional ordered developmental thresholds determine upper-leaf appearance and unfolding, and a calibrated flowering threshold defines the start of the grain-filling interval. These crop trajectories determine which leaves are available to infection and the seasonal weather experienced by each leaf. The Septoria module calculates disease establishment, progression and visible damage using weather and these leaf trajectories. Disease damage does not alter the calculated crop-development trajectory. Model equations, parameter sources and observation definitions appear in the supplementary model specification and the 84-entry parameter inventory. </w:t>
+      </w:r>
+      <w:r>
+        <w:rPr>
+          <w:vertAlign w:val="superscript"/>
+        </w:rPr>
+        <w:t>[6, 7, 8, 9, 10]</w:t>
+      </w:r>
+    </w:p>
+    <w:p>
+      <w:r>
+        <w:t>Calibrated parameters remain fixed across climate scenarios. The maximum reference LAI of the upper three leaves is one, divided equally among leaves and scaled by unfolding. Cultivar-specific canopy area and future changes in resistance are not estimated. Soft dough marks season completion. Missing crop calendars, invalid weather and failure to reach the endpoint remain separate unavailable outcomes, rather than zero disease or zero loss.</w:t>
+      </w:r>
+    </w:p>
+    <w:p>
+      <w:r>
+        <w:t>Symptoms, canopy damage and healthy-area duration</w:t>
+      </w:r>
+    </w:p>
+    <w:p>
+      <w:r>
+        <w:t>Symptom frequency is the fraction of complete simulated seasons with detectable flag-leaf symptoms before soft dough. First-symptom timing is measured relative to flowering or sowing and is unavailable when symptoms are not detected. Symptomatic grain-fill days count days with detectable flag-leaf symptoms between flowering and soft dough. Symptoms are visible model states following disease development; their dates are distinct from the modelled dates of initial infection.</w:t>
+      </w:r>
+    </w:p>
+    <w:p>
+      <w:r>
+        <w:t xml:space="preserve">The disease-damage fraction after symptom detection is treated as the fraction of reference leaf area that has lost function. This assumption connects modelled disease to canopy damage. HAD loss integrates this fraction multiplied by daily reference leaf area across the flag leaf and two leaves below it. The primary interval is flowering to soft dough (GS65–85), with GS31–85 used for sensitivity analysis. HAD and disease-induced HAD loss have units of green leaf area index multiplied by days (GLAI-days). Normalized HAD loss divides the time-integrated functional loss by maximum reference upper-canopy LAI and expresses it as equivalent days of reference canopy function lost. With reference LAI equal to one, normalization leaves numerical values unchanged. Relative HAD loss is HAD loss divided by reference HAD, expressed as a percentage; it describes average accumulated canopy-function loss, not instantaneous lesion percentage. </w:t>
+      </w:r>
+      <w:r>
+        <w:rPr>
+          <w:vertAlign w:val="superscript"/>
+        </w:rPr>
+        <w:t>[2, 12]</w:t>
+      </w:r>
+    </w:p>
+    <w:p>
+      <w:r>
+        <w:t xml:space="preserve">Flowering provides a reference for grain filling rather than the start of disease simulation or a universal crop-protection threshold. Disease calculations begin during crop establishment and include upper-leaf appearance and unfolding before flowering. Stem extension and upper-leaf emergence define earlier exposure relevant to canopy protection. The GS65–85 integral describes grain-filling canopy damage; it does not quantify every effect of pre-flowering disease on grain number or assimilate reserves. </w:t>
+      </w:r>
+      <w:r>
+        <w:rPr>
+          <w:vertAlign w:val="superscript"/>
+        </w:rPr>
+        <w:t>[2, 23]</w:t>
+      </w:r>
+    </w:p>
+    <w:p>
+      <w:r>
+        <w:t>Historical–future comparisons and spatial summaries</w:t>
+      </w:r>
+    </w:p>
+    <w:p>
+      <w:r>
+        <w:t>Each future harvest year is paired with the corresponding position in the 30-year historical period for the same climate model and SSP. This indexing supports comparisons of period means without identifying historical and future years as the same physical event. A pair is included only when both metric values are finite. For grid i, x_i is the sum of valid paired differences divided by 30, and z_i is the number of valid pairs divided by 30. The grid mean change is x_i/z_i. Reference and future means use the same valid pairs. The valid seasons may differ among symptom timing, symptom frequency and canopy metrics.</w:t>
+      </w:r>
+    </w:p>
+    <w:p>
+      <w:r>
+        <w:t xml:space="preserve">For domain indicator I_i and fixed harvested area w_i, the mean change is Σw_i I_i x_i / Σw_i I_i z_i. Separate estimates for each climate model give the reported three-model mean and range. EEA 2016 boundaries assign environmental regions from wheat-cell centroids. Country assignment uses the dominant SPAM source-country label of each cell; cross-border cells are not divided among countries. Country estimates apply only to represented wheat cells within the study domain. Source Data includes all eight named environmental regions, outside-region and unassigned cells, and all country groups. </w:t>
+      </w:r>
+      <w:r>
+        <w:rPr>
+          <w:vertAlign w:val="superscript"/>
+        </w:rPr>
+        <w:t>[29]</w:t>
+      </w:r>
+    </w:p>
+    <w:p>
+      <w:r>
+        <w:t>Maps show model means at the native 0.25° grid resolution, without interpolation or filling unavailable cells. Area shares by direction of change use fixed harvested-area weights over cells with complete three-model estimates. Model ranges describe spread among three climate models and are not confidence intervals. All wheat cells are simulated, so full-grid estimates have no spatial-sampling Monte Carlo error. Other uncertainties include climate-model choice, model parameters, observations and the canopy–yield relationship. Full scenario-period maps are retained in Supplementary Fig. S25; saturated symptom-frequency and conditional yield-conversion results remain supplementary.</w:t>
+      </w:r>
+    </w:p>
+    <w:p>
+      <w:r>
+        <w:t>Year pairing, population support and annual variation</w:t>
+      </w:r>
+    </w:p>
+    <w:p>
+      <w:r>
+        <w:t>Thirty circular shifts of future-year positions evaluate sensitivity to the overlap of incomplete historical and future seasons. These shifts retain each period’s years and do not represent independent replicates or all possible permutations. Original finite-pair means are compared with separately available period means and with the identical cell set complete in every year and all three climate models. Complete-cell support is fixed separately for each emissions pathway and future period. The full-support mean is analytically invariant to year permutation.</w:t>
+      </w:r>
+    </w:p>
+    <w:p>
+      <w:r>
+        <w:t>On the common complete population, each climate model provides 30 annual production-weighted canopy-damage means per period. Empirical quantiles use linear interpolation; the upper-tail mean averages the three largest annual values. Future exceedance frequency counts annual values strictly above the same model’s historical 90 th quantile. Model-specific annual statistics receive equal weight across climate models, with their range reported separately. No annual observations are pooled across climate models into a single probability distribution. Rainfed-production reweighting uses the corresponding SPAM2020 raster, preserving small non-additive residuals between independently published total and management-component rasters.</w:t>
+      </w:r>
+    </w:p>
+    <w:p>
+      <w:r>
+        <w:t>Production exposure and common-population timing</w:t>
+      </w:r>
+    </w:p>
+    <w:p>
+      <w:r>
+        <w:t xml:space="preserve">Fixed SPAM2020 production weights represent tonnes of all-wheat production in the reference geography. Quarter-degree cell identities, coordinates, positive harvested-area support and production totals are reconciled against the current climate registry. Native source-country fractions partition production in cross-border cells; environmental regions use the existing cell-centroid assignment. The same cell-specific climate response applies to each source-country fraction. Production exposure retains all reference production in its denominator, with unavailable climate responses explicit. </w:t>
       </w:r>
       <w:r>
         <w:rPr>
@@ -300,106 +462,6 @@
     </w:p>
     <w:p>
       <w:r>
-        <w:t>Disease calculations use daily temperature, relative humidity and rainfall. A synthetic reconstruction of humidity within each day estimates moisture exposure from daily forcing; it does not supply measured leaf wetness. Missing weather and daily mean temperatures above 40 °C produce unavailable outcomes under the model input rules.</w:t>
-      </w:r>
-    </w:p>
-    <w:p>
-      <w:r>
-        <w:t>Linking wheat phenology to Septoria disease</w:t>
-      </w:r>
-    </w:p>
-    <w:p>
-      <w:r>
-        <w:t xml:space="preserve">A temperature–photoperiod–vernalization model calculates wheat phenological stages from sowing to soft dough. Additional ordered developmental thresholds determine upper-leaf appearance and unfolding, and a calibrated flowering threshold defines the start of the grain-filling interval. These crop trajectories determine which leaves are available to infection and the seasonal weather experienced by each leaf. The Septoria module calculates disease establishment, progression and visible damage using weather and these leaf trajectories. Disease damage does not alter the calculated crop-development trajectory. Model equations, parameter sources and observation definitions appear in the supplementary model specification and the 84-entry parameter inventory. </w:t>
-      </w:r>
-      <w:r>
-        <w:rPr>
-          <w:vertAlign w:val="superscript"/>
-        </w:rPr>
-        <w:t>[6, 7, 8, 9, 10]</w:t>
-      </w:r>
-    </w:p>
-    <w:p>
-      <w:r>
-        <w:t>Calibrated parameters remain fixed across climate scenarios. The maximum reference LAI of the upper three leaves is one, divided equally among leaves and scaled by unfolding. Cultivar-specific canopy area and future changes in resistance are not estimated. Soft dough marks season completion. Missing crop calendars, invalid weather and failure to reach the endpoint remain separate unavailable outcomes, rather than zero disease or zero loss.</w:t>
-      </w:r>
-    </w:p>
-    <w:p>
-      <w:r>
-        <w:t>Symptoms, canopy damage and healthy-area duration</w:t>
-      </w:r>
-    </w:p>
-    <w:p>
-      <w:r>
-        <w:t>Symptom frequency is the fraction of complete simulated seasons with detectable flag-leaf symptoms before soft dough. First-symptom timing is measured relative to flowering or sowing and is unavailable when symptoms are not detected. Symptomatic grain-fill days count days with detectable flag-leaf symptoms between flowering and soft dough. Symptoms are visible model states following disease development; their dates are distinct from the modelled dates of initial infection.</w:t>
-      </w:r>
-    </w:p>
-    <w:p>
-      <w:r>
-        <w:t xml:space="preserve">The disease-damage fraction after symptom detection is treated as the fraction of reference leaf area that has lost function. This assumption connects modelled disease to canopy damage. HAD loss integrates this fraction multiplied by daily reference leaf area across the flag leaf and two leaves below it. The primary interval is flowering to soft dough (GS65–85), with GS31–85 used for sensitivity analysis. HAD and disease-induced HAD loss have units of green leaf area index multiplied by days (GLAI-days). Normalized HAD loss divides the time-integrated functional loss by maximum reference upper-canopy LAI and expresses it as equivalent days of reference canopy function lost. With reference LAI equal to one, normalization leaves numerical values unchanged. Relative HAD loss is HAD loss divided by reference HAD, expressed as a percentage; it describes average accumulated canopy-function loss, not instantaneous lesion percentage. </w:t>
-      </w:r>
-      <w:r>
-        <w:rPr>
-          <w:vertAlign w:val="superscript"/>
-        </w:rPr>
-        <w:t>[2, 12]</w:t>
-      </w:r>
-    </w:p>
-    <w:p>
-      <w:r>
-        <w:t xml:space="preserve">Flowering provides a reference for grain filling rather than the start of disease simulation or a universal crop-protection threshold. Disease calculations begin during crop establishment and include upper-leaf appearance and unfolding before flowering. Stem extension and upper-leaf emergence define earlier exposure relevant to canopy protection. The GS65–85 integral describes grain-filling canopy damage; it does not quantify every effect of pre-flowering disease on grain number or assimilate reserves. </w:t>
-      </w:r>
-      <w:r>
-        <w:rPr>
-          <w:vertAlign w:val="superscript"/>
-        </w:rPr>
-        <w:t>[2, 21]</w:t>
-      </w:r>
-    </w:p>
-    <w:p>
-      <w:r>
-        <w:t>Historical–future comparisons and spatial summaries</w:t>
-      </w:r>
-    </w:p>
-    <w:p>
-      <w:r>
-        <w:t>Each future harvest year is paired with the corresponding position in the 30-year historical period for the same climate model and SSP. This indexing supports comparisons of period means without identifying historical and future years as the same physical event. A pair is included only when both metric values are finite. For grid i, x_i is the sum of valid paired differences divided by 30, and z_i is the number of valid pairs divided by 30. The grid mean change is x_i/z_i. Reference and future means use the same valid pairs. The valid seasons may differ among symptom timing, symptom frequency and canopy metrics.</w:t>
-      </w:r>
-    </w:p>
-    <w:p>
-      <w:r>
-        <w:t xml:space="preserve">For domain indicator I_i and fixed harvested area w_i, the mean change is Σw_i I_i x_i / Σw_i I_i z_i. Separate estimates for each climate model give the reported three-model mean and range. EEA 2016 boundaries assign environmental regions from wheat-cell centroids. Country assignment uses the dominant SPAM source-country label of each cell; cross-border cells are not divided among countries. Country estimates apply only to represented wheat cells within the study domain. Source Data includes all eight named environmental regions, outside-region and unassigned cells, and all country groups. </w:t>
-      </w:r>
-      <w:r>
-        <w:rPr>
-          <w:vertAlign w:val="superscript"/>
-        </w:rPr>
-        <w:t>[27]</w:t>
-      </w:r>
-    </w:p>
-    <w:p>
-      <w:r>
-        <w:t>Maps show model means at the native 0.25° grid resolution, without interpolation or filling unavailable cells. Area shares by direction of change use fixed harvested-area weights over cells with complete three-model estimates. Model ranges describe spread among three climate models and are not confidence intervals. All wheat cells are simulated, so full-grid estimates have no spatial-sampling Monte Carlo error. Other uncertainties include climate-model choice, model parameters, observations and the canopy–yield relationship. Full scenario-period maps are retained in Supplementary Fig. S25; saturated symptom-frequency and conditional yield-conversion results remain supplementary.</w:t>
-      </w:r>
-    </w:p>
-    <w:p>
-      <w:r>
-        <w:t>Production exposure and common-population timing</w:t>
-      </w:r>
-    </w:p>
-    <w:p>
-      <w:r>
-        <w:t xml:space="preserve">Fixed SPAM2020 production weights represent tonnes of all-wheat production in the reference geography. Quarter-degree cell identities, coordinates, positive harvested-area support and production totals are reconciled against the current climate registry. Native source-country fractions partition production in cross-border cells; environmental regions use the existing cell-centroid assignment. The same cell-specific climate response applies to each source-country fraction. Production exposure retains all reference production in its denominator, with unavailable climate responses explicit. </w:t>
-      </w:r>
-      <w:r>
-        <w:rPr>
-          <w:vertAlign w:val="superscript"/>
-        </w:rPr>
-        <w:t>[24]</w:t>
-      </w:r>
-    </w:p>
-    <w:p>
-      <w:r>
         <w:t>For each scenario and period, ensemble-increase exposure sums baseline production in cells whose equally weighted three-model mean HAD change is positive. Unanimous-increase exposure requires positive changes in all three models; unanimous decreases, differing signs, zero responses and unavailable estimates remain distinguishable in Source Data. Production-weighted continuous HAD changes use production multiplied by the number of valid metric-specific season pairs within each model, followed by equal weighting across three model estimates. Climate-model ranges are deterministic spread. A coverage sensitivity requires at least 27 of 30 paired seasons in every model; excluded production remains in the reference denominator. Exposed tonnes describe spatial coincidence with increasing modelled damage, not tonnes of lost or future production.</w:t>
       </w:r>
     </w:p>
@@ -452,7 +514,7 @@
         <w:rPr>
           <w:vertAlign w:val="superscript"/>
         </w:rPr>
-        <w:t>[28, 29]</w:t>
+        <w:t>[30, 31]</w:t>
       </w:r>
     </w:p>
     <w:p>
@@ -479,7 +541,7 @@
         <w:rPr>
           <w:vertAlign w:val="superscript"/>
         </w:rPr>
-        <w:t>[14, 15, 30]</w:t>
+        <w:t>[14, 15, 32]</w:t>
       </w:r>
     </w:p>
     <w:p>
@@ -511,33 +573,81 @@
     </w:p>
     <w:p>
       <w:r>
-        <w:t>Reproducibility</w:t>
+        <w:t>Observed management comparisons</w:t>
       </w:r>
     </w:p>
     <w:p>
       <w:r>
-        <w:t>Annual outputs record input-weather identities, model configurations, grid-cell order, numerical checks and output hashes. Aggregation records source hashes, counts of valid pairs and spatial coverage for each metric. Independent calculations check pooled field scores and selected full-grid regional means. Source Data contains figure and table values. The public repository regenerates documents from completed numerical evidence; a climate-driven model rerun additionally requires the external raw weather products.</w:t>
-      </w:r>
-    </w:p>
-    <w:p>
-      <w:r>
-        <w:t>Data availability</w:t>
-      </w:r>
-    </w:p>
-    <w:p>
-      <w:r>
-        <w:t xml:space="preserve">Source data and numerical evidence supporting the findings are deposited at https://github.com/SmartAG-Team/paper_cc_impact_wheat_disease, with the manuscript-specific files in publication/european_wheat_stb. The repository is publicly accessible. Dataset references identify the public disease archives, the Nordic Field Trial System, Tunisian cultivar-mixture observations, German multi-environment field data, Swiss and French cultivar-mixture observations, NEX-GDDP-CMIP6v2 climate data, GGCMI calendars, SPAM2020 wheat area and EEA environmental boundaries. Source_Data.xlsx contains completed grid summaries, environmental-region and country statistics, area shares by direction of change, pooled field evaluation, published canopy–yield evidence, grouped yield-response tests, fixed-production exposure and common-population timing comparisons. Original labels and assessment definitions remain in the underlying records. </w:t>
+        <w:t xml:space="preserve">The Nordic/Baltic archive retains trial–treatment yield summaries in kg ha⁻¹ at 15% moisture. Unique untreated and treated records are matched by country, year and trial identifier; ambiguous keys, absent controls and unavailable yields are excluded with source-row provenance. Differences are recalculated from the two yields. Forty-four untreated records support two contrasts each; each trial has total weight one. Fixed training-mean, treatment-category and crop–treatment benchmarks use country–year, country, year and retrospective forward-year holdouts. Two thousand country–year bootstrap draws retain shared controls; evaluation intervals condition on fixed predictions. Weather-derived recommendations and regional average stage dates are not measured disease or trial phenology. </w:t>
       </w:r>
       <w:r>
         <w:rPr>
           <w:vertAlign w:val="superscript"/>
         </w:rPr>
-        <w:t>[14, 16, 17, 18, 24, 25, 26, 27, 28, 29, 30]</w:t>
+        <w:t>[19, 20]</w:t>
       </w:r>
     </w:p>
     <w:p>
       <w:r>
-        <w:t>The repository includes completed summaries, selected diagnostic outputs, input and output hashes, and numerical evidence for document regeneration. The complete raw climate and annual-output archives are external because of their size. Model reruns require the recorded climate products and adjustment files. Raw plot observations and physiological measurements unavailable in the source studies are not reconstructed.</w:t>
+        <w:t xml:space="preserve">The French management population uses the full author-retained phenotype experiment independently of STB-score availability. Of 381 retained plots, 179 pure stands and 200 mixtures have complete four-row harvest representations; five mixtures lack a constituent reference. Each of the remaining 195 mixtures is compared with the arithmetic mean of its two constituent pure stands. Dried-grain g m⁻² values convert to t ha⁻¹ without an invented moisture correction. Source spatial BLUPs provide a same-population sensitivity. Constituent-sharing graphs and genotype/grid-coordinate deletion assess dependence and influence, without treating the 195 comparisons as independent environments. Thousand-kernel weight supplies an observed yield-component comparison; economic return and market quality are unavailable. </w:t>
+      </w:r>
+      <w:r>
+        <w:rPr>
+          <w:vertAlign w:val="superscript"/>
+        </w:rPr>
+        <w:t>[18]</w:t>
+      </w:r>
+    </w:p>
+    <w:p>
+      <w:r>
+        <w:t xml:space="preserve">Swiss old and current releases are linked through exact shared-field values to recover plot, block and source-trial identifiers. Ambiguous mappings are excluded. Complete constituent controls are unavailable within the mixture experiment; external controls remain separated by year, location and source trial code. Their observed differences are descriptive and cannot establish a causal mixture effect. France and Switzerland are not pooled across moisture bases, designs or environments. No observed management response calibrates the climate canopy-to-grain conversion. </w:t>
+      </w:r>
+      <w:r>
+        <w:rPr>
+          <w:vertAlign w:val="superscript"/>
+        </w:rPr>
+        <w:t>[17]</w:t>
+      </w:r>
+    </w:p>
+    <w:p>
+      <w:r>
+        <w:t>Physiological evidence eligibility</w:t>
+      </w:r>
+    </w:p>
+    <w:p>
+      <w:r>
+        <w:t>Sixteen source entries were screened for matched dated canopy area, leaf-specific disease, crop stages, harvested grain, reference treatments, weather and independent environments. No newly acquired raw cohort met these joint requirements. Published fitted curves, model-adjusted treatment means and repeated publications of the same database remain distinct from raw independent observations. The source inventory records successful retrievals, access failures, cohort overlap, units and exact missing inputs. This bounded screen does not establish exhaustive absence of public data. Physiological crop-growth and incremental disease-loss fitting remain unsupported by the acquired observations.</w:t>
+      </w:r>
+    </w:p>
+    <w:p>
+      <w:r>
+        <w:t>Reproducibility</w:t>
+      </w:r>
+    </w:p>
+    <w:p>
+      <w:r>
+        <w:t>Annual outputs record input-weather identities, model configurations, grid-cell order, numerical checks and output hashes. Aggregation records source hashes, counts of valid pairs and spatial coverage for each metric. Independent calculations check pooled field scores and selected full-grid regional means. Source Data contains figure and table values. The public repository regenerates documents from completed numerical evidence; a climate-driven model rerun additionally requires the external raw weather products.</w:t>
+      </w:r>
+    </w:p>
+    <w:p>
+      <w:r>
+        <w:t>Data availability</w:t>
+      </w:r>
+    </w:p>
+    <w:p>
+      <w:r>
+        <w:t xml:space="preserve">Source data and numerical evidence supporting the findings are deposited at https://github.com/SmartAG-Team/paper_cc_impact_wheat_disease, with the manuscript-specific files in publication/european_wheat_stb. The repository is publicly accessible. Dataset references identify the public disease archives, the Nordic Field Trial System, Tunisian cultivar-mixture observations, German multi-environment field data, Swiss and French cultivar-mixture observations, NEX-GDDP-CMIP6v2 climate data, GGCMI calendars, SPAM2020 wheat area and EEA environmental boundaries. Source_Data.xlsx contains completed grid summaries, environmental-region and country statistics, area shares by direction of change, pooled field evaluation, published canopy–yield evidence, grouped yield-response tests, fixed-production exposure, common-population timing, year-pairing sensitivity, annual canopy-damage distributions and observed management-grain comparisons. Original labels and assessment definitions remain in the underlying records. </w:t>
+      </w:r>
+      <w:r>
+        <w:rPr>
+          <w:vertAlign w:val="superscript"/>
+        </w:rPr>
+        <w:t>[14, 16, 17, 18, 19, 20, 26, 27, 28, 29, 30, 31, 32]</w:t>
+      </w:r>
+    </w:p>
+    <w:p>
+      <w:r>
+        <w:t>The repository includes completed summaries, selected diagnostic outputs, input and output hashes, exact annual canopy-damage values for sensitivity analyses, compact public-source management–grain inputs, and numerical evidence for document regeneration. The complete raw climate and annual-output archives are external because of their size. Model reruns require the recorded climate products and adjustment files. Raw plot observations and physiological measurements unavailable in the source studies are not reconstructed.</w:t>
       </w:r>
     </w:p>
     <w:p>
@@ -1274,19 +1384,7 @@
         <w:rPr>
           <w:i w:val="0"/>
         </w:rPr>
-        <w:t xml:space="preserve">European Commission. </w:t>
-      </w:r>
-      <w:r>
-        <w:rPr>
-          <w:i/>
-        </w:rPr>
-        <w:t>A Vision for Agriculture and Food</w:t>
-      </w:r>
-      <w:r>
-        <w:rPr>
-          <w:i w:val="0"/>
-        </w:rPr>
-        <w:t>. https://eur-lex.europa.eu/legal-content/EN/TXT/?uri=CELEX%3A52025DC0075 (2025).</w:t>
+        <w:t>Andersson, B. Data set for weather, development stage and yield. Figshare https://doi.org/10.6084/m9.figshare.19203377.v4 (2022).</w:t>
       </w:r>
     </w:p>
     <w:p>
@@ -1303,37 +1401,7 @@
         <w:rPr>
           <w:i w:val="0"/>
         </w:rPr>
-        <w:t xml:space="preserve">McDonald, A. J. </w:t>
-      </w:r>
-      <w:r>
-        <w:rPr>
-          <w:i/>
-        </w:rPr>
-        <w:t>et al.</w:t>
-      </w:r>
-      <w:r>
-        <w:rPr>
-          <w:i w:val="0"/>
-        </w:rPr>
-        <w:t xml:space="preserve"> Time management governs climate resilience and productivity in the coupled rice–wheat cropping systems of eastern India. </w:t>
-      </w:r>
-      <w:r>
-        <w:rPr>
-          <w:i/>
-        </w:rPr>
-        <w:t>Nat. Food</w:t>
-      </w:r>
-      <w:r>
-        <w:rPr>
-          <w:i w:val="0"/>
-        </w:rPr>
-        <w:t>3</w:t>
-      </w:r>
-      <w:r>
-        <w:rPr>
-          <w:i w:val="0"/>
-        </w:rPr>
-        <w:t>, 542–551 (2022).</w:t>
+        <w:t>Andersson, B. SAS script and input files. Figshare https://doi.org/10.6084/m9.figshare.19203398.v3 (2022).</w:t>
       </w:r>
     </w:p>
     <w:p>
@@ -1350,25 +1418,19 @@
         <w:rPr>
           <w:i w:val="0"/>
         </w:rPr>
-        <w:t xml:space="preserve">Bancal, M.-O., Robert, C. &amp; Ney, B. Modelling wheat growth and yield losses from late epidemics of foliar diseases using loss of green leaf area per layer and pre-anthesis reserves. </w:t>
+        <w:t xml:space="preserve">European Commission. </w:t>
       </w:r>
       <w:r>
         <w:rPr>
           <w:i/>
         </w:rPr>
-        <w:t>Annals of Botany</w:t>
+        <w:t>A Vision for Agriculture and Food</w:t>
       </w:r>
       <w:r>
         <w:rPr>
           <w:i w:val="0"/>
         </w:rPr>
-        <w:t>100</w:t>
-      </w:r>
-      <w:r>
-        <w:rPr>
-          <w:i w:val="0"/>
-        </w:rPr>
-        <w:t>, 777–789 (2007).</w:t>
+        <w:t>. https://eur-lex.europa.eu/legal-content/EN/TXT/?uri=CELEX%3A52025DC0075 (2025).</w:t>
       </w:r>
     </w:p>
     <w:p>
@@ -1385,37 +1447,37 @@
         <w:rPr>
           <w:i w:val="0"/>
         </w:rPr>
-        <w:t xml:space="preserve">Bancal, P., Bancal, M.-O., Collin, F. &amp; Gouache, D. Identifying traits leading to tolerance of wheat to </w:t>
+        <w:t xml:space="preserve">McDonald, A. J. </w:t>
       </w:r>
       <w:r>
         <w:rPr>
           <w:i/>
         </w:rPr>
-        <w:t>Septoria tritici</w:t>
+        <w:t>et al.</w:t>
       </w:r>
       <w:r>
         <w:rPr>
           <w:i w:val="0"/>
         </w:rPr>
-        <w:t xml:space="preserve"> blotch. </w:t>
+        <w:t xml:space="preserve"> Time management governs climate resilience and productivity in the coupled rice–wheat cropping systems of eastern India. </w:t>
       </w:r>
       <w:r>
         <w:rPr>
           <w:i/>
         </w:rPr>
-        <w:t>Field Crops Research</w:t>
+        <w:t>Nat. Food</w:t>
       </w:r>
       <w:r>
         <w:rPr>
           <w:i w:val="0"/>
         </w:rPr>
-        <w:t>180</w:t>
+        <w:t>3</w:t>
       </w:r>
       <w:r>
         <w:rPr>
           <w:i w:val="0"/>
         </w:rPr>
-        <w:t>, 176–185 (2015).</w:t>
+        <w:t>, 542–551 (2022).</w:t>
       </w:r>
     </w:p>
     <w:p>
@@ -1432,37 +1494,25 @@
         <w:rPr>
           <w:i w:val="0"/>
         </w:rPr>
-        <w:t xml:space="preserve">Bregaglio, S. </w:t>
+        <w:t xml:space="preserve">Bancal, M.-O., Robert, C. &amp; Ney, B. Modelling wheat growth and yield losses from late epidemics of foliar diseases using loss of green leaf area per layer and pre-anthesis reserves. </w:t>
       </w:r>
       <w:r>
         <w:rPr>
           <w:i/>
         </w:rPr>
-        <w:t>et al.</w:t>
+        <w:t>Annals of Botany</w:t>
       </w:r>
       <w:r>
         <w:rPr>
           <w:i w:val="0"/>
         </w:rPr>
-        <w:t xml:space="preserve"> Comparing process-based wheat growth models in their simulation of yield losses caused by plant diseases. </w:t>
-      </w:r>
-      <w:r>
-        <w:rPr>
-          <w:i/>
-        </w:rPr>
-        <w:t>Field Crops Research</w:t>
+        <w:t>100</w:t>
       </w:r>
       <w:r>
         <w:rPr>
           <w:i w:val="0"/>
         </w:rPr>
-        <w:t>265</w:t>
-      </w:r>
-      <w:r>
-        <w:rPr>
-          <w:i w:val="0"/>
-        </w:rPr>
-        <w:t>, 108108 (2021).</w:t>
+        <w:t>, 777–789 (2007).</w:t>
       </w:r>
     </w:p>
     <w:p>
@@ -1479,7 +1529,37 @@
         <w:rPr>
           <w:i w:val="0"/>
         </w:rPr>
-        <w:t>International Food Policy Research Institute. Global Spatially-Disaggregated Crop Production Statistics Data for 2020, SPAM2020 v2r2. Harvard Dataverse https://doi.org/10.7910/DVN/SWPENT (2026).</w:t>
+        <w:t xml:space="preserve">Bancal, P., Bancal, M.-O., Collin, F. &amp; Gouache, D. Identifying traits leading to tolerance of wheat to </w:t>
+      </w:r>
+      <w:r>
+        <w:rPr>
+          <w:i/>
+        </w:rPr>
+        <w:t>Septoria tritici</w:t>
+      </w:r>
+      <w:r>
+        <w:rPr>
+          <w:i w:val="0"/>
+        </w:rPr>
+        <w:t xml:space="preserve"> blotch. </w:t>
+      </w:r>
+      <w:r>
+        <w:rPr>
+          <w:i/>
+        </w:rPr>
+        <w:t>Field Crops Research</w:t>
+      </w:r>
+      <w:r>
+        <w:rPr>
+          <w:i w:val="0"/>
+        </w:rPr>
+        <w:t>180</w:t>
+      </w:r>
+      <w:r>
+        <w:rPr>
+          <w:i w:val="0"/>
+        </w:rPr>
+        <w:t>, 176–185 (2015).</w:t>
       </w:r>
     </w:p>
     <w:p>
@@ -1496,7 +1576,37 @@
         <w:rPr>
           <w:i w:val="0"/>
         </w:rPr>
-        <w:t>Jägermeyr, J., Müller, C., Minoli, S., Ray, D. &amp; Siebert, S. GGCMI Phase 3 crop calendar. Zenodo https://doi.org/10.5281/zenodo.5062513 (2021).</w:t>
+        <w:t xml:space="preserve">Bregaglio, S. </w:t>
+      </w:r>
+      <w:r>
+        <w:rPr>
+          <w:i/>
+        </w:rPr>
+        <w:t>et al.</w:t>
+      </w:r>
+      <w:r>
+        <w:rPr>
+          <w:i w:val="0"/>
+        </w:rPr>
+        <w:t xml:space="preserve"> Comparing process-based wheat growth models in their simulation of yield losses caused by plant diseases. </w:t>
+      </w:r>
+      <w:r>
+        <w:rPr>
+          <w:i/>
+        </w:rPr>
+        <w:t>Field Crops Research</w:t>
+      </w:r>
+      <w:r>
+        <w:rPr>
+          <w:i w:val="0"/>
+        </w:rPr>
+        <w:t>265</w:t>
+      </w:r>
+      <w:r>
+        <w:rPr>
+          <w:i w:val="0"/>
+        </w:rPr>
+        <w:t>, 108108 (2021).</w:t>
       </w:r>
     </w:p>
     <w:p>
@@ -1513,19 +1623,7 @@
         <w:rPr>
           <w:i w:val="0"/>
         </w:rPr>
-        <w:t xml:space="preserve">NASA Center for Climate Simulation. </w:t>
-      </w:r>
-      <w:r>
-        <w:rPr>
-          <w:i/>
-        </w:rPr>
-        <w:t>NEX-GDDP-CMIP6 Version 2 Technical Note</w:t>
-      </w:r>
-      <w:r>
-        <w:rPr>
-          <w:i w:val="0"/>
-        </w:rPr>
-        <w:t>. https://www.nccs.nasa.gov/wp-content/uploads/2025/06/NEX-GDDP-CMIP6-v2-Tech_Note.pdf (2025).</w:t>
+        <w:t>International Food Policy Research Institute. Global Spatially-Disaggregated Crop Production Statistics Data for 2020, SPAM2020 v2r2. Harvard Dataverse https://doi.org/10.7910/DVN/SWPENT (2026).</w:t>
       </w:r>
     </w:p>
     <w:p>
@@ -1542,7 +1640,7 @@
         <w:rPr>
           <w:i w:val="0"/>
         </w:rPr>
-        <w:t>European Environment Agency. Biogeographical regions, Europe 2016, version 1. (2016).</w:t>
+        <w:t>Jägermeyr, J., Müller, C., Minoli, S., Ray, D. &amp; Siebert, S. GGCMI Phase 3 crop calendar. Zenodo https://doi.org/10.5281/zenodo.5062513 (2021).</w:t>
       </w:r>
     </w:p>
     <w:p>
@@ -1559,7 +1657,19 @@
         <w:rPr>
           <w:i w:val="0"/>
         </w:rPr>
-        <w:t>Holst, N. Data from 56 fungicide trials in wheat fields across Europe 2017–2019. Zenodo https://doi.org/10.5281/zenodo.6521175 (2022).</w:t>
+        <w:t xml:space="preserve">NASA Center for Climate Simulation. </w:t>
+      </w:r>
+      <w:r>
+        <w:rPr>
+          <w:i/>
+        </w:rPr>
+        <w:t>NEX-GDDP-CMIP6 Version 2 Technical Note</w:t>
+      </w:r>
+      <w:r>
+        <w:rPr>
+          <w:i w:val="0"/>
+        </w:rPr>
+        <w:t>. https://www.nccs.nasa.gov/wp-content/uploads/2025/06/NEX-GDDP-CMIP6-v2-Tech_Note.pdf (2025).</w:t>
       </w:r>
     </w:p>
     <w:p>
@@ -1576,7 +1686,7 @@
         <w:rPr>
           <w:i w:val="0"/>
         </w:rPr>
-        <w:t>Holst, N. &amp; Donner, M. Data from 168 fungicide trials in wheat fields across Europe 2014–2018. Zenodo https://doi.org/10.5281/zenodo.6352615 (2022).</w:t>
+        <w:t>European Environment Agency. Biogeographical regions, Europe 2016, version 1. (2016).</w:t>
       </w:r>
     </w:p>
     <w:p>
@@ -1588,6 +1698,40 @@
           <w:i w:val="0"/>
         </w:rPr>
         <w:t>30.</w:t>
+      </w:r>
+      <w:r>
+        <w:rPr>
+          <w:i w:val="0"/>
+        </w:rPr>
+        <w:t>Holst, N. Data from 56 fungicide trials in wheat fields across Europe 2017–2019. Zenodo https://doi.org/10.5281/zenodo.6521175 (2022).</w:t>
+      </w:r>
+    </w:p>
+    <w:p>
+      <w:pPr>
+        <w:ind w:left="432" w:hanging="432"/>
+      </w:pPr>
+      <w:r>
+        <w:rPr>
+          <w:i w:val="0"/>
+        </w:rPr>
+        <w:t>31.</w:t>
+      </w:r>
+      <w:r>
+        <w:rPr>
+          <w:i w:val="0"/>
+        </w:rPr>
+        <w:t>Holst, N. &amp; Donner, M. Data from 168 fungicide trials in wheat fields across Europe 2014–2018. Zenodo https://doi.org/10.5281/zenodo.6352615 (2022).</w:t>
+      </w:r>
+    </w:p>
+    <w:p>
+      <w:pPr>
+        <w:ind w:left="432" w:hanging="432"/>
+      </w:pPr>
+      <w:r>
+        <w:rPr>
+          <w:i w:val="0"/>
+        </w:rPr>
+        <w:t>32.</w:t>
       </w:r>
       <w:r>
         <w:rPr>
@@ -2713,7 +2857,53 @@
     </w:p>
     <w:p>
       <w:r>
-        <w:t>Figure 4 | Production exposure changes the regional interpretation of disease impacts. (a) Production-weighted change in normalized HAD loss under SSP5–8.5 in 2071–2100 relative to 1991–2020. Points are equal three-climate-model means after production and valid-season weighting; whiskers span model estimates. (b) Fixed SPAM2020 production in the same environmental regions, partitioned by agreement in the sign of cell-level changes. Regions are ordered by baseline production. Mixed signs and zero responses are combined for display and retained separately in Source Data. (c) European baseline production in cells with positive changes in all three models or in their ensemble mean under each emissions pathway. The two criteria overlap and are shown as separate bars, not additive categories. All amounts are baseline production located in exposed cells, not estimated tonnes lost or future production. The fixed all-wheat baseline is represented by imposed winter-wheat rainfed calendars; missing responses remain explicit in the denominators. Eight named regions are displayed; European totals also include outside-region and unassigned cells.</w:t>
+        <w:t>Figure 4 | Production exposure and high-damage years. (a) Production-weighted change in normalized HAD loss under SSP5–8.5 in 2071–2100 relative to 1991–2020. Points are equal three-climate-model means after production and valid-season weighting; whiskers span model estimates. (b) Fixed SPAM2020 production in the same environmental regions, partitioned by agreement in the sign of cell-level changes. Regions are ordered by baseline production. Mixed signs and zero responses are combined for display and retained separately in Source Data. (c) Fraction of 2071–2100 years with European production-weighted canopy damage above each climate model’s historical 90th percentile. Both periods retain the same cells, complete in all 60 years and all three models. These cells represent 99.0–99.7% of baseline production across pathways. Points average three model-specific frequencies; whiskers span their range. Thirty years per model define empirical frequencies, not calibrated probabilities. Exposed tonnes and annual canopy damage do not measure grain lost or future production. The fixed all-wheat baseline is represented by imposed winter-wheat rainfed calendars; missing responses remain explicit in the denominators. Eight named regions are displayed; European totals also include outside-region and unassigned cells.</w:t>
+      </w:r>
+    </w:p>
+    <w:p>
+      <w:r>
+        <w:br w:type="page"/>
+      </w:r>
+    </w:p>
+    <w:p>
+      <w:r>
+        <w:drawing>
+          <wp:inline xmlns:a="http://schemas.openxmlformats.org/drawingml/2006/main" xmlns:pic="http://schemas.openxmlformats.org/drawingml/2006/picture">
+            <wp:extent cx="5715000" cy="2200314"/>
+            <wp:docPr id="5" name="Picture 5"/>
+            <wp:cNvGraphicFramePr>
+              <a:graphicFrameLocks noChangeAspect="1"/>
+            </wp:cNvGraphicFramePr>
+            <a:graphic>
+              <a:graphicData uri="http://schemas.openxmlformats.org/drawingml/2006/picture">
+                <pic:pic>
+                  <pic:nvPicPr>
+                    <pic:cNvPr id="0" name="fig5_observed_management_grain_responses.png"/>
+                    <pic:cNvPicPr/>
+                  </pic:nvPicPr>
+                  <pic:blipFill>
+                    <a:blip r:embed="rId14"/>
+                    <a:stretch>
+                      <a:fillRect/>
+                    </a:stretch>
+                  </pic:blipFill>
+                  <pic:spPr>
+                    <a:xfrm>
+                      <a:off x="0" y="0"/>
+                      <a:ext cx="5715000" cy="2200314"/>
+                    </a:xfrm>
+                    <a:prstGeom prst="rect"/>
+                  </pic:spPr>
+                </pic:pic>
+              </a:graphicData>
+            </a:graphic>
+          </wp:inline>
+        </w:drawing>
+      </w:r>
+    </w:p>
+    <w:p>
+      <w:r>
+        <w:t>Figure 5 | Observed management-associated grain responses. (a) Cumulative distribution of 307 treated-minus-untreated contrasts across 263 reported trial identifiers in five Nordic/Baltic countries, 2012–2016. Each trial has unit total weight, divided between contrasts sharing its control. The mean interval resamples 25 country–year groups. Yields use 15% grain moisture; disease-specific observations and plot replication are unavailable. (b) Raw mixture-minus-constituent differences for 195 complete comparisons in the randomized Mauguio durum-wheat experiment, 2018. The baseline averages both constituent pure stands. Source spatially adjusted estimates provide sensitivity on the same comparisons. Dried-grain moisture is unspecified; the two panels are separate populations and are not pooled. Mixtures occupy alternating rows and received fungicide after early disease assessment. Shared controls connect 189 French comparisons; no independent-environment confidence interval is available. These distributions describe observed management outcomes, not future failure probabilities, STB-mediated protection or validated climate-adaptation benefits.</w:t>
       </w:r>
     </w:p>
     <w:sectPr>

</xml_diff>